<commit_message>
Update demo links in rainbow.json to offline versions
</commit_message>
<xml_diff>
--- a/public/cv/Aliaksandr Kuzmiankou - 研发负责人+ 软件工程师+web前端.docx
+++ b/public/cv/Aliaksandr Kuzmiankou - 研发负责人+ 软件工程师+web前端.docx
@@ -3904,12 +3904,14 @@
                 <w:kern w:val="0"/>
               </w:rPr>
             </w:pPr>
+            <w:bookmarkStart w:id="1" w:name="_GoBack"/>
             <w:r>
               <w:rPr>
                 <w:kern w:val="0"/>
               </w:rPr>
               <w:t>陕西秦快互联科技有限公司</w:t>
             </w:r>
+            <w:bookmarkEnd w:id="1"/>
           </w:p>
         </w:tc>
         <w:tc>
@@ -5882,8 +5884,6 @@
               </w:rPr>
               <w:t>我的梦想是对人工神经网络和数据呈现技术的发展有贡献。</w:t>
             </w:r>
-            <w:bookmarkStart w:id="1" w:name="_GoBack"/>
-            <w:bookmarkEnd w:id="1"/>
           </w:p>
         </w:tc>
       </w:tr>

</xml_diff>

<commit_message>
feat(cv): update personal and project descriptions for clarity and consistency
</commit_message>
<xml_diff>
--- a/public/cv/Aliaksandr Kuzmiankou - 研发负责人+ 软件工程师+web前端.docx
+++ b/public/cv/Aliaksandr Kuzmiankou - 研发负责人+ 软件工程师+web前端.docx
@@ -1492,19 +1492,22 @@
               <w:widowControl w:val="0"/>
               <w:jc w:val="center"/>
               <w:rPr>
-                <w:rFonts w:ascii="SimSun" w:hAnsi="SimSun" w:cs="SimSun"/>
-                <w:b/>
-                <w:sz w:val="22"/>
-              </w:rPr>
-            </w:pPr>
-            <w:r>
-              <w:rPr>
-                <w:rFonts w:ascii="SimSun" w:hAnsi="SimSun" w:cs="SimSun"/>
-                <w:b/>
-                <w:kern w:val="0"/>
-                <w:sz w:val="22"/>
-              </w:rPr>
-              <w:t>家庭地址</w:t>
+                <w:rFonts w:hint="eastAsia" w:ascii="SimSun" w:hAnsi="SimSun" w:eastAsia="SimSun" w:cs="SimSun"/>
+                <w:b/>
+                <w:kern w:val="0"/>
+                <w:sz w:val="22"/>
+                <w:lang w:eastAsia="zh-CN"/>
+              </w:rPr>
+            </w:pPr>
+            <w:r>
+              <w:rPr>
+                <w:rFonts w:hint="eastAsia" w:ascii="SimSun" w:hAnsi="SimSun" w:cs="SimSun"/>
+                <w:b/>
+                <w:kern w:val="0"/>
+                <w:sz w:val="22"/>
+                <w:lang w:eastAsia="zh-CN"/>
+              </w:rPr>
+              <w:t>邮箱</w:t>
             </w:r>
           </w:p>
         </w:tc>
@@ -1524,18 +1527,22 @@
           <w:p>
             <w:pPr>
               <w:widowControl w:val="0"/>
-              <w:rPr>
-                <w:rFonts w:ascii="SimSun" w:hAnsi="SimSun" w:cs="SimSun"/>
-                <w:sz w:val="22"/>
-              </w:rPr>
-            </w:pPr>
-            <w:r>
-              <w:rPr>
-                <w:rFonts w:ascii="SimSun" w:hAnsi="SimSun" w:cs="SimSun"/>
-                <w:kern w:val="0"/>
-                <w:sz w:val="22"/>
-              </w:rPr>
-              <w:t>西安莲湖区环城西路南段8号</w:t>
+              <w:jc w:val="center"/>
+              <w:rPr>
+                <w:rFonts w:hint="default" w:ascii="SimSun" w:hAnsi="SimSun" w:cs="SimSun"/>
+                <w:kern w:val="0"/>
+                <w:sz w:val="22"/>
+                <w:lang w:val="en-US"/>
+              </w:rPr>
+            </w:pPr>
+            <w:r>
+              <w:rPr>
+                <w:rFonts w:hint="default" w:ascii="SimSun" w:hAnsi="SimSun" w:cs="SimSun"/>
+                <w:kern w:val="0"/>
+                <w:sz w:val="22"/>
+                <w:lang w:val="en-US"/>
+              </w:rPr>
+              <w:t>yuanshi78@foxmail.com</w:t>
             </w:r>
           </w:p>
         </w:tc>
@@ -1556,7 +1563,7 @@
         <w:tc>
           <w:tcPr>
             <w:tcW w:w="1560" w:type="dxa"/>
-            <w:vMerge w:val="restart"/>
+            <w:vMerge w:val="continue"/>
             <w:tcBorders>
               <w:top w:val="dashSmallGap" w:color="00000A" w:sz="4" w:space="0"/>
               <w:left w:val="single" w:color="00000A" w:sz="12" w:space="0"/>
@@ -1569,62 +1576,10 @@
           <w:p>
             <w:pPr>
               <w:widowControl w:val="0"/>
-              <w:jc w:val="center"/>
-              <w:rPr>
-                <w:rFonts w:ascii="SimSun" w:hAnsi="SimSun" w:cs="SimSun"/>
-                <w:b/>
-                <w:sz w:val="22"/>
-              </w:rPr>
-            </w:pPr>
-            <w:r>
-              <w:rPr>
-                <w:rFonts w:ascii="SimSun" w:hAnsi="SimSun" w:cs="SimSun"/>
-                <w:b/>
-                <w:kern w:val="0"/>
-                <w:sz w:val="22"/>
-              </w:rPr>
-              <w:t>教育</w:t>
-            </w:r>
-          </w:p>
-          <w:p>
-            <w:pPr>
-              <w:widowControl w:val="0"/>
-              <w:jc w:val="center"/>
-              <w:rPr>
-                <w:rFonts w:ascii="SimSun" w:hAnsi="SimSun" w:cs="SimSun"/>
-                <w:b/>
-                <w:sz w:val="22"/>
-              </w:rPr>
-            </w:pPr>
-            <w:r>
-              <w:rPr>
-                <w:rFonts w:ascii="SimSun" w:hAnsi="SimSun" w:cs="SimSun"/>
-                <w:b/>
-                <w:kern w:val="0"/>
-                <w:sz w:val="22"/>
-              </w:rPr>
-              <w:t>培训</w:t>
-            </w:r>
-          </w:p>
-          <w:p>
-            <w:pPr>
-              <w:widowControl w:val="0"/>
-              <w:jc w:val="center"/>
-              <w:rPr>
-                <w:rFonts w:ascii="SimSun" w:hAnsi="SimSun" w:cs="SimSun"/>
-                <w:b/>
-                <w:sz w:val="22"/>
-              </w:rPr>
-            </w:pPr>
-            <w:r>
-              <w:rPr>
-                <w:rFonts w:ascii="SimSun" w:hAnsi="SimSun" w:cs="SimSun"/>
-                <w:b/>
-                <w:kern w:val="0"/>
-                <w:sz w:val="22"/>
-              </w:rPr>
-              <w:t>经历</w:t>
-            </w:r>
+              <w:rPr>
+                <w:kern w:val="0"/>
+              </w:rPr>
+            </w:pPr>
           </w:p>
         </w:tc>
         <w:tc>
@@ -1657,142 +1612,39 @@
                 <w:kern w:val="0"/>
                 <w:sz w:val="22"/>
               </w:rPr>
-              <w:t>起止时间</w:t>
-            </w:r>
-          </w:p>
-        </w:tc>
-        <w:tc>
-          <w:tcPr>
-            <w:tcW w:w="2014" w:type="dxa"/>
-            <w:gridSpan w:val="4"/>
-            <w:tcBorders>
-              <w:top w:val="dashSmallGap" w:color="00000A" w:sz="4" w:space="0"/>
-              <w:left w:val="dashSmallGap" w:color="00000A" w:sz="4" w:space="0"/>
-              <w:bottom w:val="dashSmallGap" w:color="00000A" w:sz="4" w:space="0"/>
-              <w:right w:val="dashSmallGap" w:color="00000A" w:sz="4" w:space="0"/>
-            </w:tcBorders>
-            <w:shd w:val="clear" w:color="auto" w:fill="F2F2F2"/>
-            <w:vAlign w:val="center"/>
-          </w:tcPr>
-          <w:p>
-            <w:pPr>
-              <w:widowControl w:val="0"/>
-              <w:jc w:val="center"/>
-              <w:rPr>
-                <w:rFonts w:ascii="SimSun" w:hAnsi="SimSun" w:cs="SimSun"/>
-                <w:b/>
-                <w:sz w:val="22"/>
-              </w:rPr>
-            </w:pPr>
-            <w:r>
-              <w:rPr>
-                <w:rFonts w:ascii="SimSun" w:hAnsi="SimSun" w:cs="SimSun"/>
-                <w:b/>
-                <w:kern w:val="0"/>
-                <w:sz w:val="22"/>
-              </w:rPr>
-              <w:t>学校/培训机构</w:t>
-            </w:r>
-          </w:p>
-        </w:tc>
-        <w:tc>
-          <w:tcPr>
-            <w:tcW w:w="2171" w:type="dxa"/>
-            <w:gridSpan w:val="5"/>
-            <w:tcBorders>
-              <w:top w:val="dashSmallGap" w:color="00000A" w:sz="4" w:space="0"/>
-              <w:left w:val="dashSmallGap" w:color="00000A" w:sz="4" w:space="0"/>
-              <w:bottom w:val="dashSmallGap" w:color="00000A" w:sz="4" w:space="0"/>
-              <w:right w:val="dashSmallGap" w:color="00000A" w:sz="4" w:space="0"/>
-            </w:tcBorders>
-            <w:shd w:val="clear" w:color="auto" w:fill="F2F2F2"/>
-            <w:vAlign w:val="center"/>
-          </w:tcPr>
-          <w:p>
-            <w:pPr>
-              <w:widowControl w:val="0"/>
-              <w:jc w:val="center"/>
-              <w:rPr>
-                <w:rFonts w:ascii="SimSun" w:hAnsi="SimSun" w:cs="SimSun"/>
-                <w:b/>
-                <w:sz w:val="22"/>
-              </w:rPr>
-            </w:pPr>
-            <w:r>
-              <w:rPr>
-                <w:rFonts w:ascii="SimSun" w:hAnsi="SimSun" w:cs="SimSun"/>
-                <w:b/>
-                <w:kern w:val="0"/>
-                <w:sz w:val="22"/>
-              </w:rPr>
-              <w:t>专业/培训内容</w:t>
-            </w:r>
-          </w:p>
-        </w:tc>
-        <w:tc>
-          <w:tcPr>
-            <w:tcW w:w="1062" w:type="dxa"/>
-            <w:tcBorders>
-              <w:top w:val="dashSmallGap" w:color="00000A" w:sz="4" w:space="0"/>
-              <w:left w:val="dashSmallGap" w:color="00000A" w:sz="4" w:space="0"/>
-              <w:bottom w:val="dashSmallGap" w:color="00000A" w:sz="4" w:space="0"/>
-              <w:right w:val="dashSmallGap" w:color="00000A" w:sz="4" w:space="0"/>
-            </w:tcBorders>
-            <w:shd w:val="clear" w:color="auto" w:fill="F2F2F2"/>
-            <w:vAlign w:val="center"/>
-          </w:tcPr>
-          <w:p>
-            <w:pPr>
-              <w:widowControl w:val="0"/>
-              <w:jc w:val="center"/>
-              <w:rPr>
-                <w:rFonts w:ascii="SimSun" w:hAnsi="SimSun" w:cs="SimSun"/>
-                <w:b/>
-                <w:sz w:val="22"/>
-              </w:rPr>
-            </w:pPr>
-            <w:r>
-              <w:rPr>
-                <w:rFonts w:ascii="SimSun" w:hAnsi="SimSun" w:cs="SimSun"/>
-                <w:b/>
-                <w:kern w:val="0"/>
-                <w:sz w:val="22"/>
-              </w:rPr>
-              <w:t>学历</w:t>
-            </w:r>
-          </w:p>
-        </w:tc>
-        <w:tc>
-          <w:tcPr>
-            <w:tcW w:w="2105" w:type="dxa"/>
-            <w:gridSpan w:val="3"/>
+              <w:t>家庭地址</w:t>
+            </w:r>
+          </w:p>
+        </w:tc>
+        <w:tc>
+          <w:tcPr>
+            <w:tcW w:w="7352" w:type="dxa"/>
+            <w:gridSpan w:val="13"/>
             <w:tcBorders>
               <w:top w:val="dashSmallGap" w:color="00000A" w:sz="4" w:space="0"/>
               <w:left w:val="dashSmallGap" w:color="00000A" w:sz="4" w:space="0"/>
               <w:bottom w:val="dashSmallGap" w:color="00000A" w:sz="4" w:space="0"/>
               <w:right w:val="single" w:color="00000A" w:sz="12" w:space="0"/>
             </w:tcBorders>
-            <w:shd w:val="clear" w:color="auto" w:fill="F2F2F2"/>
-            <w:vAlign w:val="center"/>
-          </w:tcPr>
-          <w:p>
-            <w:pPr>
-              <w:widowControl w:val="0"/>
-              <w:jc w:val="center"/>
-              <w:rPr>
-                <w:rFonts w:ascii="SimSun" w:hAnsi="SimSun" w:cs="SimSun"/>
-                <w:b/>
-                <w:sz w:val="22"/>
-              </w:rPr>
-            </w:pPr>
-            <w:r>
-              <w:rPr>
-                <w:rFonts w:ascii="SimSun" w:hAnsi="SimSun" w:cs="SimSun"/>
-                <w:b/>
-                <w:kern w:val="0"/>
-                <w:sz w:val="22"/>
-              </w:rPr>
-              <w:t>证明书</w:t>
+            <w:shd w:val="clear" w:color="auto" w:fill="auto"/>
+            <w:vAlign w:val="center"/>
+          </w:tcPr>
+          <w:p>
+            <w:pPr>
+              <w:widowControl w:val="0"/>
+              <w:jc w:val="center"/>
+              <w:rPr>
+                <w:rFonts w:ascii="SimSun" w:hAnsi="SimSun" w:cs="SimSun"/>
+                <w:sz w:val="22"/>
+              </w:rPr>
+            </w:pPr>
+            <w:r>
+              <w:rPr>
+                <w:rFonts w:ascii="SimSun" w:hAnsi="SimSun" w:cs="SimSun"/>
+                <w:kern w:val="0"/>
+                <w:sz w:val="22"/>
+              </w:rPr>
+              <w:t>西安莲湖区环城西路南段8号</w:t>
             </w:r>
           </w:p>
         </w:tc>
@@ -1813,7 +1665,7 @@
         <w:tc>
           <w:tcPr>
             <w:tcW w:w="1560" w:type="dxa"/>
-            <w:vMerge w:val="continue"/>
+            <w:vMerge w:val="restart"/>
             <w:tcBorders>
               <w:top w:val="dashSmallGap" w:color="00000A" w:sz="4" w:space="0"/>
               <w:left w:val="single" w:color="00000A" w:sz="12" w:space="0"/>
@@ -1826,10 +1678,62 @@
           <w:p>
             <w:pPr>
               <w:widowControl w:val="0"/>
-              <w:rPr>
-                <w:kern w:val="0"/>
-              </w:rPr>
-            </w:pPr>
+              <w:jc w:val="center"/>
+              <w:rPr>
+                <w:rFonts w:ascii="SimSun" w:hAnsi="SimSun" w:cs="SimSun"/>
+                <w:b/>
+                <w:sz w:val="22"/>
+              </w:rPr>
+            </w:pPr>
+            <w:r>
+              <w:rPr>
+                <w:rFonts w:ascii="SimSun" w:hAnsi="SimSun" w:cs="SimSun"/>
+                <w:b/>
+                <w:kern w:val="0"/>
+                <w:sz w:val="22"/>
+              </w:rPr>
+              <w:t>教育</w:t>
+            </w:r>
+          </w:p>
+          <w:p>
+            <w:pPr>
+              <w:widowControl w:val="0"/>
+              <w:jc w:val="center"/>
+              <w:rPr>
+                <w:rFonts w:ascii="SimSun" w:hAnsi="SimSun" w:cs="SimSun"/>
+                <w:b/>
+                <w:sz w:val="22"/>
+              </w:rPr>
+            </w:pPr>
+            <w:r>
+              <w:rPr>
+                <w:rFonts w:ascii="SimSun" w:hAnsi="SimSun" w:cs="SimSun"/>
+                <w:b/>
+                <w:kern w:val="0"/>
+                <w:sz w:val="22"/>
+              </w:rPr>
+              <w:t>培训</w:t>
+            </w:r>
+          </w:p>
+          <w:p>
+            <w:pPr>
+              <w:widowControl w:val="0"/>
+              <w:jc w:val="center"/>
+              <w:rPr>
+                <w:rFonts w:ascii="SimSun" w:hAnsi="SimSun" w:cs="SimSun"/>
+                <w:b/>
+                <w:sz w:val="22"/>
+              </w:rPr>
+            </w:pPr>
+            <w:r>
+              <w:rPr>
+                <w:rFonts w:ascii="SimSun" w:hAnsi="SimSun" w:cs="SimSun"/>
+                <w:b/>
+                <w:kern w:val="0"/>
+                <w:sz w:val="22"/>
+              </w:rPr>
+              <w:t>经历</w:t>
+            </w:r>
           </w:p>
         </w:tc>
         <w:tc>
@@ -1842,39 +1746,27 @@
               <w:bottom w:val="dashSmallGap" w:color="00000A" w:sz="4" w:space="0"/>
               <w:right w:val="dashSmallGap" w:color="00000A" w:sz="4" w:space="0"/>
             </w:tcBorders>
-            <w:shd w:val="clear" w:color="auto" w:fill="auto"/>
-            <w:vAlign w:val="center"/>
-          </w:tcPr>
-          <w:p>
-            <w:pPr>
-              <w:widowControl w:val="0"/>
-              <w:rPr>
-                <w:kern w:val="0"/>
-              </w:rPr>
-            </w:pPr>
-            <w:r>
-              <w:rPr>
-                <w:rFonts w:ascii="SimSun" w:hAnsi="SimSun" w:cs="SimSun"/>
-                <w:kern w:val="0"/>
-                <w:sz w:val="22"/>
-              </w:rPr>
-              <w:t>1997</w:t>
-            </w:r>
-            <w:r>
-              <w:rPr>
-                <w:rFonts w:cs="SimSun"/>
-                <w:kern w:val="0"/>
-                <w:sz w:val="22"/>
-              </w:rPr>
-              <w:t>/</w:t>
-            </w:r>
-            <w:r>
-              <w:rPr>
-                <w:rFonts w:ascii="SimSun" w:hAnsi="SimSun" w:cs="SimSun"/>
-                <w:kern w:val="0"/>
-                <w:sz w:val="22"/>
-              </w:rPr>
-              <w:t>9—2002/6</w:t>
+            <w:shd w:val="clear" w:color="auto" w:fill="F2F2F2"/>
+            <w:vAlign w:val="center"/>
+          </w:tcPr>
+          <w:p>
+            <w:pPr>
+              <w:widowControl w:val="0"/>
+              <w:jc w:val="center"/>
+              <w:rPr>
+                <w:rFonts w:ascii="SimSun" w:hAnsi="SimSun" w:cs="SimSun"/>
+                <w:b/>
+                <w:sz w:val="22"/>
+              </w:rPr>
+            </w:pPr>
+            <w:r>
+              <w:rPr>
+                <w:rFonts w:ascii="SimSun" w:hAnsi="SimSun" w:cs="SimSun"/>
+                <w:b/>
+                <w:kern w:val="0"/>
+                <w:sz w:val="22"/>
+              </w:rPr>
+              <w:t>起止时间</w:t>
             </w:r>
           </w:p>
         </w:tc>
@@ -1888,25 +1780,27 @@
               <w:bottom w:val="dashSmallGap" w:color="00000A" w:sz="4" w:space="0"/>
               <w:right w:val="dashSmallGap" w:color="00000A" w:sz="4" w:space="0"/>
             </w:tcBorders>
-            <w:shd w:val="clear" w:color="auto" w:fill="auto"/>
-            <w:vAlign w:val="center"/>
-          </w:tcPr>
-          <w:p>
-            <w:pPr>
-              <w:widowControl w:val="0"/>
-              <w:jc w:val="left"/>
-              <w:rPr>
-                <w:rFonts w:ascii="SimSun" w:hAnsi="SimSun" w:cs="SimSun"/>
-                <w:sz w:val="22"/>
-              </w:rPr>
-            </w:pPr>
-            <w:r>
-              <w:rPr>
-                <w:rFonts w:ascii="SimSun" w:hAnsi="SimSun" w:cs="SimSun"/>
-                <w:kern w:val="0"/>
-                <w:sz w:val="22"/>
-              </w:rPr>
-              <w:t>白俄罗斯国立信息和无线电电子大学</w:t>
+            <w:shd w:val="clear" w:color="auto" w:fill="F2F2F2"/>
+            <w:vAlign w:val="center"/>
+          </w:tcPr>
+          <w:p>
+            <w:pPr>
+              <w:widowControl w:val="0"/>
+              <w:jc w:val="center"/>
+              <w:rPr>
+                <w:rFonts w:ascii="SimSun" w:hAnsi="SimSun" w:cs="SimSun"/>
+                <w:b/>
+                <w:sz w:val="22"/>
+              </w:rPr>
+            </w:pPr>
+            <w:r>
+              <w:rPr>
+                <w:rFonts w:ascii="SimSun" w:hAnsi="SimSun" w:cs="SimSun"/>
+                <w:b/>
+                <w:kern w:val="0"/>
+                <w:sz w:val="22"/>
+              </w:rPr>
+              <w:t>学校/培训机构</w:t>
             </w:r>
           </w:p>
         </w:tc>
@@ -1920,25 +1814,27 @@
               <w:bottom w:val="dashSmallGap" w:color="00000A" w:sz="4" w:space="0"/>
               <w:right w:val="dashSmallGap" w:color="00000A" w:sz="4" w:space="0"/>
             </w:tcBorders>
-            <w:shd w:val="clear" w:color="auto" w:fill="auto"/>
-            <w:vAlign w:val="center"/>
-          </w:tcPr>
-          <w:p>
-            <w:pPr>
-              <w:widowControl w:val="0"/>
-              <w:jc w:val="center"/>
-              <w:rPr>
-                <w:rFonts w:ascii="SimSun" w:hAnsi="SimSun" w:cs="SimSun"/>
-                <w:sz w:val="22"/>
-              </w:rPr>
-            </w:pPr>
-            <w:r>
-              <w:rPr>
-                <w:rFonts w:ascii="SimSun" w:hAnsi="SimSun" w:cs="SimSun"/>
-                <w:kern w:val="0"/>
-                <w:sz w:val="22"/>
-              </w:rPr>
-              <w:t>软件工程</w:t>
+            <w:shd w:val="clear" w:color="auto" w:fill="F2F2F2"/>
+            <w:vAlign w:val="center"/>
+          </w:tcPr>
+          <w:p>
+            <w:pPr>
+              <w:widowControl w:val="0"/>
+              <w:jc w:val="center"/>
+              <w:rPr>
+                <w:rFonts w:ascii="SimSun" w:hAnsi="SimSun" w:cs="SimSun"/>
+                <w:b/>
+                <w:sz w:val="22"/>
+              </w:rPr>
+            </w:pPr>
+            <w:r>
+              <w:rPr>
+                <w:rFonts w:ascii="SimSun" w:hAnsi="SimSun" w:cs="SimSun"/>
+                <w:b/>
+                <w:kern w:val="0"/>
+                <w:sz w:val="22"/>
+              </w:rPr>
+              <w:t>专业/培训内容</w:t>
             </w:r>
           </w:p>
         </w:tc>
@@ -1951,25 +1847,27 @@
               <w:bottom w:val="dashSmallGap" w:color="00000A" w:sz="4" w:space="0"/>
               <w:right w:val="dashSmallGap" w:color="00000A" w:sz="4" w:space="0"/>
             </w:tcBorders>
-            <w:shd w:val="clear" w:color="auto" w:fill="auto"/>
-            <w:vAlign w:val="center"/>
-          </w:tcPr>
-          <w:p>
-            <w:pPr>
-              <w:widowControl w:val="0"/>
-              <w:jc w:val="center"/>
-              <w:rPr>
-                <w:rFonts w:ascii="SimSun" w:hAnsi="SimSun" w:cs="SimSun"/>
-                <w:sz w:val="22"/>
-              </w:rPr>
-            </w:pPr>
-            <w:r>
-              <w:rPr>
-                <w:rFonts w:ascii="SimSun" w:hAnsi="SimSun" w:cs="SimSun"/>
-                <w:kern w:val="0"/>
-                <w:sz w:val="22"/>
-              </w:rPr>
-              <w:t>本科</w:t>
+            <w:shd w:val="clear" w:color="auto" w:fill="F2F2F2"/>
+            <w:vAlign w:val="center"/>
+          </w:tcPr>
+          <w:p>
+            <w:pPr>
+              <w:widowControl w:val="0"/>
+              <w:jc w:val="center"/>
+              <w:rPr>
+                <w:rFonts w:ascii="SimSun" w:hAnsi="SimSun" w:cs="SimSun"/>
+                <w:b/>
+                <w:sz w:val="22"/>
+              </w:rPr>
+            </w:pPr>
+            <w:r>
+              <w:rPr>
+                <w:rFonts w:ascii="SimSun" w:hAnsi="SimSun" w:cs="SimSun"/>
+                <w:b/>
+                <w:kern w:val="0"/>
+                <w:sz w:val="22"/>
+              </w:rPr>
+              <w:t>学历</w:t>
             </w:r>
           </w:p>
         </w:tc>
@@ -1983,25 +1881,27 @@
               <w:bottom w:val="dashSmallGap" w:color="00000A" w:sz="4" w:space="0"/>
               <w:right w:val="single" w:color="00000A" w:sz="12" w:space="0"/>
             </w:tcBorders>
-            <w:shd w:val="clear" w:color="auto" w:fill="auto"/>
-            <w:vAlign w:val="center"/>
-          </w:tcPr>
-          <w:p>
-            <w:pPr>
-              <w:widowControl w:val="0"/>
-              <w:jc w:val="center"/>
-              <w:rPr>
-                <w:rFonts w:ascii="SimSun" w:hAnsi="SimSun" w:cs="SimSun"/>
-                <w:sz w:val="22"/>
-              </w:rPr>
-            </w:pPr>
-            <w:r>
-              <w:rPr>
-                <w:rFonts w:ascii="SimSun" w:hAnsi="SimSun" w:cs="SimSun"/>
-                <w:kern w:val="0"/>
-                <w:sz w:val="22"/>
-              </w:rPr>
-              <w:t>毕业证书</w:t>
+            <w:shd w:val="clear" w:color="auto" w:fill="F2F2F2"/>
+            <w:vAlign w:val="center"/>
+          </w:tcPr>
+          <w:p>
+            <w:pPr>
+              <w:widowControl w:val="0"/>
+              <w:jc w:val="center"/>
+              <w:rPr>
+                <w:rFonts w:ascii="SimSun" w:hAnsi="SimSun" w:cs="SimSun"/>
+                <w:b/>
+                <w:sz w:val="22"/>
+              </w:rPr>
+            </w:pPr>
+            <w:r>
+              <w:rPr>
+                <w:rFonts w:ascii="SimSun" w:hAnsi="SimSun" w:cs="SimSun"/>
+                <w:b/>
+                <w:kern w:val="0"/>
+                <w:sz w:val="22"/>
+              </w:rPr>
+              <w:t>证明书</w:t>
             </w:r>
           </w:p>
         </w:tc>
@@ -2057,18 +1957,59 @@
           <w:p>
             <w:pPr>
               <w:widowControl w:val="0"/>
-              <w:jc w:val="left"/>
-              <w:rPr>
-                <w:kern w:val="0"/>
-              </w:rPr>
-            </w:pPr>
-            <w:r>
-              <w:rPr>
-                <w:rFonts w:ascii="SimSun" w:hAnsi="SimSun" w:cs="SimSun"/>
-                <w:kern w:val="0"/>
-                <w:sz w:val="22"/>
-              </w:rPr>
-              <w:t>2002/9—2005/5</w:t>
+              <w:rPr>
+                <w:kern w:val="0"/>
+              </w:rPr>
+            </w:pPr>
+            <w:r>
+              <w:rPr>
+                <w:rFonts w:ascii="SimSun" w:hAnsi="SimSun" w:cs="SimSun"/>
+                <w:kern w:val="0"/>
+                <w:sz w:val="22"/>
+              </w:rPr>
+              <w:t>1997</w:t>
+            </w:r>
+            <w:r>
+              <w:rPr>
+                <w:rFonts w:cs="SimSun"/>
+                <w:kern w:val="0"/>
+                <w:sz w:val="22"/>
+              </w:rPr>
+              <w:t>/</w:t>
+            </w:r>
+            <w:r>
+              <w:rPr>
+                <w:rFonts w:hint="eastAsia" w:cs="SimSun"/>
+                <w:kern w:val="0"/>
+                <w:sz w:val="22"/>
+                <w:lang w:val="en-US" w:eastAsia="zh-CN"/>
+              </w:rPr>
+              <w:t>0</w:t>
+            </w:r>
+            <w:r>
+              <w:rPr>
+                <w:rFonts w:ascii="SimSun" w:hAnsi="SimSun" w:cs="SimSun"/>
+                <w:kern w:val="0"/>
+                <w:sz w:val="22"/>
+              </w:rPr>
+              <w:t>9—2002/</w:t>
+            </w:r>
+            <w:r>
+              <w:rPr>
+                <w:rFonts w:hint="eastAsia" w:ascii="SimSun" w:hAnsi="SimSun" w:cs="SimSun"/>
+                <w:kern w:val="0"/>
+                <w:sz w:val="22"/>
+                <w:lang w:val="en-US" w:eastAsia="zh-CN"/>
+              </w:rPr>
+              <w:t>0</w:t>
+            </w:r>
+            <w:r>
+              <w:rPr>
+                <w:rFonts w:ascii="SimSun" w:hAnsi="SimSun" w:cs="SimSun"/>
+                <w:kern w:val="0"/>
+                <w:sz w:val="22"/>
+              </w:rPr>
+              <w:t>6</w:t>
             </w:r>
           </w:p>
         </w:tc>
@@ -2088,19 +2029,19 @@
           <w:p>
             <w:pPr>
               <w:widowControl w:val="0"/>
-              <w:jc w:val="center"/>
-              <w:rPr>
-                <w:rFonts w:ascii="Liberation Sans" w:hAnsi="Liberation Sans" w:cs="Liberation Sans"/>
-                <w:sz w:val="22"/>
-              </w:rPr>
-            </w:pPr>
-            <w:r>
-              <w:rPr>
-                <w:rFonts w:ascii="Liberation Sans" w:hAnsi="Liberation Sans" w:cs="Liberation Sans"/>
-                <w:kern w:val="0"/>
-                <w:sz w:val="22"/>
-              </w:rPr>
-              <w:t>International House</w:t>
+              <w:jc w:val="left"/>
+              <w:rPr>
+                <w:rFonts w:ascii="SimSun" w:hAnsi="SimSun" w:cs="SimSun"/>
+                <w:sz w:val="22"/>
+              </w:rPr>
+            </w:pPr>
+            <w:r>
+              <w:rPr>
+                <w:rFonts w:ascii="SimSun" w:hAnsi="SimSun" w:cs="SimSun"/>
+                <w:kern w:val="0"/>
+                <w:sz w:val="22"/>
+              </w:rPr>
+              <w:t>白俄罗斯国立信息和无线电电子大学</w:t>
             </w:r>
           </w:p>
         </w:tc>
@@ -2120,19 +2061,19 @@
           <w:p>
             <w:pPr>
               <w:widowControl w:val="0"/>
-              <w:jc w:val="left"/>
-              <w:rPr>
-                <w:rFonts w:ascii="SimSun" w:hAnsi="SimSun" w:cs="SimSun"/>
-                <w:sz w:val="22"/>
-              </w:rPr>
-            </w:pPr>
-            <w:r>
-              <w:rPr>
-                <w:rFonts w:ascii="SimSun" w:hAnsi="SimSun" w:cs="SimSun"/>
-                <w:kern w:val="0"/>
-                <w:sz w:val="22"/>
-              </w:rPr>
-              <w:t>英语课程(中级，中高级，高级)</w:t>
+              <w:jc w:val="center"/>
+              <w:rPr>
+                <w:rFonts w:ascii="SimSun" w:hAnsi="SimSun" w:cs="SimSun"/>
+                <w:sz w:val="22"/>
+              </w:rPr>
+            </w:pPr>
+            <w:r>
+              <w:rPr>
+                <w:rFonts w:ascii="SimSun" w:hAnsi="SimSun" w:cs="SimSun"/>
+                <w:kern w:val="0"/>
+                <w:sz w:val="22"/>
+              </w:rPr>
+              <w:t>软件工程</w:t>
             </w:r>
           </w:p>
         </w:tc>
@@ -2163,7 +2104,7 @@
                 <w:kern w:val="0"/>
                 <w:sz w:val="22"/>
               </w:rPr>
-              <w:t>///</w:t>
+              <w:t>本科</w:t>
             </w:r>
           </w:p>
         </w:tc>
@@ -2195,7 +2136,7 @@
                 <w:kern w:val="0"/>
                 <w:sz w:val="22"/>
               </w:rPr>
-              <w:t>证明书</w:t>
+              <w:t>毕业证书</w:t>
             </w:r>
           </w:p>
         </w:tc>
@@ -2216,6 +2157,7 @@
         <w:tc>
           <w:tcPr>
             <w:tcW w:w="1560" w:type="dxa"/>
+            <w:vMerge w:val="continue"/>
             <w:tcBorders>
               <w:top w:val="dashSmallGap" w:color="00000A" w:sz="4" w:space="0"/>
               <w:left w:val="single" w:color="00000A" w:sz="12" w:space="0"/>
@@ -2228,28 +2170,176 @@
           <w:p>
             <w:pPr>
               <w:widowControl w:val="0"/>
-              <w:jc w:val="center"/>
-              <w:rPr>
-                <w:rFonts w:ascii="SimSun" w:hAnsi="SimSun" w:cs="SimSun"/>
-                <w:b/>
-                <w:sz w:val="22"/>
-              </w:rPr>
-            </w:pPr>
-            <w:r>
-              <w:rPr>
-                <w:rFonts w:ascii="SimSun" w:hAnsi="SimSun" w:cs="SimSun"/>
-                <w:b/>
-                <w:kern w:val="0"/>
-                <w:sz w:val="22"/>
-              </w:rPr>
-              <w:t>专业技能</w:t>
-            </w:r>
-          </w:p>
-        </w:tc>
-        <w:tc>
-          <w:tcPr>
-            <w:tcW w:w="8878" w:type="dxa"/>
-            <w:gridSpan w:val="15"/>
+              <w:rPr>
+                <w:kern w:val="0"/>
+              </w:rPr>
+            </w:pPr>
+          </w:p>
+        </w:tc>
+        <w:tc>
+          <w:tcPr>
+            <w:tcW w:w="1526" w:type="dxa"/>
+            <w:gridSpan w:val="2"/>
+            <w:tcBorders>
+              <w:top w:val="dashSmallGap" w:color="00000A" w:sz="4" w:space="0"/>
+              <w:left w:val="dashSmallGap" w:color="00000A" w:sz="4" w:space="0"/>
+              <w:bottom w:val="dashSmallGap" w:color="00000A" w:sz="4" w:space="0"/>
+              <w:right w:val="dashSmallGap" w:color="00000A" w:sz="4" w:space="0"/>
+            </w:tcBorders>
+            <w:shd w:val="clear" w:color="auto" w:fill="auto"/>
+            <w:vAlign w:val="center"/>
+          </w:tcPr>
+          <w:p>
+            <w:pPr>
+              <w:widowControl w:val="0"/>
+              <w:jc w:val="left"/>
+              <w:rPr>
+                <w:kern w:val="0"/>
+              </w:rPr>
+            </w:pPr>
+            <w:r>
+              <w:rPr>
+                <w:rFonts w:ascii="SimSun" w:hAnsi="SimSun" w:cs="SimSun"/>
+                <w:kern w:val="0"/>
+                <w:sz w:val="22"/>
+              </w:rPr>
+              <w:t>2002/</w:t>
+            </w:r>
+            <w:r>
+              <w:rPr>
+                <w:rFonts w:hint="eastAsia" w:ascii="SimSun" w:hAnsi="SimSun" w:cs="SimSun"/>
+                <w:kern w:val="0"/>
+                <w:sz w:val="22"/>
+                <w:lang w:val="en-US" w:eastAsia="zh-CN"/>
+              </w:rPr>
+              <w:t>0</w:t>
+            </w:r>
+            <w:r>
+              <w:rPr>
+                <w:rFonts w:ascii="SimSun" w:hAnsi="SimSun" w:cs="SimSun"/>
+                <w:kern w:val="0"/>
+                <w:sz w:val="22"/>
+              </w:rPr>
+              <w:t>9—2005/</w:t>
+            </w:r>
+            <w:r>
+              <w:rPr>
+                <w:rFonts w:hint="eastAsia" w:ascii="SimSun" w:hAnsi="SimSun" w:cs="SimSun"/>
+                <w:kern w:val="0"/>
+                <w:sz w:val="22"/>
+                <w:lang w:val="en-US" w:eastAsia="zh-CN"/>
+              </w:rPr>
+              <w:t>0</w:t>
+            </w:r>
+            <w:r>
+              <w:rPr>
+                <w:rFonts w:ascii="SimSun" w:hAnsi="SimSun" w:cs="SimSun"/>
+                <w:kern w:val="0"/>
+                <w:sz w:val="22"/>
+              </w:rPr>
+              <w:t>5</w:t>
+            </w:r>
+          </w:p>
+        </w:tc>
+        <w:tc>
+          <w:tcPr>
+            <w:tcW w:w="2014" w:type="dxa"/>
+            <w:gridSpan w:val="4"/>
+            <w:tcBorders>
+              <w:top w:val="dashSmallGap" w:color="00000A" w:sz="4" w:space="0"/>
+              <w:left w:val="dashSmallGap" w:color="00000A" w:sz="4" w:space="0"/>
+              <w:bottom w:val="dashSmallGap" w:color="00000A" w:sz="4" w:space="0"/>
+              <w:right w:val="dashSmallGap" w:color="00000A" w:sz="4" w:space="0"/>
+            </w:tcBorders>
+            <w:shd w:val="clear" w:color="auto" w:fill="auto"/>
+            <w:vAlign w:val="center"/>
+          </w:tcPr>
+          <w:p>
+            <w:pPr>
+              <w:widowControl w:val="0"/>
+              <w:jc w:val="center"/>
+              <w:rPr>
+                <w:rFonts w:ascii="Liberation Sans" w:hAnsi="Liberation Sans" w:cs="Liberation Sans"/>
+                <w:sz w:val="22"/>
+              </w:rPr>
+            </w:pPr>
+            <w:r>
+              <w:rPr>
+                <w:rFonts w:ascii="Liberation Sans" w:hAnsi="Liberation Sans" w:cs="Liberation Sans"/>
+                <w:kern w:val="0"/>
+                <w:sz w:val="22"/>
+              </w:rPr>
+              <w:t>International House</w:t>
+            </w:r>
+          </w:p>
+        </w:tc>
+        <w:tc>
+          <w:tcPr>
+            <w:tcW w:w="2171" w:type="dxa"/>
+            <w:gridSpan w:val="5"/>
+            <w:tcBorders>
+              <w:top w:val="dashSmallGap" w:color="00000A" w:sz="4" w:space="0"/>
+              <w:left w:val="dashSmallGap" w:color="00000A" w:sz="4" w:space="0"/>
+              <w:bottom w:val="dashSmallGap" w:color="00000A" w:sz="4" w:space="0"/>
+              <w:right w:val="dashSmallGap" w:color="00000A" w:sz="4" w:space="0"/>
+            </w:tcBorders>
+            <w:shd w:val="clear" w:color="auto" w:fill="auto"/>
+            <w:vAlign w:val="center"/>
+          </w:tcPr>
+          <w:p>
+            <w:pPr>
+              <w:widowControl w:val="0"/>
+              <w:jc w:val="left"/>
+              <w:rPr>
+                <w:rFonts w:ascii="SimSun" w:hAnsi="SimSun" w:cs="SimSun"/>
+                <w:sz w:val="22"/>
+              </w:rPr>
+            </w:pPr>
+            <w:r>
+              <w:rPr>
+                <w:rFonts w:ascii="SimSun" w:hAnsi="SimSun" w:cs="SimSun"/>
+                <w:kern w:val="0"/>
+                <w:sz w:val="22"/>
+              </w:rPr>
+              <w:t>英语课程(中级，中高级，高级)</w:t>
+            </w:r>
+          </w:p>
+        </w:tc>
+        <w:tc>
+          <w:tcPr>
+            <w:tcW w:w="1062" w:type="dxa"/>
+            <w:tcBorders>
+              <w:top w:val="dashSmallGap" w:color="00000A" w:sz="4" w:space="0"/>
+              <w:left w:val="dashSmallGap" w:color="00000A" w:sz="4" w:space="0"/>
+              <w:bottom w:val="dashSmallGap" w:color="00000A" w:sz="4" w:space="0"/>
+              <w:right w:val="dashSmallGap" w:color="00000A" w:sz="4" w:space="0"/>
+            </w:tcBorders>
+            <w:shd w:val="clear" w:color="auto" w:fill="auto"/>
+            <w:vAlign w:val="center"/>
+          </w:tcPr>
+          <w:p>
+            <w:pPr>
+              <w:widowControl w:val="0"/>
+              <w:jc w:val="center"/>
+              <w:rPr>
+                <w:rFonts w:ascii="SimSun" w:hAnsi="SimSun" w:cs="SimSun"/>
+                <w:sz w:val="22"/>
+              </w:rPr>
+            </w:pPr>
+            <w:r>
+              <w:rPr>
+                <w:rFonts w:ascii="SimSun" w:hAnsi="SimSun" w:cs="SimSun"/>
+                <w:kern w:val="0"/>
+                <w:sz w:val="22"/>
+              </w:rPr>
+              <w:t>///</w:t>
+            </w:r>
+          </w:p>
+        </w:tc>
+        <w:tc>
+          <w:tcPr>
+            <w:tcW w:w="2105" w:type="dxa"/>
+            <w:gridSpan w:val="3"/>
             <w:tcBorders>
               <w:top w:val="dashSmallGap" w:color="00000A" w:sz="4" w:space="0"/>
               <w:left w:val="dashSmallGap" w:color="00000A" w:sz="4" w:space="0"/>
@@ -2261,679 +2351,21 @@
           </w:tcPr>
           <w:p>
             <w:pPr>
-              <w:pStyle w:val="29"/>
-              <w:keepNext w:val="0"/>
-              <w:keepLines w:val="0"/>
-              <w:widowControl/>
-              <w:suppressLineNumbers w:val="0"/>
-              <w:rPr>
-                <w:rFonts w:ascii="SimSun" w:hAnsi="SimSun" w:cs="SimSun"/>
-                <w:b w:val="0"/>
-                <w:bCs w:val="0"/>
-                <w:color w:val="000000"/>
-                <w:kern w:val="0"/>
-                <w:sz w:val="22"/>
-              </w:rPr>
-            </w:pPr>
-            <w:r>
-              <w:rPr>
-                <w:rFonts w:ascii="SimSun" w:hAnsi="SimSun" w:cs="SimSun"/>
-                <w:b/>
-                <w:color w:val="000000"/>
-                <w:kern w:val="0"/>
-                <w:sz w:val="22"/>
-              </w:rPr>
-              <w:t>1、</w:t>
-            </w:r>
-            <w:r>
-              <w:rPr>
-                <w:rFonts w:ascii="SimSun" w:hAnsi="SimSun" w:cs="SimSun"/>
-                <w:color w:val="000000"/>
-                <w:kern w:val="0"/>
-                <w:sz w:val="22"/>
-              </w:rPr>
-              <w:t>软件工程语言：</w:t>
-            </w:r>
-            <w:r>
-              <w:rPr>
-                <w:rFonts w:ascii="SimSun" w:hAnsi="SimSun" w:cs="SimSun"/>
-                <w:color w:val="000000"/>
-                <w:kern w:val="0"/>
-                <w:sz w:val="22"/>
-                <w:lang w:val="en-US"/>
-              </w:rPr>
-              <w:t>JavaScript</w:t>
-            </w:r>
-            <w:r>
-              <w:rPr>
-                <w:rFonts w:ascii="SimSun" w:hAnsi="SimSun" w:cs="SimSun"/>
-                <w:color w:val="000000"/>
-                <w:kern w:val="0"/>
-                <w:sz w:val="22"/>
-              </w:rPr>
-              <w:t xml:space="preserve"> (ES3, ES5, ES2015</w:t>
-            </w:r>
-            <w:r>
-              <w:rPr>
-                <w:rFonts w:ascii="SimSun" w:hAnsi="SimSun" w:cs="SimSun"/>
-                <w:color w:val="000000"/>
-                <w:kern w:val="0"/>
-                <w:sz w:val="22"/>
-                <w:lang w:val="en-US"/>
-              </w:rPr>
-              <w:t xml:space="preserve">, </w:t>
-            </w:r>
-            <w:r>
-              <w:rPr>
-                <w:rFonts w:ascii="SimSun" w:hAnsi="SimSun" w:cs="SimSun"/>
-                <w:color w:val="000000"/>
-                <w:kern w:val="0"/>
-                <w:sz w:val="22"/>
-                <w:lang w:val="en-US" w:eastAsia="zh-CN"/>
-              </w:rPr>
-              <w:t>ES2015以上</w:t>
-            </w:r>
-            <w:r>
-              <w:rPr>
-                <w:rFonts w:ascii="SimSun" w:hAnsi="SimSun" w:cs="SimSun"/>
-                <w:color w:val="000000"/>
-                <w:kern w:val="0"/>
-                <w:sz w:val="22"/>
-              </w:rPr>
-              <w:t>)、</w:t>
-            </w:r>
-            <w:r>
-              <w:rPr>
-                <w:rFonts w:hint="default" w:ascii="SimSun" w:hAnsi="SimSun" w:cs="SimSun"/>
-                <w:color w:val="000000"/>
-                <w:kern w:val="0"/>
-                <w:sz w:val="22"/>
-                <w:lang w:val="en-US"/>
-              </w:rPr>
-              <w:t>TypeScript</w:t>
-            </w:r>
-            <w:r>
-              <w:rPr>
-                <w:rFonts w:hint="eastAsia" w:ascii="SimSun" w:hAnsi="SimSun" w:cs="SimSun"/>
-                <w:color w:val="000000"/>
-                <w:kern w:val="0"/>
-                <w:sz w:val="22"/>
-                <w:lang w:val="en-US" w:eastAsia="zh-CN"/>
-              </w:rPr>
-              <w:t>、</w:t>
-            </w:r>
-            <w:r>
-              <w:rPr>
-                <w:rFonts w:ascii="SimSun" w:hAnsi="SimSun" w:cs="SimSun"/>
-                <w:color w:val="000000"/>
-                <w:kern w:val="0"/>
-                <w:sz w:val="22"/>
-                <w:lang w:val="en-US"/>
-              </w:rPr>
-              <w:t>HTML</w:t>
-            </w:r>
-            <w:r>
-              <w:rPr>
-                <w:rFonts w:ascii="SimSun" w:hAnsi="SimSun" w:cs="SimSun"/>
-                <w:color w:val="000000"/>
-                <w:kern w:val="0"/>
-                <w:sz w:val="22"/>
-              </w:rPr>
-              <w:t>/</w:t>
-            </w:r>
-            <w:r>
-              <w:rPr>
-                <w:rFonts w:ascii="SimSun" w:hAnsi="SimSun" w:cs="SimSun"/>
-                <w:color w:val="000000"/>
-                <w:kern w:val="0"/>
-                <w:sz w:val="22"/>
-                <w:lang w:val="en-US"/>
-              </w:rPr>
-              <w:t>CSS</w:t>
-            </w:r>
-            <w:r>
-              <w:rPr>
-                <w:rFonts w:ascii="SimSun" w:hAnsi="SimSun" w:cs="SimSun"/>
-                <w:color w:val="000000"/>
-                <w:kern w:val="0"/>
-                <w:sz w:val="22"/>
-              </w:rPr>
-              <w:t xml:space="preserve">、C/C++、Perl、JCL、PL/I  </w:t>
-            </w:r>
-            <w:r>
-              <w:rPr>
-                <w:rFonts w:ascii="SimSun" w:hAnsi="SimSun" w:cs="SimSun"/>
-                <w:b/>
-                <w:color w:val="000000"/>
-                <w:kern w:val="0"/>
-                <w:sz w:val="22"/>
-              </w:rPr>
-              <w:t>2、</w:t>
-            </w:r>
-            <w:r>
-              <w:rPr>
-                <w:rFonts w:ascii="SimSun" w:hAnsi="SimSun" w:cs="SimSun"/>
-                <w:color w:val="000000"/>
-                <w:kern w:val="0"/>
-                <w:sz w:val="22"/>
-                <w:lang w:val="en-US"/>
-              </w:rPr>
-              <w:t>JavaScript</w:t>
-            </w:r>
-            <w:r>
-              <w:rPr>
-                <w:rFonts w:hint="default" w:ascii="SimSun" w:hAnsi="SimSun" w:cs="SimSun"/>
-                <w:color w:val="000000"/>
-                <w:kern w:val="0"/>
-                <w:sz w:val="22"/>
-                <w:lang w:val="en-US"/>
-              </w:rPr>
-              <w:t>/TypeScript</w:t>
-            </w:r>
-            <w:r>
-              <w:rPr>
-                <w:rFonts w:ascii="SimSun" w:hAnsi="SimSun" w:cs="SimSun"/>
-                <w:color w:val="000000"/>
-                <w:kern w:val="0"/>
-                <w:sz w:val="22"/>
-              </w:rPr>
-              <w:t>框架</w:t>
-            </w:r>
-            <w:r>
-              <w:rPr>
-                <w:rFonts w:ascii="SimSun" w:hAnsi="SimSun" w:cs="SimSun"/>
-                <w:color w:val="000000"/>
-                <w:kern w:val="0"/>
-                <w:sz w:val="22"/>
-                <w:lang w:eastAsia="zh-CN"/>
-              </w:rPr>
-              <w:t>：</w:t>
-            </w:r>
-            <w:r>
-              <w:rPr>
-                <w:rFonts w:ascii="SimSun" w:hAnsi="SimSun" w:cs="SimSun"/>
-                <w:color w:val="000000"/>
-                <w:kern w:val="0"/>
-                <w:sz w:val="22"/>
-                <w:lang w:val="en-US"/>
-              </w:rPr>
-              <w:t xml:space="preserve">Vue 2/3, </w:t>
-            </w:r>
-            <w:r>
-              <w:rPr>
-                <w:rFonts w:hint="default" w:ascii="SimSun" w:hAnsi="SimSun" w:cs="SimSun"/>
-                <w:b/>
-                <w:bCs/>
-                <w:color w:val="000000"/>
-                <w:kern w:val="0"/>
-                <w:sz w:val="22"/>
-                <w:lang w:val="en-US"/>
-              </w:rPr>
-              <w:t>3</w:t>
-            </w:r>
-            <w:r>
-              <w:rPr>
-                <w:rFonts w:ascii="SimSun" w:hAnsi="SimSun" w:cs="SimSun"/>
-                <w:b/>
-                <w:color w:val="000000"/>
-                <w:kern w:val="0"/>
-                <w:sz w:val="22"/>
-              </w:rPr>
-              <w:t>、</w:t>
-            </w:r>
-            <w:r>
-              <w:rPr>
-                <w:rFonts w:ascii="SimSun" w:hAnsi="SimSun" w:cs="SimSun"/>
-                <w:b w:val="0"/>
-                <w:bCs w:val="0"/>
-                <w:color w:val="000000"/>
-                <w:kern w:val="0"/>
-                <w:sz w:val="22"/>
-                <w:lang w:eastAsia="zh-CN"/>
-              </w:rPr>
-              <w:t>测试工具：</w:t>
-            </w:r>
-            <w:r>
-              <w:rPr>
-                <w:rFonts w:hint="default" w:ascii="SimSun" w:hAnsi="SimSun" w:cs="SimSun"/>
-                <w:b w:val="0"/>
-                <w:bCs w:val="0"/>
-                <w:color w:val="000000"/>
-                <w:kern w:val="0"/>
-                <w:sz w:val="22"/>
-                <w:lang w:val="en-US" w:eastAsia="zh-CN"/>
-              </w:rPr>
-              <w:t>Jest</w:t>
-            </w:r>
-            <w:r>
-              <w:rPr>
-                <w:rFonts w:ascii="SimSun" w:hAnsi="SimSun" w:cs="SimSun"/>
-                <w:b w:val="0"/>
-                <w:bCs w:val="0"/>
-                <w:color w:val="000000"/>
-                <w:kern w:val="0"/>
-                <w:sz w:val="22"/>
-                <w:lang w:val="en-US" w:eastAsia="zh-CN"/>
-              </w:rPr>
-              <w:t xml:space="preserve"> </w:t>
-            </w:r>
-            <w:r>
-              <w:rPr>
-                <w:rFonts w:ascii="SimSun" w:hAnsi="SimSun" w:cs="SimSun"/>
-                <w:b/>
-                <w:bCs/>
-                <w:color w:val="000000"/>
-                <w:kern w:val="0"/>
-                <w:sz w:val="22"/>
-                <w:lang w:val="en-US" w:eastAsia="zh-CN"/>
-              </w:rPr>
-              <w:t xml:space="preserve"> 4</w:t>
-            </w:r>
-            <w:r>
-              <w:rPr>
-                <w:rFonts w:ascii="SimSun" w:hAnsi="SimSun" w:cs="SimSun"/>
-                <w:b/>
-                <w:bCs/>
-                <w:color w:val="000000"/>
-                <w:kern w:val="0"/>
-                <w:sz w:val="22"/>
-              </w:rPr>
-              <w:t>、</w:t>
-            </w:r>
-            <w:r>
-              <w:rPr>
-                <w:rFonts w:ascii="SimSun" w:hAnsi="SimSun" w:cs="SimSun"/>
-                <w:b w:val="0"/>
-                <w:bCs w:val="0"/>
-                <w:color w:val="000000"/>
-                <w:kern w:val="0"/>
-                <w:sz w:val="22"/>
-                <w:lang w:val="en-US"/>
-              </w:rPr>
-              <w:t>GIS</w:t>
-            </w:r>
-            <w:r>
-              <w:rPr>
-                <w:rFonts w:ascii="SimSun" w:hAnsi="SimSun" w:cs="SimSun"/>
-                <w:b w:val="0"/>
-                <w:bCs w:val="0"/>
-                <w:color w:val="000000"/>
-                <w:kern w:val="0"/>
-                <w:sz w:val="22"/>
-                <w:lang w:val="en-US" w:eastAsia="zh-CN"/>
-              </w:rPr>
-              <w:t>工具：Cesium js, 高德地图API, AntV L7</w:t>
-            </w:r>
-            <w:r>
-              <w:rPr>
-                <w:rFonts w:ascii="SimSun" w:hAnsi="SimSun" w:cs="SimSun"/>
-                <w:color w:val="000000"/>
-                <w:kern w:val="0"/>
-                <w:sz w:val="22"/>
-              </w:rPr>
-              <w:t xml:space="preserve"> </w:t>
-            </w:r>
-            <w:r>
-              <w:rPr>
-                <w:rFonts w:ascii="SimSun" w:hAnsi="SimSun" w:cs="SimSun"/>
-                <w:b/>
-                <w:bCs/>
-                <w:color w:val="000000"/>
-                <w:kern w:val="0"/>
-                <w:sz w:val="22"/>
-                <w:lang w:val="en-US" w:eastAsia="zh-CN"/>
-              </w:rPr>
-              <w:t>5</w:t>
-            </w:r>
-            <w:r>
-              <w:rPr>
-                <w:rFonts w:ascii="SimSun" w:hAnsi="SimSun" w:cs="SimSun"/>
-                <w:b/>
-                <w:bCs/>
-                <w:color w:val="000000"/>
-                <w:kern w:val="0"/>
-                <w:sz w:val="22"/>
-              </w:rPr>
-              <w:t>、</w:t>
-            </w:r>
-            <w:r>
-              <w:rPr>
-                <w:rFonts w:ascii="SimSun" w:hAnsi="SimSun" w:cs="SimSun"/>
-                <w:color w:val="000000"/>
-                <w:kern w:val="0"/>
-                <w:sz w:val="22"/>
-              </w:rPr>
-              <w:t xml:space="preserve">Web协议：HTTP1.0、HTTP2.0 </w:t>
-            </w:r>
-            <w:r>
-              <w:rPr>
-                <w:rFonts w:ascii="SimSun" w:hAnsi="SimSun" w:cs="SimSun"/>
-                <w:b/>
-                <w:bCs/>
-                <w:color w:val="000000"/>
-                <w:kern w:val="0"/>
-                <w:sz w:val="22"/>
-                <w:lang w:val="en-US" w:eastAsia="zh-CN"/>
-              </w:rPr>
-              <w:t>6</w:t>
-            </w:r>
-            <w:r>
-              <w:rPr>
-                <w:rFonts w:ascii="SimSun" w:hAnsi="SimSun" w:cs="SimSun"/>
-                <w:b/>
-                <w:color w:val="000000"/>
-                <w:kern w:val="0"/>
-                <w:sz w:val="22"/>
-              </w:rPr>
-              <w:t>、</w:t>
-            </w:r>
-            <w:r>
-              <w:rPr>
-                <w:rFonts w:ascii="SimSun" w:hAnsi="SimSun" w:cs="SimSun"/>
-                <w:color w:val="000000"/>
-                <w:kern w:val="0"/>
-                <w:sz w:val="22"/>
-              </w:rPr>
-              <w:t xml:space="preserve">数据库查询语言：SQL、DL/I  </w:t>
-            </w:r>
-            <w:r>
-              <w:rPr>
-                <w:rFonts w:ascii="SimSun" w:hAnsi="SimSun" w:cs="SimSun"/>
-                <w:b/>
-                <w:bCs/>
-                <w:color w:val="000000"/>
-                <w:kern w:val="0"/>
-                <w:sz w:val="22"/>
-                <w:lang w:val="en-US" w:eastAsia="zh-CN"/>
-              </w:rPr>
-              <w:t>7</w:t>
-            </w:r>
-            <w:r>
-              <w:rPr>
-                <w:rFonts w:ascii="SimSun" w:hAnsi="SimSun" w:cs="SimSun"/>
-                <w:b/>
-                <w:bCs/>
-                <w:color w:val="000000"/>
-                <w:kern w:val="0"/>
-                <w:sz w:val="22"/>
-              </w:rPr>
-              <w:t>、</w:t>
-            </w:r>
-            <w:r>
-              <w:rPr>
-                <w:rFonts w:ascii="SimSun" w:hAnsi="SimSun" w:cs="SimSun"/>
-                <w:color w:val="000000"/>
-                <w:kern w:val="0"/>
-                <w:sz w:val="22"/>
-              </w:rPr>
-              <w:t xml:space="preserve">软件系统: Tivoli Directory Integrator, IBM MQSeries  </w:t>
-            </w:r>
-            <w:r>
-              <w:rPr>
-                <w:rFonts w:ascii="SimSun" w:hAnsi="SimSun" w:cs="SimSun"/>
-                <w:b/>
-                <w:bCs/>
-                <w:color w:val="000000"/>
-                <w:kern w:val="0"/>
-                <w:sz w:val="22"/>
-                <w:lang w:val="en-US" w:eastAsia="zh-CN"/>
-              </w:rPr>
-              <w:t>8</w:t>
-            </w:r>
-            <w:r>
-              <w:rPr>
-                <w:rFonts w:ascii="SimSun" w:hAnsi="SimSun" w:cs="SimSun"/>
-                <w:b/>
-                <w:bCs/>
-                <w:color w:val="000000"/>
-                <w:kern w:val="0"/>
-                <w:sz w:val="22"/>
-              </w:rPr>
-              <w:t>、</w:t>
-            </w:r>
-            <w:r>
-              <w:rPr>
-                <w:rFonts w:ascii="SimSun" w:hAnsi="SimSun" w:cs="SimSun"/>
-                <w:color w:val="000000"/>
-                <w:kern w:val="0"/>
-                <w:sz w:val="22"/>
-              </w:rPr>
-              <w:t xml:space="preserve">数据库管理系统: DB2, IMS, MySQL  </w:t>
-            </w:r>
-            <w:r>
-              <w:rPr>
-                <w:rFonts w:ascii="SimSun" w:hAnsi="SimSun" w:cs="SimSun"/>
-                <w:b/>
-                <w:bCs/>
-                <w:color w:val="000000"/>
-                <w:kern w:val="0"/>
-                <w:sz w:val="22"/>
-                <w:lang w:val="en-US" w:eastAsia="zh-CN"/>
-              </w:rPr>
-              <w:t>9</w:t>
-            </w:r>
-            <w:r>
-              <w:rPr>
-                <w:rFonts w:ascii="SimSun" w:hAnsi="SimSun" w:cs="SimSun"/>
-                <w:b/>
-                <w:bCs/>
-                <w:color w:val="000000"/>
-                <w:kern w:val="0"/>
-                <w:sz w:val="22"/>
-              </w:rPr>
-              <w:t>、</w:t>
-            </w:r>
-            <w:r>
-              <w:rPr>
-                <w:rFonts w:ascii="SimSun" w:hAnsi="SimSun" w:cs="SimSun"/>
-                <w:color w:val="000000"/>
-                <w:kern w:val="0"/>
-                <w:sz w:val="22"/>
-              </w:rPr>
-              <w:t xml:space="preserve">操作系统: </w:t>
-            </w:r>
-            <w:r>
-              <w:rPr>
-                <w:rFonts w:ascii="SimSun" w:hAnsi="SimSun" w:cs="SimSun"/>
-                <w:color w:val="000000"/>
-                <w:kern w:val="0"/>
-                <w:sz w:val="22"/>
-                <w:lang w:val="en-US"/>
-              </w:rPr>
-              <w:t xml:space="preserve">Linux (Manjaro and Mint), IBM </w:t>
-            </w:r>
-            <w:r>
-              <w:rPr>
-                <w:rFonts w:ascii="SimSun" w:hAnsi="SimSun" w:cs="SimSun"/>
-                <w:color w:val="000000"/>
-                <w:kern w:val="0"/>
-                <w:sz w:val="22"/>
-              </w:rPr>
-              <w:t>z/OS, Windows NT/2000/XP/</w:t>
-            </w:r>
-            <w:r>
-              <w:rPr>
-                <w:rFonts w:ascii="SimSun" w:hAnsi="SimSun" w:cs="SimSun"/>
-                <w:color w:val="000000"/>
-                <w:kern w:val="0"/>
-                <w:sz w:val="22"/>
-                <w:lang w:val="en-US" w:eastAsia="zh-CN"/>
-              </w:rPr>
-              <w:t>7</w:t>
-            </w:r>
-            <w:r>
-              <w:rPr>
-                <w:rFonts w:ascii="SimSun" w:hAnsi="SimSun" w:cs="SimSun"/>
-                <w:color w:val="000000"/>
-                <w:kern w:val="0"/>
-                <w:sz w:val="22"/>
-              </w:rPr>
-              <w:t xml:space="preserve">, </w:t>
-            </w:r>
-            <w:r>
-              <w:rPr>
-                <w:rFonts w:ascii="SimSun" w:hAnsi="SimSun" w:cs="SimSun"/>
-                <w:b/>
-                <w:bCs/>
-                <w:color w:val="000000"/>
-                <w:kern w:val="0"/>
-                <w:sz w:val="22"/>
-                <w:lang w:val="en-US" w:eastAsia="zh-CN"/>
-              </w:rPr>
-              <w:t>10</w:t>
-            </w:r>
-            <w:r>
-              <w:rPr>
-                <w:rFonts w:ascii="SimSun" w:hAnsi="SimSun" w:cs="SimSun"/>
-                <w:b/>
-                <w:bCs/>
-                <w:color w:val="000000"/>
-                <w:kern w:val="0"/>
-                <w:sz w:val="22"/>
-              </w:rPr>
-              <w:t>、</w:t>
-            </w:r>
-            <w:r>
-              <w:rPr>
-                <w:rFonts w:ascii="SimSun" w:hAnsi="SimSun" w:cs="SimSun"/>
-                <w:color w:val="000000"/>
-                <w:kern w:val="0"/>
-                <w:sz w:val="22"/>
-              </w:rPr>
-              <w:t>其它能力: CA软件(Endevor, CA-7, File Manager, CA Gen等), OPC/A, CICS, SCLM</w:t>
-            </w:r>
-            <w:r>
-              <w:rPr>
-                <w:rFonts w:ascii="SimSun" w:hAnsi="SimSun" w:cs="SimSun"/>
-                <w:color w:val="000000"/>
-                <w:kern w:val="0"/>
-                <w:sz w:val="22"/>
-                <w:lang w:val="en-US" w:eastAsia="zh-CN"/>
-              </w:rPr>
-              <w:t xml:space="preserve"> </w:t>
-            </w:r>
-            <w:r>
-              <w:rPr>
-                <w:rFonts w:hint="default" w:ascii="SimSun" w:hAnsi="SimSun" w:cs="SimSun"/>
-                <w:b/>
-                <w:bCs/>
-                <w:color w:val="000000"/>
-                <w:kern w:val="0"/>
-                <w:sz w:val="22"/>
-                <w:lang w:val="en-US" w:eastAsia="zh-CN"/>
-              </w:rPr>
-              <w:t>11</w:t>
-            </w:r>
-            <w:r>
-              <w:rPr>
-                <w:rFonts w:hint="eastAsia" w:ascii="SimSun" w:hAnsi="SimSun" w:cs="SimSun"/>
-                <w:b/>
-                <w:bCs/>
-                <w:color w:val="000000"/>
-                <w:kern w:val="0"/>
-                <w:sz w:val="22"/>
-                <w:lang w:val="en-US" w:eastAsia="zh-CN"/>
-              </w:rPr>
-              <w:t>、</w:t>
-            </w:r>
-            <w:r>
-              <w:rPr>
-                <w:sz w:val="22"/>
-                <w:szCs w:val="22"/>
-              </w:rPr>
-              <w:t>开源无代码/低代码开</w:t>
-            </w:r>
-            <w:r>
-              <w:rPr>
-                <w:rFonts w:hint="eastAsia" w:asciiTheme="minorEastAsia" w:hAnsiTheme="minorEastAsia" w:eastAsiaTheme="minorEastAsia" w:cstheme="minorEastAsia"/>
-                <w:sz w:val="22"/>
-                <w:szCs w:val="22"/>
-              </w:rPr>
-              <w:t>发</w:t>
-            </w:r>
-            <w:r>
-              <w:rPr>
-                <w:rFonts w:hint="default" w:asciiTheme="minorEastAsia" w:hAnsiTheme="minorEastAsia" w:eastAsiaTheme="minorEastAsia" w:cstheme="minorEastAsia"/>
-                <w:sz w:val="22"/>
-                <w:szCs w:val="22"/>
-                <w:lang w:val="en-US"/>
-              </w:rPr>
-              <w:t>: Nocobase</w:t>
-            </w:r>
-            <w:r>
-              <w:rPr>
-                <w:rFonts w:hint="eastAsia" w:asciiTheme="minorEastAsia" w:hAnsiTheme="minorEastAsia" w:eastAsiaTheme="minorEastAsia" w:cstheme="minorEastAsia"/>
-                <w:sz w:val="22"/>
-                <w:szCs w:val="22"/>
-                <w:lang w:val="en-US" w:eastAsia="zh-CN"/>
-              </w:rPr>
-              <w:t>、</w:t>
-            </w:r>
-            <w:r>
-              <w:rPr>
-                <w:rFonts w:hint="default" w:asciiTheme="minorEastAsia" w:hAnsiTheme="minorEastAsia" w:eastAsiaTheme="minorEastAsia" w:cstheme="minorEastAsia"/>
-                <w:sz w:val="22"/>
-                <w:szCs w:val="22"/>
-                <w:lang w:val="en-US" w:eastAsia="zh-CN"/>
-              </w:rPr>
-              <w:t xml:space="preserve">AMIS </w:t>
-            </w:r>
-            <w:r>
-              <w:rPr>
-                <w:rFonts w:ascii="SimSun" w:hAnsi="SimSun" w:cs="SimSun"/>
-                <w:b/>
-                <w:bCs/>
-                <w:color w:val="000000"/>
-                <w:kern w:val="0"/>
-                <w:sz w:val="22"/>
-                <w:lang w:val="en-US" w:eastAsia="zh-CN"/>
-              </w:rPr>
-              <w:t>1</w:t>
-            </w:r>
-            <w:r>
-              <w:rPr>
-                <w:rFonts w:hint="default" w:ascii="SimSun" w:hAnsi="SimSun" w:cs="SimSun"/>
-                <w:b/>
-                <w:bCs/>
-                <w:color w:val="000000"/>
-                <w:kern w:val="0"/>
-                <w:sz w:val="22"/>
-                <w:lang w:val="en-US" w:eastAsia="zh-CN"/>
-              </w:rPr>
-              <w:t>2</w:t>
-            </w:r>
-            <w:r>
-              <w:rPr>
-                <w:rFonts w:ascii="SimSun" w:hAnsi="SimSun" w:cs="SimSun"/>
-                <w:b/>
-                <w:bCs/>
-                <w:color w:val="000000"/>
-                <w:kern w:val="0"/>
-                <w:sz w:val="22"/>
-              </w:rPr>
-              <w:t>、</w:t>
-            </w:r>
-            <w:r>
-              <w:rPr>
-                <w:rFonts w:ascii="SimSun" w:hAnsi="SimSun" w:cs="SimSun"/>
-                <w:b w:val="0"/>
-                <w:bCs w:val="0"/>
-                <w:color w:val="000000"/>
-                <w:kern w:val="0"/>
-                <w:sz w:val="22"/>
-              </w:rPr>
-              <w:t>辅助软件开发：熟练使用AI工具进行软件系统开发、原型构建与代码生成</w:t>
-            </w:r>
-          </w:p>
-          <w:p>
-            <w:pPr>
-              <w:widowControl w:val="0"/>
-              <w:jc w:val="left"/>
-              <w:rPr>
-                <w:rFonts w:eastAsia="SimSun"/>
-                <w:lang w:val="en-US" w:eastAsia="zh-CN"/>
-              </w:rPr>
-            </w:pPr>
+              <w:widowControl w:val="0"/>
+              <w:jc w:val="center"/>
+              <w:rPr>
+                <w:rFonts w:ascii="SimSun" w:hAnsi="SimSun" w:cs="SimSun"/>
+                <w:sz w:val="22"/>
+              </w:rPr>
+            </w:pPr>
+            <w:r>
+              <w:rPr>
+                <w:rFonts w:ascii="SimSun" w:hAnsi="SimSun" w:cs="SimSun"/>
+                <w:kern w:val="0"/>
+                <w:sz w:val="22"/>
+              </w:rPr>
+              <w:t>证明书</w:t>
+            </w:r>
           </w:p>
         </w:tc>
       </w:tr>
@@ -2979,142 +2411,698 @@
                 <w:kern w:val="0"/>
                 <w:sz w:val="22"/>
               </w:rPr>
-              <w:t>外语水平</w:t>
-            </w:r>
-          </w:p>
-        </w:tc>
-        <w:tc>
-          <w:tcPr>
-            <w:tcW w:w="3540" w:type="dxa"/>
-            <w:gridSpan w:val="6"/>
-            <w:tcBorders>
-              <w:top w:val="dashSmallGap" w:color="00000A" w:sz="4" w:space="0"/>
-              <w:left w:val="dashSmallGap" w:color="00000A" w:sz="4" w:space="0"/>
-              <w:bottom w:val="dashSmallGap" w:color="00000A" w:sz="4" w:space="0"/>
-              <w:right w:val="dashSmallGap" w:color="00000A" w:sz="4" w:space="0"/>
+              <w:t>专业技能</w:t>
+            </w:r>
+          </w:p>
+        </w:tc>
+        <w:tc>
+          <w:tcPr>
+            <w:tcW w:w="8878" w:type="dxa"/>
+            <w:gridSpan w:val="15"/>
+            <w:tcBorders>
+              <w:top w:val="dashSmallGap" w:color="00000A" w:sz="4" w:space="0"/>
+              <w:left w:val="dashSmallGap" w:color="00000A" w:sz="4" w:space="0"/>
+              <w:bottom w:val="dashSmallGap" w:color="00000A" w:sz="4" w:space="0"/>
+              <w:right w:val="single" w:color="00000A" w:sz="12" w:space="0"/>
             </w:tcBorders>
             <w:shd w:val="clear" w:color="auto" w:fill="auto"/>
             <w:vAlign w:val="center"/>
           </w:tcPr>
           <w:p>
             <w:pPr>
+              <w:pStyle w:val="29"/>
+              <w:keepNext w:val="0"/>
+              <w:keepLines w:val="0"/>
+              <w:widowControl/>
+              <w:suppressLineNumbers w:val="0"/>
+              <w:rPr>
+                <w:rFonts w:ascii="SimSun" w:hAnsi="SimSun" w:cs="SimSun"/>
+                <w:b w:val="0"/>
+                <w:bCs w:val="0"/>
+                <w:color w:val="000000"/>
+                <w:kern w:val="0"/>
+                <w:sz w:val="22"/>
+              </w:rPr>
+            </w:pPr>
+            <w:r>
+              <w:rPr>
+                <w:rFonts w:ascii="SimSun" w:hAnsi="SimSun" w:cs="SimSun"/>
+                <w:b/>
+                <w:color w:val="000000"/>
+                <w:kern w:val="0"/>
+                <w:sz w:val="22"/>
+              </w:rPr>
+              <w:t>1、</w:t>
+            </w:r>
+            <w:r>
+              <w:rPr>
+                <w:rFonts w:ascii="SimSun" w:hAnsi="SimSun" w:cs="SimSun"/>
+                <w:color w:val="000000"/>
+                <w:kern w:val="0"/>
+                <w:sz w:val="22"/>
+              </w:rPr>
+              <w:t>软件工程语言：</w:t>
+            </w:r>
+            <w:r>
+              <w:rPr>
+                <w:rFonts w:ascii="SimSun" w:hAnsi="SimSun" w:cs="SimSun"/>
+                <w:color w:val="000000"/>
+                <w:kern w:val="0"/>
+                <w:sz w:val="22"/>
+                <w:lang w:val="en-US"/>
+              </w:rPr>
+              <w:t>JavaScript</w:t>
+            </w:r>
+            <w:r>
+              <w:rPr>
+                <w:rFonts w:ascii="SimSun" w:hAnsi="SimSun" w:cs="SimSun"/>
+                <w:color w:val="000000"/>
+                <w:kern w:val="0"/>
+                <w:sz w:val="22"/>
+              </w:rPr>
+              <w:t xml:space="preserve"> (ES3, ES5, ES2015</w:t>
+            </w:r>
+            <w:r>
+              <w:rPr>
+                <w:rFonts w:ascii="SimSun" w:hAnsi="SimSun" w:cs="SimSun"/>
+                <w:color w:val="000000"/>
+                <w:kern w:val="0"/>
+                <w:sz w:val="22"/>
+                <w:lang w:val="en-US"/>
+              </w:rPr>
+              <w:t xml:space="preserve">, </w:t>
+            </w:r>
+            <w:r>
+              <w:rPr>
+                <w:rFonts w:ascii="SimSun" w:hAnsi="SimSun" w:cs="SimSun"/>
+                <w:color w:val="000000"/>
+                <w:kern w:val="0"/>
+                <w:sz w:val="22"/>
+                <w:lang w:val="en-US" w:eastAsia="zh-CN"/>
+              </w:rPr>
+              <w:t>ES2015以上</w:t>
+            </w:r>
+            <w:r>
+              <w:rPr>
+                <w:rFonts w:ascii="SimSun" w:hAnsi="SimSun" w:cs="SimSun"/>
+                <w:color w:val="000000"/>
+                <w:kern w:val="0"/>
+                <w:sz w:val="22"/>
+              </w:rPr>
+              <w:t>)、</w:t>
+            </w:r>
+            <w:r>
+              <w:rPr>
+                <w:rFonts w:hint="default" w:ascii="SimSun" w:hAnsi="SimSun" w:cs="SimSun"/>
+                <w:color w:val="000000"/>
+                <w:kern w:val="0"/>
+                <w:sz w:val="22"/>
+                <w:lang w:val="en-US"/>
+              </w:rPr>
+              <w:t>TypeScript</w:t>
+            </w:r>
+            <w:r>
+              <w:rPr>
+                <w:rFonts w:hint="eastAsia" w:ascii="SimSun" w:hAnsi="SimSun" w:cs="SimSun"/>
+                <w:color w:val="000000"/>
+                <w:kern w:val="0"/>
+                <w:sz w:val="22"/>
+                <w:lang w:val="en-US" w:eastAsia="zh-CN"/>
+              </w:rPr>
+              <w:t>、</w:t>
+            </w:r>
+            <w:r>
+              <w:rPr>
+                <w:rFonts w:ascii="SimSun" w:hAnsi="SimSun" w:cs="SimSun"/>
+                <w:color w:val="000000"/>
+                <w:kern w:val="0"/>
+                <w:sz w:val="22"/>
+                <w:lang w:val="en-US"/>
+              </w:rPr>
+              <w:t>HTML</w:t>
+            </w:r>
+            <w:r>
+              <w:rPr>
+                <w:rFonts w:ascii="SimSun" w:hAnsi="SimSun" w:cs="SimSun"/>
+                <w:color w:val="000000"/>
+                <w:kern w:val="0"/>
+                <w:sz w:val="22"/>
+              </w:rPr>
+              <w:t>/</w:t>
+            </w:r>
+            <w:r>
+              <w:rPr>
+                <w:rFonts w:ascii="SimSun" w:hAnsi="SimSun" w:cs="SimSun"/>
+                <w:color w:val="000000"/>
+                <w:kern w:val="0"/>
+                <w:sz w:val="22"/>
+                <w:lang w:val="en-US"/>
+              </w:rPr>
+              <w:t>CSS</w:t>
+            </w:r>
+            <w:r>
+              <w:rPr>
+                <w:rFonts w:ascii="SimSun" w:hAnsi="SimSun" w:cs="SimSun"/>
+                <w:color w:val="000000"/>
+                <w:kern w:val="0"/>
+                <w:sz w:val="22"/>
+              </w:rPr>
+              <w:t xml:space="preserve">、C/C++、Perl、JCL、PL/I  </w:t>
+            </w:r>
+            <w:r>
+              <w:rPr>
+                <w:rFonts w:ascii="SimSun" w:hAnsi="SimSun" w:cs="SimSun"/>
+                <w:b/>
+                <w:color w:val="000000"/>
+                <w:kern w:val="0"/>
+                <w:sz w:val="22"/>
+              </w:rPr>
+              <w:t>2、</w:t>
+            </w:r>
+            <w:r>
+              <w:rPr>
+                <w:rFonts w:ascii="SimSun" w:hAnsi="SimSun" w:cs="SimSun"/>
+                <w:color w:val="000000"/>
+                <w:kern w:val="0"/>
+                <w:sz w:val="22"/>
+                <w:lang w:val="en-US"/>
+              </w:rPr>
+              <w:t>JavaScript</w:t>
+            </w:r>
+            <w:r>
+              <w:rPr>
+                <w:rFonts w:hint="default" w:ascii="SimSun" w:hAnsi="SimSun" w:cs="SimSun"/>
+                <w:color w:val="000000"/>
+                <w:kern w:val="0"/>
+                <w:sz w:val="22"/>
+                <w:lang w:val="en-US"/>
+              </w:rPr>
+              <w:t>/TypeScript</w:t>
+            </w:r>
+            <w:r>
+              <w:rPr>
+                <w:rFonts w:ascii="SimSun" w:hAnsi="SimSun" w:cs="SimSun"/>
+                <w:color w:val="000000"/>
+                <w:kern w:val="0"/>
+                <w:sz w:val="22"/>
+              </w:rPr>
+              <w:t>框架</w:t>
+            </w:r>
+            <w:r>
+              <w:rPr>
+                <w:rFonts w:ascii="SimSun" w:hAnsi="SimSun" w:cs="SimSun"/>
+                <w:color w:val="000000"/>
+                <w:kern w:val="0"/>
+                <w:sz w:val="22"/>
+                <w:lang w:eastAsia="zh-CN"/>
+              </w:rPr>
+              <w:t>：</w:t>
+            </w:r>
+            <w:r>
+              <w:rPr>
+                <w:rFonts w:ascii="SimSun" w:hAnsi="SimSun" w:cs="SimSun"/>
+                <w:color w:val="000000"/>
+                <w:kern w:val="0"/>
+                <w:sz w:val="22"/>
+                <w:lang w:val="en-US"/>
+              </w:rPr>
+              <w:t xml:space="preserve">Vue 2/3, </w:t>
+            </w:r>
+            <w:r>
+              <w:rPr>
+                <w:rFonts w:hint="default" w:ascii="SimSun" w:hAnsi="SimSun" w:cs="SimSun"/>
+                <w:b/>
+                <w:bCs/>
+                <w:color w:val="000000"/>
+                <w:kern w:val="0"/>
+                <w:sz w:val="22"/>
+                <w:lang w:val="en-US"/>
+              </w:rPr>
+              <w:t>3</w:t>
+            </w:r>
+            <w:r>
+              <w:rPr>
+                <w:rFonts w:ascii="SimSun" w:hAnsi="SimSun" w:cs="SimSun"/>
+                <w:b/>
+                <w:color w:val="000000"/>
+                <w:kern w:val="0"/>
+                <w:sz w:val="22"/>
+              </w:rPr>
+              <w:t>、</w:t>
+            </w:r>
+            <w:r>
+              <w:rPr>
+                <w:rFonts w:ascii="SimSun" w:hAnsi="SimSun" w:cs="SimSun"/>
+                <w:b w:val="0"/>
+                <w:bCs w:val="0"/>
+                <w:color w:val="000000"/>
+                <w:kern w:val="0"/>
+                <w:sz w:val="22"/>
+                <w:lang w:eastAsia="zh-CN"/>
+              </w:rPr>
+              <w:t>测试工具：</w:t>
+            </w:r>
+            <w:r>
+              <w:rPr>
+                <w:rFonts w:hint="default" w:ascii="SimSun" w:hAnsi="SimSun" w:cs="SimSun"/>
+                <w:b w:val="0"/>
+                <w:bCs w:val="0"/>
+                <w:color w:val="000000"/>
+                <w:kern w:val="0"/>
+                <w:sz w:val="22"/>
+                <w:lang w:val="en-US" w:eastAsia="zh-CN"/>
+              </w:rPr>
+              <w:t>Jest</w:t>
+            </w:r>
+            <w:r>
+              <w:rPr>
+                <w:rFonts w:ascii="SimSun" w:hAnsi="SimSun" w:cs="SimSun"/>
+                <w:b w:val="0"/>
+                <w:bCs w:val="0"/>
+                <w:color w:val="000000"/>
+                <w:kern w:val="0"/>
+                <w:sz w:val="22"/>
+                <w:lang w:val="en-US" w:eastAsia="zh-CN"/>
+              </w:rPr>
+              <w:t xml:space="preserve"> </w:t>
+            </w:r>
+            <w:r>
+              <w:rPr>
+                <w:rFonts w:ascii="SimSun" w:hAnsi="SimSun" w:cs="SimSun"/>
+                <w:b/>
+                <w:bCs/>
+                <w:color w:val="000000"/>
+                <w:kern w:val="0"/>
+                <w:sz w:val="22"/>
+                <w:lang w:val="en-US" w:eastAsia="zh-CN"/>
+              </w:rPr>
+              <w:t xml:space="preserve"> 4</w:t>
+            </w:r>
+            <w:r>
+              <w:rPr>
+                <w:rFonts w:ascii="SimSun" w:hAnsi="SimSun" w:cs="SimSun"/>
+                <w:b/>
+                <w:bCs/>
+                <w:color w:val="000000"/>
+                <w:kern w:val="0"/>
+                <w:sz w:val="22"/>
+              </w:rPr>
+              <w:t>、</w:t>
+            </w:r>
+            <w:r>
+              <w:rPr>
+                <w:rFonts w:ascii="SimSun" w:hAnsi="SimSun" w:cs="SimSun"/>
+                <w:b w:val="0"/>
+                <w:bCs w:val="0"/>
+                <w:color w:val="000000"/>
+                <w:kern w:val="0"/>
+                <w:sz w:val="22"/>
+                <w:lang w:val="en-US"/>
+              </w:rPr>
+              <w:t>GIS</w:t>
+            </w:r>
+            <w:r>
+              <w:rPr>
+                <w:rFonts w:ascii="SimSun" w:hAnsi="SimSun" w:cs="SimSun"/>
+                <w:b w:val="0"/>
+                <w:bCs w:val="0"/>
+                <w:color w:val="000000"/>
+                <w:kern w:val="0"/>
+                <w:sz w:val="22"/>
+                <w:lang w:val="en-US" w:eastAsia="zh-CN"/>
+              </w:rPr>
+              <w:t>工具：CesiumJS, 高德地图API, AntV L7</w:t>
+            </w:r>
+            <w:r>
+              <w:rPr>
+                <w:rFonts w:ascii="SimSun" w:hAnsi="SimSun" w:cs="SimSun"/>
+                <w:color w:val="000000"/>
+                <w:kern w:val="0"/>
+                <w:sz w:val="22"/>
+              </w:rPr>
+              <w:t xml:space="preserve"> </w:t>
+            </w:r>
+            <w:r>
+              <w:rPr>
+                <w:rFonts w:ascii="SimSun" w:hAnsi="SimSun" w:cs="SimSun"/>
+                <w:b/>
+                <w:bCs/>
+                <w:color w:val="000000"/>
+                <w:kern w:val="0"/>
+                <w:sz w:val="22"/>
+                <w:lang w:val="en-US" w:eastAsia="zh-CN"/>
+              </w:rPr>
+              <w:t>5</w:t>
+            </w:r>
+            <w:r>
+              <w:rPr>
+                <w:rFonts w:ascii="SimSun" w:hAnsi="SimSun" w:cs="SimSun"/>
+                <w:b/>
+                <w:bCs/>
+                <w:color w:val="000000"/>
+                <w:kern w:val="0"/>
+                <w:sz w:val="22"/>
+              </w:rPr>
+              <w:t>、</w:t>
+            </w:r>
+            <w:r>
+              <w:rPr>
+                <w:rFonts w:ascii="SimSun" w:hAnsi="SimSun" w:cs="SimSun"/>
+                <w:color w:val="000000"/>
+                <w:kern w:val="0"/>
+                <w:sz w:val="22"/>
+              </w:rPr>
+              <w:t xml:space="preserve">Web协议：HTTP1.0、HTTP2.0 </w:t>
+            </w:r>
+            <w:r>
+              <w:rPr>
+                <w:rFonts w:ascii="SimSun" w:hAnsi="SimSun" w:cs="SimSun"/>
+                <w:b/>
+                <w:bCs/>
+                <w:color w:val="000000"/>
+                <w:kern w:val="0"/>
+                <w:sz w:val="22"/>
+                <w:lang w:val="en-US" w:eastAsia="zh-CN"/>
+              </w:rPr>
+              <w:t>6</w:t>
+            </w:r>
+            <w:r>
+              <w:rPr>
+                <w:rFonts w:ascii="SimSun" w:hAnsi="SimSun" w:cs="SimSun"/>
+                <w:b/>
+                <w:color w:val="000000"/>
+                <w:kern w:val="0"/>
+                <w:sz w:val="22"/>
+              </w:rPr>
+              <w:t>、</w:t>
+            </w:r>
+            <w:r>
+              <w:rPr>
+                <w:rFonts w:ascii="SimSun" w:hAnsi="SimSun" w:cs="SimSun"/>
+                <w:color w:val="000000"/>
+                <w:kern w:val="0"/>
+                <w:sz w:val="22"/>
+              </w:rPr>
+              <w:t xml:space="preserve">数据库查询语言：SQL、DL/I  </w:t>
+            </w:r>
+            <w:r>
+              <w:rPr>
+                <w:rFonts w:ascii="SimSun" w:hAnsi="SimSun" w:cs="SimSun"/>
+                <w:b/>
+                <w:bCs/>
+                <w:color w:val="000000"/>
+                <w:kern w:val="0"/>
+                <w:sz w:val="22"/>
+                <w:lang w:val="en-US" w:eastAsia="zh-CN"/>
+              </w:rPr>
+              <w:t>7</w:t>
+            </w:r>
+            <w:r>
+              <w:rPr>
+                <w:rFonts w:ascii="SimSun" w:hAnsi="SimSun" w:cs="SimSun"/>
+                <w:b/>
+                <w:bCs/>
+                <w:color w:val="000000"/>
+                <w:kern w:val="0"/>
+                <w:sz w:val="22"/>
+              </w:rPr>
+              <w:t>、</w:t>
+            </w:r>
+            <w:r>
+              <w:rPr>
+                <w:rFonts w:ascii="SimSun" w:hAnsi="SimSun" w:cs="SimSun"/>
+                <w:color w:val="000000"/>
+                <w:kern w:val="0"/>
+                <w:sz w:val="22"/>
+              </w:rPr>
+              <w:t xml:space="preserve">软件系统: Tivoli Directory Integrator, IBM MQSeries  </w:t>
+            </w:r>
+            <w:r>
+              <w:rPr>
+                <w:rFonts w:ascii="SimSun" w:hAnsi="SimSun" w:cs="SimSun"/>
+                <w:b/>
+                <w:bCs/>
+                <w:color w:val="000000"/>
+                <w:kern w:val="0"/>
+                <w:sz w:val="22"/>
+                <w:lang w:val="en-US" w:eastAsia="zh-CN"/>
+              </w:rPr>
+              <w:t>8</w:t>
+            </w:r>
+            <w:r>
+              <w:rPr>
+                <w:rFonts w:ascii="SimSun" w:hAnsi="SimSun" w:cs="SimSun"/>
+                <w:b/>
+                <w:bCs/>
+                <w:color w:val="000000"/>
+                <w:kern w:val="0"/>
+                <w:sz w:val="22"/>
+              </w:rPr>
+              <w:t>、</w:t>
+            </w:r>
+            <w:r>
+              <w:rPr>
+                <w:rFonts w:ascii="SimSun" w:hAnsi="SimSun" w:cs="SimSun"/>
+                <w:color w:val="000000"/>
+                <w:kern w:val="0"/>
+                <w:sz w:val="22"/>
+              </w:rPr>
+              <w:t xml:space="preserve">数据库管理系统: DB2, IMS, MySQL  </w:t>
+            </w:r>
+            <w:r>
+              <w:rPr>
+                <w:rFonts w:ascii="SimSun" w:hAnsi="SimSun" w:cs="SimSun"/>
+                <w:b/>
+                <w:bCs/>
+                <w:color w:val="000000"/>
+                <w:kern w:val="0"/>
+                <w:sz w:val="22"/>
+                <w:lang w:val="en-US" w:eastAsia="zh-CN"/>
+              </w:rPr>
+              <w:t>9</w:t>
+            </w:r>
+            <w:r>
+              <w:rPr>
+                <w:rFonts w:ascii="SimSun" w:hAnsi="SimSun" w:cs="SimSun"/>
+                <w:b/>
+                <w:bCs/>
+                <w:color w:val="000000"/>
+                <w:kern w:val="0"/>
+                <w:sz w:val="22"/>
+              </w:rPr>
+              <w:t>、</w:t>
+            </w:r>
+            <w:r>
+              <w:rPr>
+                <w:rFonts w:ascii="SimSun" w:hAnsi="SimSun" w:cs="SimSun"/>
+                <w:color w:val="000000"/>
+                <w:kern w:val="0"/>
+                <w:sz w:val="22"/>
+              </w:rPr>
+              <w:t xml:space="preserve">操作系统: </w:t>
+            </w:r>
+            <w:r>
+              <w:rPr>
+                <w:rFonts w:ascii="SimSun" w:hAnsi="SimSun" w:cs="SimSun"/>
+                <w:color w:val="000000"/>
+                <w:kern w:val="0"/>
+                <w:sz w:val="22"/>
+                <w:lang w:val="en-US"/>
+              </w:rPr>
+              <w:t xml:space="preserve">Linux (Manjaro and Mint), IBM </w:t>
+            </w:r>
+            <w:r>
+              <w:rPr>
+                <w:rFonts w:ascii="SimSun" w:hAnsi="SimSun" w:cs="SimSun"/>
+                <w:color w:val="000000"/>
+                <w:kern w:val="0"/>
+                <w:sz w:val="22"/>
+              </w:rPr>
+              <w:t>z/OS, Windows NT/2000/XP/</w:t>
+            </w:r>
+            <w:r>
+              <w:rPr>
+                <w:rFonts w:ascii="SimSun" w:hAnsi="SimSun" w:cs="SimSun"/>
+                <w:color w:val="000000"/>
+                <w:kern w:val="0"/>
+                <w:sz w:val="22"/>
+                <w:lang w:val="en-US" w:eastAsia="zh-CN"/>
+              </w:rPr>
+              <w:t>7</w:t>
+            </w:r>
+            <w:r>
+              <w:rPr>
+                <w:rFonts w:ascii="SimSun" w:hAnsi="SimSun" w:cs="SimSun"/>
+                <w:color w:val="000000"/>
+                <w:kern w:val="0"/>
+                <w:sz w:val="22"/>
+              </w:rPr>
+              <w:t xml:space="preserve">, </w:t>
+            </w:r>
+            <w:r>
+              <w:rPr>
+                <w:rFonts w:ascii="SimSun" w:hAnsi="SimSun" w:cs="SimSun"/>
+                <w:b/>
+                <w:bCs/>
+                <w:color w:val="000000"/>
+                <w:kern w:val="0"/>
+                <w:sz w:val="22"/>
+                <w:lang w:val="en-US" w:eastAsia="zh-CN"/>
+              </w:rPr>
+              <w:t>10</w:t>
+            </w:r>
+            <w:r>
+              <w:rPr>
+                <w:rFonts w:ascii="SimSun" w:hAnsi="SimSun" w:cs="SimSun"/>
+                <w:b/>
+                <w:bCs/>
+                <w:color w:val="000000"/>
+                <w:kern w:val="0"/>
+                <w:sz w:val="22"/>
+              </w:rPr>
+              <w:t>、</w:t>
+            </w:r>
+            <w:r>
+              <w:rPr>
+                <w:rFonts w:ascii="SimSun" w:hAnsi="SimSun" w:cs="SimSun"/>
+                <w:color w:val="000000"/>
+                <w:kern w:val="0"/>
+                <w:sz w:val="22"/>
+              </w:rPr>
+              <w:t>其它能力: CA软件(Endevor, CA-7, File Manager, CA Gen等), OPC/A, CICS, SCLM</w:t>
+            </w:r>
+            <w:r>
+              <w:rPr>
+                <w:rFonts w:ascii="SimSun" w:hAnsi="SimSun" w:cs="SimSun"/>
+                <w:color w:val="000000"/>
+                <w:kern w:val="0"/>
+                <w:sz w:val="22"/>
+                <w:lang w:val="en-US" w:eastAsia="zh-CN"/>
+              </w:rPr>
+              <w:t xml:space="preserve"> </w:t>
+            </w:r>
+            <w:r>
+              <w:rPr>
+                <w:rFonts w:hint="default" w:ascii="SimSun" w:hAnsi="SimSun" w:cs="SimSun"/>
+                <w:b/>
+                <w:bCs/>
+                <w:color w:val="000000"/>
+                <w:kern w:val="0"/>
+                <w:sz w:val="22"/>
+                <w:lang w:val="en-US" w:eastAsia="zh-CN"/>
+              </w:rPr>
+              <w:t>11</w:t>
+            </w:r>
+            <w:r>
+              <w:rPr>
+                <w:rFonts w:hint="eastAsia" w:ascii="SimSun" w:hAnsi="SimSun" w:cs="SimSun"/>
+                <w:b/>
+                <w:bCs/>
+                <w:color w:val="000000"/>
+                <w:kern w:val="0"/>
+                <w:sz w:val="22"/>
+                <w:lang w:val="en-US" w:eastAsia="zh-CN"/>
+              </w:rPr>
+              <w:t>、</w:t>
+            </w:r>
+            <w:r>
+              <w:rPr>
+                <w:sz w:val="22"/>
+                <w:szCs w:val="22"/>
+              </w:rPr>
+              <w:t>开源无代码/低代码开</w:t>
+            </w:r>
+            <w:r>
+              <w:rPr>
+                <w:rFonts w:hint="eastAsia" w:asciiTheme="minorEastAsia" w:hAnsiTheme="minorEastAsia" w:eastAsiaTheme="minorEastAsia" w:cstheme="minorEastAsia"/>
+                <w:sz w:val="22"/>
+                <w:szCs w:val="22"/>
+              </w:rPr>
+              <w:t>发</w:t>
+            </w:r>
+            <w:r>
+              <w:rPr>
+                <w:rFonts w:hint="default" w:asciiTheme="minorEastAsia" w:hAnsiTheme="minorEastAsia" w:eastAsiaTheme="minorEastAsia" w:cstheme="minorEastAsia"/>
+                <w:sz w:val="22"/>
+                <w:szCs w:val="22"/>
+                <w:lang w:val="en-US"/>
+              </w:rPr>
+              <w:t>: NocoBase</w:t>
+            </w:r>
+            <w:r>
+              <w:rPr>
+                <w:rFonts w:hint="eastAsia" w:asciiTheme="minorEastAsia" w:hAnsiTheme="minorEastAsia" w:eastAsiaTheme="minorEastAsia" w:cstheme="minorEastAsia"/>
+                <w:sz w:val="22"/>
+                <w:szCs w:val="22"/>
+                <w:lang w:val="en-US" w:eastAsia="zh-CN"/>
+              </w:rPr>
+              <w:t>、</w:t>
+            </w:r>
+            <w:r>
+              <w:rPr>
+                <w:rFonts w:hint="default" w:asciiTheme="minorEastAsia" w:hAnsiTheme="minorEastAsia" w:eastAsiaTheme="minorEastAsia" w:cstheme="minorEastAsia"/>
+                <w:sz w:val="22"/>
+                <w:szCs w:val="22"/>
+                <w:lang w:val="en-US" w:eastAsia="zh-CN"/>
+              </w:rPr>
+              <w:t xml:space="preserve">AMIS </w:t>
+            </w:r>
+            <w:r>
+              <w:rPr>
+                <w:rFonts w:ascii="SimSun" w:hAnsi="SimSun" w:cs="SimSun"/>
+                <w:b/>
+                <w:bCs/>
+                <w:color w:val="000000"/>
+                <w:kern w:val="0"/>
+                <w:sz w:val="22"/>
+                <w:lang w:val="en-US" w:eastAsia="zh-CN"/>
+              </w:rPr>
+              <w:t>1</w:t>
+            </w:r>
+            <w:r>
+              <w:rPr>
+                <w:rFonts w:hint="default" w:ascii="SimSun" w:hAnsi="SimSun" w:cs="SimSun"/>
+                <w:b/>
+                <w:bCs/>
+                <w:color w:val="000000"/>
+                <w:kern w:val="0"/>
+                <w:sz w:val="22"/>
+                <w:lang w:val="en-US" w:eastAsia="zh-CN"/>
+              </w:rPr>
+              <w:t>2</w:t>
+            </w:r>
+            <w:r>
+              <w:rPr>
+                <w:rFonts w:ascii="SimSun" w:hAnsi="SimSun" w:cs="SimSun"/>
+                <w:b/>
+                <w:bCs/>
+                <w:color w:val="000000"/>
+                <w:kern w:val="0"/>
+                <w:sz w:val="22"/>
+              </w:rPr>
+              <w:t>、</w:t>
+            </w:r>
+            <w:r>
+              <w:rPr>
+                <w:rFonts w:ascii="SimSun" w:hAnsi="SimSun" w:cs="SimSun"/>
+                <w:b w:val="0"/>
+                <w:bCs w:val="0"/>
+                <w:color w:val="000000"/>
+                <w:kern w:val="0"/>
+                <w:sz w:val="22"/>
+              </w:rPr>
+              <w:t>辅助软件开发：熟练使用AI工具进行软件系统开发、原型构建与代码生成</w:t>
+            </w:r>
+          </w:p>
+          <w:p>
+            <w:pPr>
               <w:widowControl w:val="0"/>
               <w:jc w:val="left"/>
               <w:rPr>
-                <w:rFonts w:ascii="SimSun" w:hAnsi="SimSun" w:cs="SimSun"/>
-                <w:sz w:val="22"/>
-              </w:rPr>
-            </w:pPr>
-            <w:r>
-              <w:rPr>
-                <w:rFonts w:ascii="SimSun" w:hAnsi="SimSun" w:cs="SimSun"/>
-                <w:kern w:val="0"/>
-                <w:sz w:val="22"/>
-              </w:rPr>
-              <w:t>俄语、白俄语：母语</w:t>
-            </w:r>
-          </w:p>
-          <w:p>
-            <w:pPr>
-              <w:widowControl w:val="0"/>
-              <w:jc w:val="left"/>
-              <w:rPr>
-                <w:rFonts w:ascii="SimSun" w:hAnsi="SimSun" w:cs="SimSun"/>
-                <w:sz w:val="22"/>
-              </w:rPr>
-            </w:pPr>
-            <w:r>
-              <w:rPr>
-                <w:rFonts w:ascii="SimSun" w:hAnsi="SimSun" w:cs="SimSun"/>
-                <w:kern w:val="0"/>
-                <w:sz w:val="22"/>
-              </w:rPr>
-              <w:t>汉语：听说（熟练），读写（熟练）</w:t>
-            </w:r>
-          </w:p>
-          <w:p>
-            <w:pPr>
-              <w:widowControl w:val="0"/>
-              <w:jc w:val="left"/>
-              <w:rPr>
-                <w:rFonts w:ascii="SimSun" w:hAnsi="SimSun" w:cs="SimSun"/>
-                <w:sz w:val="22"/>
-              </w:rPr>
-            </w:pPr>
-            <w:r>
-              <w:rPr>
-                <w:rFonts w:ascii="SimSun" w:hAnsi="SimSun" w:cs="SimSun"/>
-                <w:kern w:val="0"/>
-                <w:sz w:val="22"/>
-              </w:rPr>
-              <w:t>英语：听说（熟练），读写（熟练）</w:t>
-            </w:r>
-          </w:p>
-        </w:tc>
-        <w:tc>
-          <w:tcPr>
-            <w:tcW w:w="2171" w:type="dxa"/>
-            <w:gridSpan w:val="5"/>
-            <w:tcBorders>
-              <w:top w:val="dashSmallGap" w:color="00000A" w:sz="4" w:space="0"/>
-              <w:left w:val="dashSmallGap" w:color="00000A" w:sz="4" w:space="0"/>
-              <w:bottom w:val="dashSmallGap" w:color="00000A" w:sz="4" w:space="0"/>
-              <w:right w:val="dashSmallGap" w:color="00000A" w:sz="4" w:space="0"/>
-            </w:tcBorders>
-            <w:shd w:val="clear" w:color="auto" w:fill="F2F2F2"/>
-            <w:vAlign w:val="center"/>
-          </w:tcPr>
-          <w:p>
-            <w:pPr>
-              <w:widowControl w:val="0"/>
-              <w:jc w:val="center"/>
-              <w:rPr>
-                <w:rFonts w:ascii="SimSun" w:hAnsi="SimSun" w:cs="SimSun"/>
-                <w:b/>
-                <w:sz w:val="22"/>
-              </w:rPr>
-            </w:pPr>
-            <w:r>
-              <w:rPr>
-                <w:rFonts w:ascii="SimSun" w:hAnsi="SimSun" w:cs="SimSun"/>
-                <w:b/>
-                <w:kern w:val="0"/>
-                <w:sz w:val="22"/>
-              </w:rPr>
-              <w:t>计算机程度</w:t>
-            </w:r>
-          </w:p>
-        </w:tc>
-        <w:tc>
-          <w:tcPr>
-            <w:tcW w:w="3167" w:type="dxa"/>
-            <w:gridSpan w:val="4"/>
-            <w:tcBorders>
-              <w:top w:val="dashSmallGap" w:color="00000A" w:sz="4" w:space="0"/>
-              <w:left w:val="dashSmallGap" w:color="00000A" w:sz="4" w:space="0"/>
-              <w:bottom w:val="dashSmallGap" w:color="00000A" w:sz="4" w:space="0"/>
-              <w:right w:val="single" w:color="00000A" w:sz="12" w:space="0"/>
-            </w:tcBorders>
-            <w:shd w:val="clear" w:color="auto" w:fill="auto"/>
-            <w:vAlign w:val="center"/>
-          </w:tcPr>
-          <w:p>
-            <w:pPr>
-              <w:widowControl w:val="0"/>
-              <w:jc w:val="center"/>
-              <w:rPr>
-                <w:rFonts w:ascii="SimSun" w:hAnsi="SimSun" w:cs="SimSun"/>
-                <w:sz w:val="22"/>
-              </w:rPr>
-            </w:pPr>
-            <w:r>
-              <w:rPr>
-                <w:rFonts w:ascii="SimSun" w:hAnsi="SimSun" w:cs="SimSun"/>
-                <w:kern w:val="0"/>
-                <w:sz w:val="22"/>
-              </w:rPr>
-              <w:t>精通</w:t>
-            </w:r>
+                <w:rFonts w:eastAsia="SimSun"/>
+                <w:lang w:val="en-US" w:eastAsia="zh-CN"/>
+              </w:rPr>
+            </w:pPr>
           </w:p>
         </w:tc>
       </w:tr>
@@ -3134,6 +3122,187 @@
         <w:tc>
           <w:tcPr>
             <w:tcW w:w="1560" w:type="dxa"/>
+            <w:tcBorders>
+              <w:top w:val="dashSmallGap" w:color="00000A" w:sz="4" w:space="0"/>
+              <w:left w:val="single" w:color="00000A" w:sz="12" w:space="0"/>
+              <w:bottom w:val="dashSmallGap" w:color="00000A" w:sz="4" w:space="0"/>
+              <w:right w:val="dashSmallGap" w:color="00000A" w:sz="4" w:space="0"/>
+            </w:tcBorders>
+            <w:shd w:val="clear" w:color="auto" w:fill="F2F2F2"/>
+            <w:vAlign w:val="center"/>
+          </w:tcPr>
+          <w:p>
+            <w:pPr>
+              <w:widowControl w:val="0"/>
+              <w:jc w:val="center"/>
+              <w:rPr>
+                <w:rFonts w:ascii="SimSun" w:hAnsi="SimSun" w:cs="SimSun"/>
+                <w:b/>
+                <w:sz w:val="22"/>
+              </w:rPr>
+            </w:pPr>
+            <w:r>
+              <w:rPr>
+                <w:rFonts w:ascii="SimSun" w:hAnsi="SimSun" w:cs="SimSun"/>
+                <w:b/>
+                <w:kern w:val="0"/>
+                <w:sz w:val="22"/>
+              </w:rPr>
+              <w:t>外语水平</w:t>
+            </w:r>
+          </w:p>
+        </w:tc>
+        <w:tc>
+          <w:tcPr>
+            <w:tcW w:w="3540" w:type="dxa"/>
+            <w:gridSpan w:val="6"/>
+            <w:tcBorders>
+              <w:top w:val="dashSmallGap" w:color="00000A" w:sz="4" w:space="0"/>
+              <w:left w:val="dashSmallGap" w:color="00000A" w:sz="4" w:space="0"/>
+              <w:bottom w:val="dashSmallGap" w:color="00000A" w:sz="4" w:space="0"/>
+              <w:right w:val="dashSmallGap" w:color="00000A" w:sz="4" w:space="0"/>
+            </w:tcBorders>
+            <w:shd w:val="clear" w:color="auto" w:fill="auto"/>
+            <w:vAlign w:val="center"/>
+          </w:tcPr>
+          <w:p>
+            <w:pPr>
+              <w:widowControl w:val="0"/>
+              <w:jc w:val="left"/>
+              <w:rPr>
+                <w:rFonts w:ascii="SimSun" w:hAnsi="SimSun" w:cs="SimSun"/>
+                <w:sz w:val="22"/>
+              </w:rPr>
+            </w:pPr>
+            <w:r>
+              <w:rPr>
+                <w:rFonts w:ascii="SimSun" w:hAnsi="SimSun" w:cs="SimSun"/>
+                <w:kern w:val="0"/>
+                <w:sz w:val="22"/>
+              </w:rPr>
+              <w:t>俄语、白俄语：母语</w:t>
+            </w:r>
+          </w:p>
+          <w:p>
+            <w:pPr>
+              <w:widowControl w:val="0"/>
+              <w:jc w:val="left"/>
+              <w:rPr>
+                <w:rFonts w:ascii="SimSun" w:hAnsi="SimSun" w:cs="SimSun"/>
+                <w:sz w:val="22"/>
+              </w:rPr>
+            </w:pPr>
+            <w:r>
+              <w:rPr>
+                <w:rFonts w:ascii="SimSun" w:hAnsi="SimSun" w:cs="SimSun"/>
+                <w:kern w:val="0"/>
+                <w:sz w:val="22"/>
+              </w:rPr>
+              <w:t>汉语：听说（熟练），读写（熟练）</w:t>
+            </w:r>
+          </w:p>
+          <w:p>
+            <w:pPr>
+              <w:widowControl w:val="0"/>
+              <w:jc w:val="left"/>
+              <w:rPr>
+                <w:rFonts w:ascii="SimSun" w:hAnsi="SimSun" w:cs="SimSun"/>
+                <w:sz w:val="22"/>
+              </w:rPr>
+            </w:pPr>
+            <w:r>
+              <w:rPr>
+                <w:rFonts w:ascii="SimSun" w:hAnsi="SimSun" w:cs="SimSun"/>
+                <w:kern w:val="0"/>
+                <w:sz w:val="22"/>
+              </w:rPr>
+              <w:t>英语：听说（熟练），读写（熟练）</w:t>
+            </w:r>
+          </w:p>
+        </w:tc>
+        <w:tc>
+          <w:tcPr>
+            <w:tcW w:w="2171" w:type="dxa"/>
+            <w:gridSpan w:val="5"/>
+            <w:tcBorders>
+              <w:top w:val="dashSmallGap" w:color="00000A" w:sz="4" w:space="0"/>
+              <w:left w:val="dashSmallGap" w:color="00000A" w:sz="4" w:space="0"/>
+              <w:bottom w:val="dashSmallGap" w:color="00000A" w:sz="4" w:space="0"/>
+              <w:right w:val="dashSmallGap" w:color="00000A" w:sz="4" w:space="0"/>
+            </w:tcBorders>
+            <w:shd w:val="clear" w:color="auto" w:fill="F2F2F2"/>
+            <w:vAlign w:val="center"/>
+          </w:tcPr>
+          <w:p>
+            <w:pPr>
+              <w:widowControl w:val="0"/>
+              <w:jc w:val="center"/>
+              <w:rPr>
+                <w:rFonts w:ascii="SimSun" w:hAnsi="SimSun" w:cs="SimSun"/>
+                <w:b/>
+                <w:sz w:val="22"/>
+              </w:rPr>
+            </w:pPr>
+            <w:r>
+              <w:rPr>
+                <w:rFonts w:ascii="SimSun" w:hAnsi="SimSun" w:cs="SimSun"/>
+                <w:b/>
+                <w:kern w:val="0"/>
+                <w:sz w:val="22"/>
+              </w:rPr>
+              <w:t>计算机程度</w:t>
+            </w:r>
+          </w:p>
+        </w:tc>
+        <w:tc>
+          <w:tcPr>
+            <w:tcW w:w="3167" w:type="dxa"/>
+            <w:gridSpan w:val="4"/>
+            <w:tcBorders>
+              <w:top w:val="dashSmallGap" w:color="00000A" w:sz="4" w:space="0"/>
+              <w:left w:val="dashSmallGap" w:color="00000A" w:sz="4" w:space="0"/>
+              <w:bottom w:val="dashSmallGap" w:color="00000A" w:sz="4" w:space="0"/>
+              <w:right w:val="single" w:color="00000A" w:sz="12" w:space="0"/>
+            </w:tcBorders>
+            <w:shd w:val="clear" w:color="auto" w:fill="auto"/>
+            <w:vAlign w:val="center"/>
+          </w:tcPr>
+          <w:p>
+            <w:pPr>
+              <w:widowControl w:val="0"/>
+              <w:jc w:val="center"/>
+              <w:rPr>
+                <w:rFonts w:ascii="SimSun" w:hAnsi="SimSun" w:cs="SimSun"/>
+                <w:sz w:val="22"/>
+              </w:rPr>
+            </w:pPr>
+            <w:r>
+              <w:rPr>
+                <w:rFonts w:ascii="SimSun" w:hAnsi="SimSun" w:cs="SimSun"/>
+                <w:kern w:val="0"/>
+                <w:sz w:val="22"/>
+              </w:rPr>
+              <w:t>精通</w:t>
+            </w:r>
+          </w:p>
+        </w:tc>
+      </w:tr>
+      <w:tr>
+        <w:tblPrEx>
+          <w:tblCellMar>
+            <w:top w:w="0" w:type="dxa"/>
+            <w:left w:w="15" w:type="dxa"/>
+            <w:bottom w:w="0" w:type="dxa"/>
+            <w:right w:w="15" w:type="dxa"/>
+          </w:tblCellMar>
+        </w:tblPrEx>
+        <w:trPr>
+          <w:trHeight w:val="567" w:hRule="atLeast"/>
+          <w:jc w:val="center"/>
+        </w:trPr>
+        <w:tc>
+          <w:tcPr>
+            <w:tcW w:w="1560" w:type="dxa"/>
             <w:vMerge w:val="restart"/>
             <w:tcBorders>
               <w:top w:val="dashSmallGap" w:color="00000A" w:sz="4" w:space="0"/>
@@ -3355,9 +3524,9 @@
           <w:p>
             <w:pPr>
               <w:widowControl w:val="0"/>
-              <w:jc w:val="center"/>
-              <w:rPr>
-                <w:rFonts w:ascii="SimSun" w:hAnsi="SimSun" w:eastAsia="SimSun" w:cs="SimSun"/>
+              <w:jc w:val="right"/>
+              <w:rPr>
+                <w:rFonts w:hint="eastAsia" w:ascii="SimSun" w:hAnsi="SimSun" w:eastAsia="SimSun" w:cs="SimSun"/>
                 <w:b/>
                 <w:color w:val="00000A"/>
                 <w:kern w:val="0"/>
@@ -3398,7 +3567,7 @@
                 <w:sz w:val="22"/>
                 <w:lang w:val="en-US"/>
               </w:rPr>
-              <w:t>5</w:t>
+              <w:t>05</w:t>
             </w:r>
             <w:r>
               <w:rPr>
@@ -3406,7 +3575,16 @@
                 <w:kern w:val="0"/>
                 <w:sz w:val="22"/>
               </w:rPr>
-              <w:t>—现在</w:t>
+              <w:t>—</w:t>
+            </w:r>
+            <w:r>
+              <w:rPr>
+                <w:rFonts w:hint="eastAsia" w:ascii="SimSun" w:hAnsi="SimSun"/>
+                <w:kern w:val="0"/>
+                <w:sz w:val="22"/>
+                <w:lang w:eastAsia="zh-CN"/>
+              </w:rPr>
+              <w:t>至今</w:t>
             </w:r>
           </w:p>
         </w:tc>
@@ -3583,7 +3761,7 @@
                 <w:kern w:val="0"/>
                 <w:sz w:val="22"/>
               </w:rPr>
-              <w:t>2020/4—202</w:t>
+              <w:t>2020/</w:t>
             </w:r>
             <w:r>
               <w:rPr>
@@ -3592,6 +3770,23 @@
                 <w:sz w:val="22"/>
                 <w:lang w:val="en-US"/>
               </w:rPr>
+              <w:t>0</w:t>
+            </w:r>
+            <w:r>
+              <w:rPr>
+                <w:rFonts w:ascii="SimSun" w:hAnsi="SimSun"/>
+                <w:kern w:val="0"/>
+                <w:sz w:val="22"/>
+              </w:rPr>
+              <w:t>4—202</w:t>
+            </w:r>
+            <w:r>
+              <w:rPr>
+                <w:rFonts w:hint="default" w:ascii="SimSun" w:hAnsi="SimSun"/>
+                <w:kern w:val="0"/>
+                <w:sz w:val="22"/>
+                <w:lang w:val="en-US"/>
+              </w:rPr>
               <w:t>3</w:t>
             </w:r>
             <w:r>
@@ -3609,7 +3804,7 @@
                 <w:sz w:val="22"/>
                 <w:lang w:val="en-US"/>
               </w:rPr>
-              <w:t>5</w:t>
+              <w:t>05</w:t>
             </w:r>
           </w:p>
         </w:tc>
@@ -3771,7 +3966,41 @@
                 <w:kern w:val="0"/>
                 <w:sz w:val="22"/>
               </w:rPr>
-              <w:t>2019/5—2020/4</w:t>
+              <w:t>2019/</w:t>
+            </w:r>
+            <w:r>
+              <w:rPr>
+                <w:rFonts w:hint="default" w:ascii="SimSun" w:hAnsi="SimSun"/>
+                <w:kern w:val="0"/>
+                <w:sz w:val="22"/>
+                <w:lang w:val="en-US"/>
+              </w:rPr>
+              <w:t>0</w:t>
+            </w:r>
+            <w:r>
+              <w:rPr>
+                <w:rFonts w:ascii="SimSun" w:hAnsi="SimSun"/>
+                <w:kern w:val="0"/>
+                <w:sz w:val="22"/>
+              </w:rPr>
+              <w:t>5—2020/</w:t>
+            </w:r>
+            <w:r>
+              <w:rPr>
+                <w:rFonts w:hint="default" w:ascii="SimSun" w:hAnsi="SimSun"/>
+                <w:kern w:val="0"/>
+                <w:sz w:val="22"/>
+                <w:lang w:val="en-US"/>
+              </w:rPr>
+              <w:t>0</w:t>
+            </w:r>
+            <w:r>
+              <w:rPr>
+                <w:rFonts w:ascii="SimSun" w:hAnsi="SimSun"/>
+                <w:kern w:val="0"/>
+                <w:sz w:val="22"/>
+              </w:rPr>
+              <w:t>4</w:t>
             </w:r>
           </w:p>
         </w:tc>
@@ -3929,7 +4158,41 @@
                 <w:kern w:val="0"/>
                 <w:sz w:val="22"/>
               </w:rPr>
-              <w:t>2016/9—2019/5</w:t>
+              <w:t>2016/</w:t>
+            </w:r>
+            <w:r>
+              <w:rPr>
+                <w:rFonts w:hint="default" w:ascii="SimSun" w:hAnsi="SimSun"/>
+                <w:kern w:val="0"/>
+                <w:sz w:val="22"/>
+                <w:lang w:val="en-US"/>
+              </w:rPr>
+              <w:t>0</w:t>
+            </w:r>
+            <w:r>
+              <w:rPr>
+                <w:rFonts w:ascii="SimSun" w:hAnsi="SimSun"/>
+                <w:kern w:val="0"/>
+                <w:sz w:val="22"/>
+              </w:rPr>
+              <w:t>9—2019/</w:t>
+            </w:r>
+            <w:r>
+              <w:rPr>
+                <w:rFonts w:hint="default" w:ascii="SimSun" w:hAnsi="SimSun"/>
+                <w:kern w:val="0"/>
+                <w:sz w:val="22"/>
+                <w:lang w:val="en-US"/>
+              </w:rPr>
+              <w:t>0</w:t>
+            </w:r>
+            <w:r>
+              <w:rPr>
+                <w:rFonts w:ascii="SimSun" w:hAnsi="SimSun"/>
+                <w:kern w:val="0"/>
+                <w:sz w:val="22"/>
+              </w:rPr>
+              <w:t>5</w:t>
             </w:r>
           </w:p>
         </w:tc>
@@ -4080,7 +4343,41 @@
                 <w:kern w:val="0"/>
                 <w:sz w:val="22"/>
               </w:rPr>
-              <w:t>2015/7—2016/9</w:t>
+              <w:t>2015/</w:t>
+            </w:r>
+            <w:r>
+              <w:rPr>
+                <w:rFonts w:hint="default" w:ascii="SimSun" w:hAnsi="SimSun"/>
+                <w:kern w:val="0"/>
+                <w:sz w:val="22"/>
+                <w:lang w:val="en-US"/>
+              </w:rPr>
+              <w:t>0</w:t>
+            </w:r>
+            <w:r>
+              <w:rPr>
+                <w:rFonts w:ascii="SimSun" w:hAnsi="SimSun"/>
+                <w:kern w:val="0"/>
+                <w:sz w:val="22"/>
+              </w:rPr>
+              <w:t>7—2016/</w:t>
+            </w:r>
+            <w:r>
+              <w:rPr>
+                <w:rFonts w:hint="default" w:ascii="SimSun" w:hAnsi="SimSun"/>
+                <w:kern w:val="0"/>
+                <w:sz w:val="22"/>
+                <w:lang w:val="en-US"/>
+              </w:rPr>
+              <w:t>0</w:t>
+            </w:r>
+            <w:r>
+              <w:rPr>
+                <w:rFonts w:ascii="SimSun" w:hAnsi="SimSun"/>
+                <w:kern w:val="0"/>
+                <w:sz w:val="22"/>
+              </w:rPr>
+              <w:t>9</w:t>
             </w:r>
           </w:p>
         </w:tc>
@@ -4230,7 +4527,41 @@
                 <w:kern w:val="0"/>
                 <w:sz w:val="22"/>
               </w:rPr>
-              <w:t>2014/6—2015/6</w:t>
+              <w:t>2014/</w:t>
+            </w:r>
+            <w:r>
+              <w:rPr>
+                <w:rFonts w:hint="default" w:ascii="SimSun" w:hAnsi="SimSun" w:cs="SimSun"/>
+                <w:kern w:val="0"/>
+                <w:sz w:val="22"/>
+                <w:lang w:val="en-US"/>
+              </w:rPr>
+              <w:t>0</w:t>
+            </w:r>
+            <w:r>
+              <w:rPr>
+                <w:rFonts w:ascii="SimSun" w:hAnsi="SimSun" w:cs="SimSun"/>
+                <w:kern w:val="0"/>
+                <w:sz w:val="22"/>
+              </w:rPr>
+              <w:t>6—2015/</w:t>
+            </w:r>
+            <w:r>
+              <w:rPr>
+                <w:rFonts w:hint="default" w:ascii="SimSun" w:hAnsi="SimSun" w:cs="SimSun"/>
+                <w:kern w:val="0"/>
+                <w:sz w:val="22"/>
+                <w:lang w:val="en-US"/>
+              </w:rPr>
+              <w:t>0</w:t>
+            </w:r>
+            <w:r>
+              <w:rPr>
+                <w:rFonts w:ascii="SimSun" w:hAnsi="SimSun" w:cs="SimSun"/>
+                <w:kern w:val="0"/>
+                <w:sz w:val="22"/>
+              </w:rPr>
+              <w:t>6</w:t>
             </w:r>
           </w:p>
         </w:tc>
@@ -4398,7 +4729,24 @@
                 <w:kern w:val="0"/>
                 <w:sz w:val="22"/>
               </w:rPr>
-              <w:t>2013/11—2014/5</w:t>
+              <w:t>2013/11—2014/</w:t>
+            </w:r>
+            <w:r>
+              <w:rPr>
+                <w:rFonts w:hint="default" w:ascii="SimSun" w:hAnsi="SimSun" w:cs="SimSun"/>
+                <w:kern w:val="0"/>
+                <w:sz w:val="22"/>
+                <w:lang w:val="en-US"/>
+              </w:rPr>
+              <w:t>0</w:t>
+            </w:r>
+            <w:r>
+              <w:rPr>
+                <w:rFonts w:ascii="SimSun" w:hAnsi="SimSun" w:cs="SimSun"/>
+                <w:kern w:val="0"/>
+                <w:sz w:val="22"/>
+              </w:rPr>
+              <w:t>5</w:t>
             </w:r>
           </w:p>
         </w:tc>
@@ -4590,7 +4938,41 @@
                 <w:kern w:val="0"/>
                 <w:sz w:val="22"/>
               </w:rPr>
-              <w:t>2013/5—2013/9</w:t>
+              <w:t>2013/</w:t>
+            </w:r>
+            <w:r>
+              <w:rPr>
+                <w:rFonts w:hint="default" w:ascii="SimSun" w:hAnsi="SimSun" w:cs="SimSun"/>
+                <w:kern w:val="0"/>
+                <w:sz w:val="22"/>
+                <w:lang w:val="en-US"/>
+              </w:rPr>
+              <w:t>0</w:t>
+            </w:r>
+            <w:r>
+              <w:rPr>
+                <w:rFonts w:ascii="SimSun" w:hAnsi="SimSun" w:cs="SimSun"/>
+                <w:kern w:val="0"/>
+                <w:sz w:val="22"/>
+              </w:rPr>
+              <w:t>5—2013/</w:t>
+            </w:r>
+            <w:r>
+              <w:rPr>
+                <w:rFonts w:hint="default" w:ascii="SimSun" w:hAnsi="SimSun" w:cs="SimSun"/>
+                <w:kern w:val="0"/>
+                <w:sz w:val="22"/>
+                <w:lang w:val="en-US"/>
+              </w:rPr>
+              <w:t>0</w:t>
+            </w:r>
+            <w:r>
+              <w:rPr>
+                <w:rFonts w:ascii="SimSun" w:hAnsi="SimSun" w:cs="SimSun"/>
+                <w:kern w:val="0"/>
+                <w:sz w:val="22"/>
+              </w:rPr>
+              <w:t>9</w:t>
             </w:r>
           </w:p>
         </w:tc>
@@ -4751,7 +5133,41 @@
                 <w:kern w:val="0"/>
                 <w:sz w:val="22"/>
               </w:rPr>
-              <w:t>2012/6—2013/2</w:t>
+              <w:t>2012/</w:t>
+            </w:r>
+            <w:r>
+              <w:rPr>
+                <w:rFonts w:hint="default" w:ascii="SimSun" w:hAnsi="SimSun" w:cs="SimSun"/>
+                <w:kern w:val="0"/>
+                <w:sz w:val="22"/>
+                <w:lang w:val="en-US"/>
+              </w:rPr>
+              <w:t>0</w:t>
+            </w:r>
+            <w:r>
+              <w:rPr>
+                <w:rFonts w:ascii="SimSun" w:hAnsi="SimSun" w:cs="SimSun"/>
+                <w:kern w:val="0"/>
+                <w:sz w:val="22"/>
+              </w:rPr>
+              <w:t>6—2013/</w:t>
+            </w:r>
+            <w:r>
+              <w:rPr>
+                <w:rFonts w:hint="default" w:ascii="SimSun" w:hAnsi="SimSun" w:cs="SimSun"/>
+                <w:kern w:val="0"/>
+                <w:sz w:val="22"/>
+                <w:lang w:val="en-US"/>
+              </w:rPr>
+              <w:t>0</w:t>
+            </w:r>
+            <w:r>
+              <w:rPr>
+                <w:rFonts w:ascii="SimSun" w:hAnsi="SimSun" w:cs="SimSun"/>
+                <w:kern w:val="0"/>
+                <w:sz w:val="22"/>
+              </w:rPr>
+              <w:t>2</w:t>
             </w:r>
           </w:p>
         </w:tc>
@@ -4960,7 +5376,41 @@
                 <w:kern w:val="0"/>
                 <w:sz w:val="22"/>
               </w:rPr>
-              <w:t>2010/4—2012/3</w:t>
+              <w:t>2010/</w:t>
+            </w:r>
+            <w:r>
+              <w:rPr>
+                <w:rFonts w:hint="default" w:ascii="SimSun" w:hAnsi="SimSun" w:cs="SimSun"/>
+                <w:kern w:val="0"/>
+                <w:sz w:val="22"/>
+                <w:lang w:val="en-US"/>
+              </w:rPr>
+              <w:t>0</w:t>
+            </w:r>
+            <w:r>
+              <w:rPr>
+                <w:rFonts w:ascii="SimSun" w:hAnsi="SimSun" w:cs="SimSun"/>
+                <w:kern w:val="0"/>
+                <w:sz w:val="22"/>
+              </w:rPr>
+              <w:t>4—2012/</w:t>
+            </w:r>
+            <w:r>
+              <w:rPr>
+                <w:rFonts w:hint="default" w:ascii="SimSun" w:hAnsi="SimSun" w:cs="SimSun"/>
+                <w:kern w:val="0"/>
+                <w:sz w:val="22"/>
+                <w:lang w:val="en-US"/>
+              </w:rPr>
+              <w:t>0</w:t>
+            </w:r>
+            <w:r>
+              <w:rPr>
+                <w:rFonts w:ascii="SimSun" w:hAnsi="SimSun" w:cs="SimSun"/>
+                <w:kern w:val="0"/>
+                <w:sz w:val="22"/>
+              </w:rPr>
+              <w:t>3</w:t>
             </w:r>
           </w:p>
         </w:tc>
@@ -5184,7 +5634,24 @@
                 <w:kern w:val="0"/>
                 <w:sz w:val="22"/>
               </w:rPr>
-              <w:t>武汉 (现在是</w:t>
+              <w:t>武汉 (</w:t>
+            </w:r>
+            <w:r>
+              <w:rPr>
+                <w:rFonts w:hint="eastAsia" w:ascii="SimSun" w:hAnsi="SimSun" w:cs="SimSun"/>
+                <w:kern w:val="0"/>
+                <w:sz w:val="22"/>
+                <w:lang w:eastAsia="zh-CN"/>
+              </w:rPr>
+              <w:t>至今</w:t>
+            </w:r>
+            <w:r>
+              <w:rPr>
+                <w:rFonts w:ascii="SimSun" w:hAnsi="SimSun" w:cs="SimSun"/>
+                <w:kern w:val="0"/>
+                <w:sz w:val="22"/>
+              </w:rPr>
+              <w:t>是</w:t>
             </w:r>
             <w:r>
               <w:rPr>
@@ -5348,7 +5815,41 @@
                 <w:kern w:val="0"/>
                 <w:sz w:val="22"/>
               </w:rPr>
-              <w:t>2002/8—2007/5</w:t>
+              <w:t>2002/</w:t>
+            </w:r>
+            <w:r>
+              <w:rPr>
+                <w:rFonts w:hint="default" w:ascii="SimSun" w:hAnsi="SimSun" w:cs="SimSun"/>
+                <w:kern w:val="0"/>
+                <w:sz w:val="22"/>
+                <w:lang w:val="en-US"/>
+              </w:rPr>
+              <w:t>0</w:t>
+            </w:r>
+            <w:r>
+              <w:rPr>
+                <w:rFonts w:ascii="SimSun" w:hAnsi="SimSun" w:cs="SimSun"/>
+                <w:kern w:val="0"/>
+                <w:sz w:val="22"/>
+              </w:rPr>
+              <w:t>8—2007/</w:t>
+            </w:r>
+            <w:r>
+              <w:rPr>
+                <w:rFonts w:hint="default" w:ascii="SimSun" w:hAnsi="SimSun" w:cs="SimSun"/>
+                <w:kern w:val="0"/>
+                <w:sz w:val="22"/>
+                <w:lang w:val="en-US"/>
+              </w:rPr>
+              <w:t>0</w:t>
+            </w:r>
+            <w:r>
+              <w:rPr>
+                <w:rFonts w:ascii="SimSun" w:hAnsi="SimSun" w:cs="SimSun"/>
+                <w:kern w:val="0"/>
+                <w:sz w:val="22"/>
+              </w:rPr>
+              <w:t>5</w:t>
             </w:r>
           </w:p>
         </w:tc>
@@ -6246,7 +6747,7 @@
               <w:widowControl w:val="0"/>
               <w:jc w:val="center"/>
               <w:rPr>
-                <w:rFonts w:hint="default" w:ascii="SimSun" w:hAnsi="SimSun" w:eastAsia="SimSun" w:cs="SimSun"/>
+                <w:rFonts w:hint="eastAsia" w:ascii="SimSun" w:hAnsi="SimSun" w:eastAsia="SimSun" w:cs="SimSun"/>
                 <w:b/>
                 <w:color w:val="00000A"/>
                 <w:kern w:val="0"/>
@@ -6282,6 +6783,15 @@
             </w:r>
             <w:r>
               <w:rPr>
+                <w:rFonts w:hint="eastAsia" w:ascii="SimSun" w:hAnsi="SimSun" w:cs="SimSun"/>
+                <w:kern w:val="0"/>
+                <w:sz w:val="22"/>
+                <w:lang w:val="en-US" w:eastAsia="zh-CN"/>
+              </w:rPr>
+              <w:t>0</w:t>
+            </w:r>
+            <w:r>
+              <w:rPr>
                 <w:rFonts w:hint="default" w:ascii="SimSun" w:hAnsi="SimSun" w:cs="SimSun"/>
                 <w:kern w:val="0"/>
                 <w:sz w:val="22"/>
@@ -6295,7 +6805,16 @@
                 <w:kern w:val="0"/>
                 <w:sz w:val="22"/>
               </w:rPr>
-              <w:t>—现在</w:t>
+              <w:t>—</w:t>
+            </w:r>
+            <w:r>
+              <w:rPr>
+                <w:rFonts w:hint="eastAsia" w:ascii="SimSun" w:hAnsi="SimSun" w:cs="SimSun"/>
+                <w:kern w:val="0"/>
+                <w:sz w:val="22"/>
+                <w:lang w:eastAsia="zh-CN"/>
+              </w:rPr>
+              <w:t>至今</w:t>
             </w:r>
           </w:p>
         </w:tc>
@@ -6516,7 +7035,7 @@
                 <w:kern w:val="0"/>
                 <w:lang w:val="en-US"/>
               </w:rPr>
-              <w:t>Echarts</w:t>
+              <w:t>ECharts</w:t>
             </w:r>
           </w:p>
           <w:p>
@@ -6532,14 +7051,14 @@
               <w:rPr>
                 <w:kern w:val="0"/>
               </w:rPr>
-              <w:t>GIS框架: Cesium js</w:t>
+              <w:t xml:space="preserve">GIS框架: </w:t>
             </w:r>
             <w:r>
               <w:rPr>
                 <w:kern w:val="0"/>
                 <w:lang w:val="en-US"/>
               </w:rPr>
-              <w:t xml:space="preserve">, </w:t>
+              <w:t xml:space="preserve">CesiumJS, </w:t>
             </w:r>
           </w:p>
           <w:p>
@@ -6599,7 +7118,7 @@
                 <w:kern w:val="0"/>
                 <w:lang w:val="en-US" w:eastAsia="zh-CN"/>
               </w:rPr>
-              <w:t>Cursor, Windsurf</w:t>
+              <w:t>Cursor, QwenWork, WorBuddy</w:t>
             </w:r>
           </w:p>
           <w:p>
@@ -7187,7 +7706,29 @@
                 <w:szCs w:val="22"/>
                 <w:lang w:val="en-US" w:eastAsia="zh-CN" w:bidi="ar-SA"/>
               </w:rPr>
-              <w:t>4、战略愿景：仪表盘作为数据呈现的主要形式，将逐渐让位于更加分布式和多模态的信息交互方式；架构被奠定为数据呈现的基础，这种呈现在未来可能成为环境的一部分，并根据用户的意图和上下文进行调整，而不仅仅显示在屏幕上。</w:t>
+              <w:t>4、战略愿景：仪表盘作为数据呈现的主要形式，将逐渐让位于更加分布式和多模态的信息交互方式；架构被奠定为数据呈现的基础，这种呈</w:t>
+            </w:r>
+            <w:r>
+              <w:rPr>
+                <w:rFonts w:hint="eastAsia" w:cs="DejaVu Serif"/>
+                <w:color w:val="00000A"/>
+                <w:kern w:val="0"/>
+                <w:sz w:val="21"/>
+                <w:szCs w:val="22"/>
+                <w:lang w:val="en-US" w:eastAsia="zh-CN" w:bidi="ar-SA"/>
+              </w:rPr>
+              <w:t>至今</w:t>
+            </w:r>
+            <w:r>
+              <w:rPr>
+                <w:rFonts w:ascii="Calibri" w:hAnsi="Calibri" w:eastAsia="SimSun" w:cs="DejaVu Serif"/>
+                <w:color w:val="00000A"/>
+                <w:kern w:val="0"/>
+                <w:sz w:val="21"/>
+                <w:szCs w:val="22"/>
+                <w:lang w:val="en-US" w:eastAsia="zh-CN" w:bidi="ar-SA"/>
+              </w:rPr>
+              <w:t>未来可能成为环境的一部分，并根据用户的意图和上下文进行调整，而不仅仅显示在屏幕上。</w:t>
             </w:r>
           </w:p>
           <w:p>
@@ -7403,6 +7944,99 @@
                 <w:lang w:val="en-US" w:eastAsia="zh-CN" w:bidi="ar-SA"/>
               </w:rPr>
             </w:pPr>
+          </w:p>
+        </w:tc>
+      </w:tr>
+      <w:tr>
+        <w:tblPrEx>
+          <w:tblCellMar>
+            <w:top w:w="0" w:type="dxa"/>
+            <w:left w:w="15" w:type="dxa"/>
+            <w:bottom w:w="0" w:type="dxa"/>
+            <w:right w:w="15" w:type="dxa"/>
+          </w:tblCellMar>
+        </w:tblPrEx>
+        <w:trPr>
+          <w:trHeight w:val="656" w:hRule="atLeast"/>
+          <w:jc w:val="center"/>
+        </w:trPr>
+        <w:tc>
+          <w:tcPr>
+            <w:tcW w:w="2087" w:type="dxa"/>
+            <w:gridSpan w:val="2"/>
+            <w:tcBorders>
+              <w:top w:val="dashSmallGap" w:color="00000A" w:sz="4" w:space="0"/>
+              <w:left w:val="single" w:color="00000A" w:sz="12" w:space="0"/>
+              <w:bottom w:val="dashSmallGap" w:color="00000A" w:sz="4" w:space="0"/>
+              <w:right w:val="single" w:color="00000A" w:sz="12" w:space="0"/>
+            </w:tcBorders>
+            <w:shd w:val="clear" w:color="auto" w:fill="auto"/>
+            <w:vAlign w:val="center"/>
+          </w:tcPr>
+          <w:p>
+            <w:pPr>
+              <w:pStyle w:val="29"/>
+              <w:keepNext w:val="0"/>
+              <w:keepLines w:val="0"/>
+              <w:widowControl/>
+              <w:suppressLineNumbers w:val="0"/>
+              <w:jc w:val="center"/>
+              <w:rPr>
+                <w:b/>
+                <w:bCs/>
+                <w:sz w:val="22"/>
+                <w:szCs w:val="22"/>
+              </w:rPr>
+            </w:pPr>
+            <w:r>
+              <w:rPr>
+                <w:b/>
+                <w:bCs/>
+                <w:kern w:val="0"/>
+              </w:rPr>
+              <w:t>责任描述</w:t>
+            </w:r>
+          </w:p>
+        </w:tc>
+        <w:tc>
+          <w:tcPr>
+            <w:tcW w:w="8351" w:type="dxa"/>
+            <w:gridSpan w:val="14"/>
+            <w:tcBorders>
+              <w:top w:val="dashSmallGap" w:color="00000A" w:sz="4" w:space="0"/>
+              <w:left w:val="single" w:color="00000A" w:sz="12" w:space="0"/>
+              <w:bottom w:val="dashSmallGap" w:color="00000A" w:sz="4" w:space="0"/>
+              <w:right w:val="single" w:color="00000A" w:sz="12" w:space="0"/>
+            </w:tcBorders>
+            <w:shd w:val="clear" w:color="auto" w:fill="auto"/>
+            <w:vAlign w:val="center"/>
+          </w:tcPr>
+          <w:p>
+            <w:pPr>
+              <w:widowControl w:val="0"/>
+              <w:jc w:val="both"/>
+              <w:rPr>
+                <w:rFonts w:ascii="Calibri" w:hAnsi="Calibri" w:eastAsia="SimSun" w:cs="DejaVu Serif"/>
+                <w:color w:val="00000A"/>
+                <w:kern w:val="0"/>
+                <w:sz w:val="21"/>
+                <w:szCs w:val="22"/>
+                <w:lang w:val="en-US" w:eastAsia="zh-CN" w:bidi="ar-SA"/>
+              </w:rPr>
+            </w:pPr>
+            <w:r>
+              <w:rPr>
+                <w:rFonts w:ascii="Calibri" w:hAnsi="Calibri" w:eastAsia="SimSun" w:cs="DejaVu Serif"/>
+                <w:color w:val="00000A"/>
+                <w:kern w:val="0"/>
+                <w:sz w:val="21"/>
+                <w:szCs w:val="22"/>
+                <w:lang w:val="en-US" w:eastAsia="zh-CN" w:bidi="ar-SA"/>
+              </w:rPr>
+              <w:t>独立开发者/创作者</w:t>
+            </w:r>
+            <w:bookmarkStart w:id="1" w:name="_GoBack"/>
+            <w:bookmarkEnd w:id="1"/>
           </w:p>
         </w:tc>
       </w:tr>
@@ -7832,7 +8466,7 @@
                     <w:widowControl w:val="0"/>
                     <w:jc w:val="center"/>
                     <w:rPr>
-                      <w:rFonts w:hint="default" w:ascii="SimSun" w:hAnsi="SimSun" w:eastAsia="SimSun" w:cs="SimSun"/>
+                      <w:rFonts w:hint="eastAsia" w:ascii="SimSun" w:hAnsi="SimSun" w:eastAsia="SimSun" w:cs="SimSun"/>
                       <w:b/>
                       <w:color w:val="00000A"/>
                       <w:kern w:val="0"/>
@@ -7847,7 +8481,33 @@
                       <w:kern w:val="0"/>
                       <w:sz w:val="22"/>
                     </w:rPr>
-                    <w:t>2023/5—现在</w:t>
+                    <w:t>2023/</w:t>
+                  </w:r>
+                  <w:r>
+                    <w:rPr>
+                      <w:rFonts w:hint="eastAsia" w:ascii="SimSun" w:hAnsi="SimSun" w:cs="SimSun"/>
+                      <w:kern w:val="0"/>
+                      <w:sz w:val="22"/>
+                      <w:lang w:val="en-US" w:eastAsia="zh-CN"/>
+                    </w:rPr>
+                    <w:t>0</w:t>
+                  </w:r>
+                  <w:r>
+                    <w:rPr>
+                      <w:rFonts w:hint="default" w:ascii="SimSun" w:hAnsi="SimSun" w:cs="SimSun"/>
+                      <w:kern w:val="0"/>
+                      <w:sz w:val="22"/>
+                    </w:rPr>
+                    <w:t>5—</w:t>
+                  </w:r>
+                  <w:r>
+                    <w:rPr>
+                      <w:rFonts w:hint="eastAsia" w:ascii="SimSun" w:hAnsi="SimSun" w:cs="SimSun"/>
+                      <w:kern w:val="0"/>
+                      <w:sz w:val="22"/>
+                      <w:lang w:eastAsia="zh-CN"/>
+                    </w:rPr>
+                    <w:t>至今</w:t>
                   </w:r>
                 </w:p>
               </w:tc>
@@ -7882,7 +8542,7 @@
                       <w:kern w:val="0"/>
                       <w:lang w:val="en-US" w:eastAsia="zh-CN"/>
                     </w:rPr>
-                    <w:t>Nocobase</w:t>
+                    <w:t>NocoBase</w:t>
                   </w:r>
                   <w:r>
                     <w:rPr>
@@ -7914,7 +8574,7 @@
                       <w:kern w:val="0"/>
                       <w:lang w:val="en-US" w:eastAsia="zh-CN"/>
                     </w:rPr>
-                    <w:t>Echarts</w:t>
+                    <w:t>ECharts</w:t>
                   </w:r>
                   <w:r>
                     <w:rPr>
@@ -7946,7 +8606,7 @@
                       <w:kern w:val="0"/>
                       <w:lang w:eastAsia="zh-CN"/>
                     </w:rPr>
-                    <w:t>“智慧运维系统”、“票务管理系统”、“兆益生物生产管理系统”</w:t>
+                    <w:t>“POXMS可视化智慧运维管理云平台”、“票务管理系统”、“兆益生物生产管理系统”</w:t>
                   </w:r>
                 </w:p>
               </w:tc>
@@ -8109,7 +8769,7 @@
                       <w:kern w:val="0"/>
                       <w:lang w:val="en-US" w:eastAsia="zh-CN"/>
                     </w:rPr>
-                    <w:t>开源无代码/低代码开发: Nocobase、AMIS</w:t>
+                    <w:t>开源无代码/低代码开发: NocoBase、AMIS</w:t>
                   </w:r>
                 </w:p>
                 <w:p>
@@ -8136,7 +8796,7 @@
                       <w:kern w:val="0"/>
                       <w:lang w:val="en-US"/>
                     </w:rPr>
-                    <w:t>Echarts</w:t>
+                    <w:t>ECharts</w:t>
                   </w:r>
                 </w:p>
                 <w:p>
@@ -8310,7 +8970,7 @@
                 <w:p>
                   <w:pPr>
                     <w:widowControl w:val="0"/>
-                    <w:jc w:val="center"/>
+                    <w:jc w:val="right"/>
                     <w:rPr>
                       <w:kern w:val="0"/>
                     </w:rPr>
@@ -8364,162 +9024,6 @@
                   <w:right w:w="15" w:type="dxa"/>
                 </w:tblCellMar>
               </w:tblPrEx>
-              <w:trPr>
-                <w:trHeight w:val="678" w:hRule="atLeast"/>
-                <w:jc w:val="center"/>
-              </w:trPr>
-              <w:tc>
-                <w:tcPr>
-                  <w:tcW w:w="1560" w:type="dxa"/>
-                  <w:tcBorders>
-                    <w:top w:val="dashSmallGap" w:color="00000A" w:sz="4" w:space="0"/>
-                    <w:left w:val="single" w:color="00000A" w:sz="12" w:space="0"/>
-                    <w:bottom w:val="dashSmallGap" w:color="00000A" w:sz="4" w:space="0"/>
-                    <w:right w:val="dashSmallGap" w:color="00000A" w:sz="4" w:space="0"/>
-                  </w:tcBorders>
-                  <w:shd w:val="clear" w:color="auto" w:fill="FFFFFF" w:themeFill="background1"/>
-                  <w:vAlign w:val="center"/>
-                </w:tcPr>
-                <w:p>
-                  <w:pPr>
-                    <w:widowControl w:val="0"/>
-                    <w:rPr>
-                      <w:rFonts w:hint="default"/>
-                      <w:kern w:val="0"/>
-                    </w:rPr>
-                  </w:pPr>
-                </w:p>
-              </w:tc>
-              <w:tc>
-                <w:tcPr>
-                  <w:tcW w:w="1526" w:type="dxa"/>
-                  <w:tcBorders>
-                    <w:top w:val="dashSmallGap" w:color="00000A" w:sz="4" w:space="0"/>
-                    <w:left w:val="dashSmallGap" w:color="00000A" w:sz="4" w:space="0"/>
-                    <w:bottom w:val="dashSmallGap" w:color="00000A" w:sz="4" w:space="0"/>
-                    <w:right w:val="dashSmallGap" w:color="00000A" w:sz="4" w:space="0"/>
-                  </w:tcBorders>
-                  <w:shd w:val="clear" w:color="auto" w:fill="FFFFFF" w:themeFill="background1"/>
-                  <w:vAlign w:val="center"/>
-                </w:tcPr>
-                <w:p>
-                  <w:pPr>
-                    <w:widowControl w:val="0"/>
-                    <w:jc w:val="center"/>
-                    <w:rPr>
-                      <w:rFonts w:hint="default" w:ascii="SimSun" w:hAnsi="SimSun" w:cs="SimSun"/>
-                      <w:kern w:val="0"/>
-                      <w:sz w:val="22"/>
-                    </w:rPr>
-                  </w:pPr>
-                </w:p>
-              </w:tc>
-              <w:tc>
-                <w:tcPr>
-                  <w:tcW w:w="2014" w:type="dxa"/>
-                  <w:tcBorders>
-                    <w:top w:val="dashSmallGap" w:color="00000A" w:sz="4" w:space="0"/>
-                    <w:left w:val="dashSmallGap" w:color="00000A" w:sz="4" w:space="0"/>
-                    <w:bottom w:val="dashSmallGap" w:color="00000A" w:sz="4" w:space="0"/>
-                    <w:right w:val="dashSmallGap" w:color="00000A" w:sz="4" w:space="0"/>
-                  </w:tcBorders>
-                  <w:shd w:val="clear" w:color="auto" w:fill="FFFFFF" w:themeFill="background1"/>
-                  <w:vAlign w:val="center"/>
-                </w:tcPr>
-                <w:p>
-                  <w:pPr>
-                    <w:widowControl w:val="0"/>
-                    <w:jc w:val="left"/>
-                    <w:rPr>
-                      <w:rFonts w:hint="default"/>
-                      <w:kern w:val="0"/>
-                      <w:lang w:val="en-US" w:eastAsia="zh-CN"/>
-                    </w:rPr>
-                  </w:pPr>
-                </w:p>
-              </w:tc>
-              <w:tc>
-                <w:tcPr>
-                  <w:tcW w:w="2394" w:type="dxa"/>
-                  <w:tcBorders>
-                    <w:top w:val="dashSmallGap" w:color="00000A" w:sz="4" w:space="0"/>
-                    <w:left w:val="dashSmallGap" w:color="00000A" w:sz="4" w:space="0"/>
-                    <w:bottom w:val="dashSmallGap" w:color="00000A" w:sz="4" w:space="0"/>
-                    <w:right w:val="dashSmallGap" w:color="00000A" w:sz="4" w:space="0"/>
-                  </w:tcBorders>
-                  <w:shd w:val="clear" w:color="auto" w:fill="FFFFFF" w:themeFill="background1"/>
-                  <w:vAlign w:val="center"/>
-                </w:tcPr>
-                <w:p>
-                  <w:pPr>
-                    <w:widowControl w:val="0"/>
-                    <w:jc w:val="center"/>
-                    <w:rPr>
-                      <w:rFonts w:hint="default"/>
-                      <w:kern w:val="0"/>
-                      <w:lang w:val="en-US" w:eastAsia="zh-CN"/>
-                    </w:rPr>
-                  </w:pPr>
-                </w:p>
-              </w:tc>
-              <w:tc>
-                <w:tcPr>
-                  <w:tcW w:w="925" w:type="dxa"/>
-                  <w:tcBorders>
-                    <w:top w:val="dashSmallGap" w:color="00000A" w:sz="4" w:space="0"/>
-                    <w:left w:val="dashSmallGap" w:color="00000A" w:sz="4" w:space="0"/>
-                    <w:bottom w:val="dashSmallGap" w:color="00000A" w:sz="4" w:space="0"/>
-                    <w:right w:val="dashSmallGap" w:color="00000A" w:sz="4" w:space="0"/>
-                  </w:tcBorders>
-                  <w:shd w:val="clear" w:color="auto" w:fill="FFFFFF" w:themeFill="background1"/>
-                  <w:vAlign w:val="center"/>
-                </w:tcPr>
-                <w:p>
-                  <w:pPr>
-                    <w:widowControl w:val="0"/>
-                    <w:jc w:val="center"/>
-                    <w:rPr>
-                      <w:rFonts w:ascii="SimSun" w:hAnsi="SimSun" w:eastAsia="SimSun" w:cs="SimSun"/>
-                      <w:b/>
-                      <w:color w:val="00000A"/>
-                      <w:kern w:val="0"/>
-                      <w:sz w:val="22"/>
-                      <w:szCs w:val="22"/>
-                      <w:lang w:val="en-US" w:eastAsia="zh-CN" w:bidi="ar-SA"/>
-                    </w:rPr>
-                  </w:pPr>
-                </w:p>
-              </w:tc>
-              <w:tc>
-                <w:tcPr>
-                  <w:tcW w:w="2019" w:type="dxa"/>
-                  <w:tcBorders>
-                    <w:top w:val="dashSmallGap" w:color="00000A" w:sz="4" w:space="0"/>
-                    <w:left w:val="dashSmallGap" w:color="00000A" w:sz="4" w:space="0"/>
-                    <w:bottom w:val="dashSmallGap" w:color="00000A" w:sz="4" w:space="0"/>
-                    <w:right w:val="single" w:color="00000A" w:sz="12" w:space="0"/>
-                  </w:tcBorders>
-                  <w:shd w:val="clear" w:color="auto" w:fill="FFFFFF" w:themeFill="background1"/>
-                  <w:vAlign w:val="center"/>
-                </w:tcPr>
-                <w:p>
-                  <w:pPr>
-                    <w:widowControl w:val="0"/>
-                    <w:jc w:val="center"/>
-                    <w:rPr>
-                      <w:rFonts w:ascii="SimSun" w:hAnsi="SimSun" w:eastAsia="SimSun" w:cs="SimSun"/>
-                      <w:b/>
-                      <w:color w:val="000000"/>
-                      <w:kern w:val="0"/>
-                      <w:sz w:val="22"/>
-                      <w:szCs w:val="22"/>
-                      <w:lang w:val="en-US" w:eastAsia="zh-CN" w:bidi="ar-SA"/>
-                    </w:rPr>
-                  </w:pPr>
-                </w:p>
-              </w:tc>
-            </w:tr>
-            <w:tr>
               <w:trPr>
                 <w:trHeight w:val="678" w:hRule="atLeast"/>
                 <w:jc w:val="center"/>
@@ -8595,7 +9099,29 @@
                       <w:szCs w:val="22"/>
                       <w:lang w:val="en-US" w:eastAsia="zh-CN" w:bidi="ar-SA"/>
                     </w:rPr>
-                    <w:t xml:space="preserve">研究 NocoBase 插件开发、低代码平台扩展、数据可视化前端工具。用 </w:t>
+                    <w:t xml:space="preserve">研究 </w:t>
+                  </w:r>
+                  <w:r>
+                    <w:rPr>
+                      <w:rFonts w:cs="DejaVu Serif"/>
+                      <w:color w:val="00000A"/>
+                      <w:kern w:val="0"/>
+                      <w:sz w:val="21"/>
+                      <w:szCs w:val="22"/>
+                      <w:lang w:val="en-US" w:eastAsia="zh-CN" w:bidi="ar-SA"/>
+                    </w:rPr>
+                    <w:t>NocoBase</w:t>
+                  </w:r>
+                  <w:r>
+                    <w:rPr>
+                      <w:rFonts w:ascii="Calibri" w:hAnsi="Calibri" w:eastAsia="SimSun" w:cs="DejaVu Serif"/>
+                      <w:color w:val="00000A"/>
+                      <w:kern w:val="0"/>
+                      <w:sz w:val="21"/>
+                      <w:szCs w:val="22"/>
+                      <w:lang w:val="en-US" w:eastAsia="zh-CN" w:bidi="ar-SA"/>
+                    </w:rPr>
+                    <w:t xml:space="preserve"> 插件开发、低代码平台扩展、数据可视化前端工具。用 </w:t>
                   </w:r>
                   <w:r>
                     <w:rPr>
@@ -8665,6 +9191,17 @@
                   </w:r>
                   <w:r>
                     <w:rPr>
+                      <w:rFonts w:cs="DejaVu Serif"/>
+                      <w:color w:val="00000A"/>
+                      <w:kern w:val="0"/>
+                      <w:sz w:val="21"/>
+                      <w:szCs w:val="22"/>
+                      <w:lang w:val="en-US" w:eastAsia="zh-CN" w:bidi="ar-SA"/>
+                    </w:rPr>
+                    <w:t>NocoBase</w:t>
+                  </w:r>
+                  <w:r>
+                    <w:rPr>
                       <w:rFonts w:ascii="Calibri" w:hAnsi="Calibri" w:eastAsia="SimSun" w:cs="DejaVu Serif"/>
                       <w:color w:val="00000A"/>
                       <w:kern w:val="0"/>
@@ -8672,7 +9209,29 @@
                       <w:szCs w:val="22"/>
                       <w:lang w:val="en-US" w:eastAsia="zh-CN" w:bidi="ar-SA"/>
                     </w:rPr>
-                    <w:t>NocoBase、AMIS、ECharts 等开发：</w:t>
+                    <w:t>、AMIS、</w:t>
+                  </w:r>
+                  <w:r>
+                    <w:rPr>
+                      <w:rFonts w:cs="DejaVu Serif"/>
+                      <w:color w:val="00000A"/>
+                      <w:kern w:val="0"/>
+                      <w:sz w:val="21"/>
+                      <w:szCs w:val="22"/>
+                      <w:lang w:val="en-US" w:eastAsia="zh-CN" w:bidi="ar-SA"/>
+                    </w:rPr>
+                    <w:t>ECharts</w:t>
+                  </w:r>
+                  <w:r>
+                    <w:rPr>
+                      <w:rFonts w:ascii="Calibri" w:hAnsi="Calibri" w:eastAsia="SimSun" w:cs="DejaVu Serif"/>
+                      <w:color w:val="00000A"/>
+                      <w:kern w:val="0"/>
+                      <w:sz w:val="21"/>
+                      <w:szCs w:val="22"/>
+                      <w:lang w:val="en-US" w:eastAsia="zh-CN" w:bidi="ar-SA"/>
+                    </w:rPr>
+                    <w:t xml:space="preserve"> 等开发：</w:t>
                   </w:r>
                 </w:p>
                 <w:p>
@@ -8696,7 +9255,51 @@
                       <w:szCs w:val="22"/>
                       <w:lang w:val="en-US" w:eastAsia="zh-CN" w:bidi="ar-SA"/>
                     </w:rPr>
-                    <w:t xml:space="preserve">1、NocoBase AMIS 插件：实现 NocoBase 与 AMIS 联动，支持将参数（如记录 ID）传递到表单中的 AMIS 插件，表单保存成功后重新加载表格数据；实现 AMIS 插件与页面其他表格插件的连接；通过全局 </w:t>
+                    <w:t>1、</w:t>
+                  </w:r>
+                  <w:r>
+                    <w:rPr>
+                      <w:rFonts w:cs="DejaVu Serif"/>
+                      <w:color w:val="00000A"/>
+                      <w:kern w:val="0"/>
+                      <w:sz w:val="21"/>
+                      <w:szCs w:val="22"/>
+                      <w:lang w:val="en-US" w:eastAsia="zh-CN" w:bidi="ar-SA"/>
+                    </w:rPr>
+                    <w:t>NocoBase</w:t>
+                  </w:r>
+                  <w:r>
+                    <w:rPr>
+                      <w:rFonts w:ascii="Calibri" w:hAnsi="Calibri" w:eastAsia="SimSun" w:cs="DejaVu Serif"/>
+                      <w:color w:val="00000A"/>
+                      <w:kern w:val="0"/>
+                      <w:sz w:val="21"/>
+                      <w:szCs w:val="22"/>
+                      <w:lang w:val="en-US" w:eastAsia="zh-CN" w:bidi="ar-SA"/>
+                    </w:rPr>
+                    <w:t xml:space="preserve"> AMIS 插件：实现 </w:t>
+                  </w:r>
+                  <w:r>
+                    <w:rPr>
+                      <w:rFonts w:cs="DejaVu Serif"/>
+                      <w:color w:val="00000A"/>
+                      <w:kern w:val="0"/>
+                      <w:sz w:val="21"/>
+                      <w:szCs w:val="22"/>
+                      <w:lang w:val="en-US" w:eastAsia="zh-CN" w:bidi="ar-SA"/>
+                    </w:rPr>
+                    <w:t>NocoBase</w:t>
+                  </w:r>
+                  <w:r>
+                    <w:rPr>
+                      <w:rFonts w:ascii="Calibri" w:hAnsi="Calibri" w:eastAsia="SimSun" w:cs="DejaVu Serif"/>
+                      <w:color w:val="00000A"/>
+                      <w:kern w:val="0"/>
+                      <w:sz w:val="21"/>
+                      <w:szCs w:val="22"/>
+                      <w:lang w:val="en-US" w:eastAsia="zh-CN" w:bidi="ar-SA"/>
+                    </w:rPr>
+                    <w:t xml:space="preserve"> 与 AMIS 联动，支持将参数（如记录 ID）传递到表单中的 AMIS 插件，表单保存成功后重新加载表格数据；实现 AMIS 插件与页面其他表格插件的连接；通过全局 </w:t>
                   </w:r>
                   <w:r>
                     <w:rPr>
@@ -8742,7 +9345,51 @@
                       <w:szCs w:val="22"/>
                       <w:lang w:val="en-US" w:eastAsia="zh-CN" w:bidi="ar-SA"/>
                     </w:rPr>
-                    <w:t>2、NocoBase ECharts 插件（坐标类）：支持折线图、柱状图等；提供图块类型选择、标题显示与位置配置、JSON 格式图配置参数；支持关联数据源、创建独立数据源、定时刷新、事件刷新、默认数据规则、条件显示。</w:t>
+                    <w:t>2、</w:t>
+                  </w:r>
+                  <w:r>
+                    <w:rPr>
+                      <w:rFonts w:cs="DejaVu Serif"/>
+                      <w:color w:val="00000A"/>
+                      <w:kern w:val="0"/>
+                      <w:sz w:val="21"/>
+                      <w:szCs w:val="22"/>
+                      <w:lang w:val="en-US" w:eastAsia="zh-CN" w:bidi="ar-SA"/>
+                    </w:rPr>
+                    <w:t>NocoBase</w:t>
+                  </w:r>
+                  <w:r>
+                    <w:rPr>
+                      <w:rFonts w:ascii="Calibri" w:hAnsi="Calibri" w:eastAsia="SimSun" w:cs="DejaVu Serif"/>
+                      <w:color w:val="00000A"/>
+                      <w:kern w:val="0"/>
+                      <w:sz w:val="21"/>
+                      <w:szCs w:val="22"/>
+                      <w:lang w:val="en-US" w:eastAsia="zh-CN" w:bidi="ar-SA"/>
+                    </w:rPr>
+                    <w:t xml:space="preserve"> </w:t>
+                  </w:r>
+                  <w:r>
+                    <w:rPr>
+                      <w:rFonts w:cs="DejaVu Serif"/>
+                      <w:color w:val="00000A"/>
+                      <w:kern w:val="0"/>
+                      <w:sz w:val="21"/>
+                      <w:szCs w:val="22"/>
+                      <w:lang w:val="en-US" w:eastAsia="zh-CN" w:bidi="ar-SA"/>
+                    </w:rPr>
+                    <w:t>ECharts</w:t>
+                  </w:r>
+                  <w:r>
+                    <w:rPr>
+                      <w:rFonts w:ascii="Calibri" w:hAnsi="Calibri" w:eastAsia="SimSun" w:cs="DejaVu Serif"/>
+                      <w:color w:val="00000A"/>
+                      <w:kern w:val="0"/>
+                      <w:sz w:val="21"/>
+                      <w:szCs w:val="22"/>
+                      <w:lang w:val="en-US" w:eastAsia="zh-CN" w:bidi="ar-SA"/>
+                    </w:rPr>
+                    <w:t xml:space="preserve"> 插件（坐标类）：支持折线图、柱状图等；提供图块类型选择、标题显示与位置配置、JSON 格式图配置参数；支持关联数据源、创建独立数据源、定时刷新、事件刷新、默认数据规则、条件显示。</w:t>
                   </w:r>
                 </w:p>
                 <w:p>
@@ -8766,7 +9413,29 @@
                       <w:szCs w:val="22"/>
                       <w:lang w:val="en-US" w:eastAsia="zh-CN" w:bidi="ar-SA"/>
                     </w:rPr>
-                    <w:t>3、NocoBase Tree 插件：提供树结构的筛选区块。</w:t>
+                    <w:t>3、</w:t>
+                  </w:r>
+                  <w:r>
+                    <w:rPr>
+                      <w:rFonts w:cs="DejaVu Serif"/>
+                      <w:color w:val="00000A"/>
+                      <w:kern w:val="0"/>
+                      <w:sz w:val="21"/>
+                      <w:szCs w:val="22"/>
+                      <w:lang w:val="en-US" w:eastAsia="zh-CN" w:bidi="ar-SA"/>
+                    </w:rPr>
+                    <w:t>NocoBase</w:t>
+                  </w:r>
+                  <w:r>
+                    <w:rPr>
+                      <w:rFonts w:ascii="Calibri" w:hAnsi="Calibri" w:eastAsia="SimSun" w:cs="DejaVu Serif"/>
+                      <w:color w:val="00000A"/>
+                      <w:kern w:val="0"/>
+                      <w:sz w:val="21"/>
+                      <w:szCs w:val="22"/>
+                      <w:lang w:val="en-US" w:eastAsia="zh-CN" w:bidi="ar-SA"/>
+                    </w:rPr>
+                    <w:t xml:space="preserve"> Tree 插件：提供树结构的筛选区块。</w:t>
                   </w:r>
                 </w:p>
                 <w:p>
@@ -8790,7 +9459,29 @@
                       <w:szCs w:val="22"/>
                       <w:lang w:val="en-US" w:eastAsia="zh-CN" w:bidi="ar-SA"/>
                     </w:rPr>
-                    <w:t>4、可视化运维系统：区域电、水、气系统可视化运维；用数据可视化分析电水气使用情况；设备巡检（线上和线下）、保养和维修。技术：Vue 2, diboot, ant-design-vue, echarts, DataEase, Fuxa。</w:t>
+                    <w:t xml:space="preserve">4、可视化运维系统：区域电、水、气系统可视化运维；用数据可视化分析电水气使用情况；设备巡检（线上和线下）、保养和维修。技术：Vue 2, diboot, ant-design-vue, </w:t>
+                  </w:r>
+                  <w:r>
+                    <w:rPr>
+                      <w:rFonts w:cs="DejaVu Serif"/>
+                      <w:color w:val="00000A"/>
+                      <w:kern w:val="0"/>
+                      <w:sz w:val="21"/>
+                      <w:szCs w:val="22"/>
+                      <w:lang w:val="en-US" w:eastAsia="zh-CN" w:bidi="ar-SA"/>
+                    </w:rPr>
+                    <w:t>ECharts</w:t>
+                  </w:r>
+                  <w:r>
+                    <w:rPr>
+                      <w:rFonts w:ascii="Calibri" w:hAnsi="Calibri" w:eastAsia="SimSun" w:cs="DejaVu Serif"/>
+                      <w:color w:val="00000A"/>
+                      <w:kern w:val="0"/>
+                      <w:sz w:val="21"/>
+                      <w:szCs w:val="22"/>
+                      <w:lang w:val="en-US" w:eastAsia="zh-CN" w:bidi="ar-SA"/>
+                    </w:rPr>
+                    <w:t>, DataEase, Fuxa。</w:t>
                   </w:r>
                 </w:p>
                 <w:p>
@@ -8886,14 +9577,14 @@
                   </w:r>
                   <w:r>
                     <w:rPr>
-                      <w:rFonts w:hint="default" w:ascii="Calibri" w:hAnsi="Calibri" w:eastAsia="SimSun" w:cs="DejaVu Serif"/>
+                      <w:rFonts w:hint="default" w:cs="DejaVu Serif"/>
                       <w:color w:val="00000A"/>
                       <w:kern w:val="0"/>
                       <w:sz w:val="21"/>
                       <w:szCs w:val="22"/>
                       <w:lang w:val="en-US" w:eastAsia="zh-CN" w:bidi="ar-SA"/>
                     </w:rPr>
-                    <w:t>E</w:t>
+                    <w:t>ECharts</w:t>
                   </w:r>
                   <w:r>
                     <w:rPr>
@@ -8904,7 +9595,7 @@
                       <w:szCs w:val="22"/>
                       <w:lang w:val="en-US" w:eastAsia="zh-CN" w:bidi="ar-SA"/>
                     </w:rPr>
-                    <w:t>charts。</w:t>
+                    <w:t>。</w:t>
                   </w:r>
                 </w:p>
                 <w:p>
@@ -8998,7 +9689,52 @@
                       <w:rFonts w:hint="default"/>
                       <w:kern w:val="0"/>
                     </w:rPr>
-                    <w:t xml:space="preserve">1. 用 NocoBase、AMIS、ECharts 研发插件，负责 NocoBase 与 AMIS 联动、参数传递、表格重载、全局样式与 JSON Schema 拆分，以及坐标类图表和树结构筛选功能。  </w:t>
+                    <w:t xml:space="preserve">1. 用 </w:t>
+                  </w:r>
+                  <w:r>
+                    <w:rPr>
+                      <w:rFonts w:hint="default"/>
+                      <w:kern w:val="0"/>
+                      <w:lang w:val="en-US"/>
+                    </w:rPr>
+                    <w:t>NocoBase</w:t>
+                  </w:r>
+                  <w:r>
+                    <w:rPr>
+                      <w:rFonts w:hint="default"/>
+                      <w:kern w:val="0"/>
+                    </w:rPr>
+                    <w:t>、AMIS、</w:t>
+                  </w:r>
+                  <w:r>
+                    <w:rPr>
+                      <w:rFonts w:hint="default"/>
+                      <w:kern w:val="0"/>
+                      <w:lang w:val="en-US"/>
+                    </w:rPr>
+                    <w:t>ECharts</w:t>
+                  </w:r>
+                  <w:r>
+                    <w:rPr>
+                      <w:rFonts w:hint="default"/>
+                      <w:kern w:val="0"/>
+                    </w:rPr>
+                    <w:t xml:space="preserve"> 研发插件，负责 </w:t>
+                  </w:r>
+                  <w:r>
+                    <w:rPr>
+                      <w:rFonts w:hint="default"/>
+                      <w:kern w:val="0"/>
+                      <w:lang w:val="en-US"/>
+                    </w:rPr>
+                    <w:t>NocoBase</w:t>
+                  </w:r>
+                  <w:r>
+                    <w:rPr>
+                      <w:rFonts w:hint="default"/>
+                      <w:kern w:val="0"/>
+                    </w:rPr>
+                    <w:t xml:space="preserve"> 与 AMIS 联动、参数传递、表格重载、全局样式与 JSON Schema 拆分，以及坐标类图表和树结构筛选功能。  </w:t>
                   </w:r>
                 </w:p>
                 <w:p>
@@ -9034,7 +9770,22 @@
                       <w:rFonts w:hint="default"/>
                       <w:kern w:val="0"/>
                     </w:rPr>
-                    <w:t xml:space="preserve"> 2/3、ECharts、高德地图 API、JS 拓扑图框架研发可视化运维、票务管理、生产管理、智慧园区和业务管理平台前端，并用 AI 辅助软件开发。</w:t>
+                    <w:t xml:space="preserve"> 2/3、</w:t>
+                  </w:r>
+                  <w:r>
+                    <w:rPr>
+                      <w:rFonts w:hint="default"/>
+                      <w:kern w:val="0"/>
+                      <w:lang w:val="en-US"/>
+                    </w:rPr>
+                    <w:t>ECharts</w:t>
+                  </w:r>
+                  <w:r>
+                    <w:rPr>
+                      <w:rFonts w:hint="default"/>
+                      <w:kern w:val="0"/>
+                    </w:rPr>
+                    <w:t>、高德地图 API、JS 拓扑图框架研发可视化运维、票务管理、生产管理、智慧园区和业务管理平台前端，并用 AI 辅助软件开发。</w:t>
                   </w:r>
                 </w:p>
               </w:tc>
@@ -9116,7 +9867,41 @@
                       <w:kern w:val="0"/>
                       <w:sz w:val="22"/>
                     </w:rPr>
-                    <w:t>开发的 NocoBase AMIS、ECharts、Tree 插件已在实际项目中使用，实现了表单与图表的数据联动、参数传递、表格重载、全局样式配置、JSON Schema 拆分、数据源关联、定时/事件刷新与条件显示，提升了系统的可视化配置与数据筛选能力。</w:t>
+                    <w:t xml:space="preserve">开发的 </w:t>
+                  </w:r>
+                  <w:r>
+                    <w:rPr>
+                      <w:rFonts w:ascii="SimSun" w:hAnsi="SimSun" w:cs="SimSun"/>
+                      <w:kern w:val="0"/>
+                      <w:sz w:val="22"/>
+                      <w:lang w:val="en-US"/>
+                    </w:rPr>
+                    <w:t>NocoBase</w:t>
+                  </w:r>
+                  <w:r>
+                    <w:rPr>
+                      <w:rFonts w:ascii="SimSun" w:hAnsi="SimSun" w:cs="SimSun"/>
+                      <w:kern w:val="0"/>
+                      <w:sz w:val="22"/>
+                    </w:rPr>
+                    <w:t xml:space="preserve"> AMIS、</w:t>
+                  </w:r>
+                  <w:r>
+                    <w:rPr>
+                      <w:rFonts w:ascii="SimSun" w:hAnsi="SimSun" w:cs="SimSun"/>
+                      <w:kern w:val="0"/>
+                      <w:sz w:val="22"/>
+                      <w:lang w:val="en-US"/>
+                    </w:rPr>
+                    <w:t>ECharts</w:t>
+                  </w:r>
+                  <w:r>
+                    <w:rPr>
+                      <w:rFonts w:ascii="SimSun" w:hAnsi="SimSun" w:cs="SimSun"/>
+                      <w:kern w:val="0"/>
+                      <w:sz w:val="22"/>
+                    </w:rPr>
+                    <w:t>、Tree 插件已在实际项目中使用，实现了表单与图表的数据联动、参数传递、表格重载、全局样式配置、JSON Schema 拆分、数据源关联、定时/事件刷新与条件显示，提升了系统的可视化配置与数据筛选能力。</w:t>
                   </w:r>
                 </w:p>
                 <w:p>
@@ -9506,7 +10291,7 @@
                 <w:kern w:val="0"/>
                 <w:sz w:val="22"/>
               </w:rPr>
-              <w:t>2020/4—</w:t>
+              <w:t>2020/</w:t>
             </w:r>
             <w:r>
               <w:rPr>
@@ -9515,7 +10300,24 @@
                 <w:sz w:val="22"/>
                 <w:lang w:val="en-US" w:eastAsia="zh-CN"/>
               </w:rPr>
-              <w:t>2023/5</w:t>
+              <w:t>0</w:t>
+            </w:r>
+            <w:r>
+              <w:rPr>
+                <w:rFonts w:ascii="SimSun" w:hAnsi="SimSun" w:cs="SimSun"/>
+                <w:kern w:val="0"/>
+                <w:sz w:val="22"/>
+              </w:rPr>
+              <w:t>4—</w:t>
+            </w:r>
+            <w:r>
+              <w:rPr>
+                <w:rFonts w:hint="eastAsia" w:ascii="SimSun" w:hAnsi="SimSun" w:cs="SimSun"/>
+                <w:kern w:val="0"/>
+                <w:sz w:val="22"/>
+                <w:lang w:val="en-US" w:eastAsia="zh-CN"/>
+              </w:rPr>
+              <w:t>2023/05</w:t>
             </w:r>
           </w:p>
         </w:tc>
@@ -9534,10 +10336,13 @@
           </w:tcPr>
           <w:p>
             <w:pPr>
-              <w:widowControl w:val="0"/>
-              <w:jc w:val="left"/>
-              <w:rPr>
-                <w:rFonts w:ascii="SimSun" w:hAnsi="SimSun" w:eastAsia="SimSun" w:cs="SimSun"/>
+              <w:pStyle w:val="29"/>
+              <w:keepNext w:val="0"/>
+              <w:keepLines w:val="0"/>
+              <w:widowControl/>
+              <w:suppressLineNumbers w:val="0"/>
+              <w:rPr>
+                <w:rFonts w:hint="eastAsia" w:ascii="SimSun" w:hAnsi="SimSun" w:eastAsia="SimSun" w:cs="SimSun"/>
                 <w:color w:val="00000A"/>
                 <w:kern w:val="0"/>
                 <w:sz w:val="22"/>
@@ -9556,7 +10361,7 @@
               <w:rPr>
                 <w:kern w:val="0"/>
               </w:rPr>
-              <w:t>智能区域平台</w:t>
+              <w:t>智能区域</w:t>
             </w:r>
             <w:r>
               <w:rPr>
@@ -9571,7 +10376,63 @@
                 <w:kern w:val="0"/>
                 <w:sz w:val="22"/>
               </w:rPr>
-              <w:t>、“产云销一体化平台”、“电力配电设备监控系统”、“国新LNG平台”</w:t>
+              <w:t>、</w:t>
+            </w:r>
+            <w:r>
+              <w:rPr>
+                <w:rFonts w:hint="eastAsia" w:ascii="SimSun" w:hAnsi="SimSun" w:cs="SimSun"/>
+                <w:kern w:val="0"/>
+                <w:sz w:val="22"/>
+                <w:lang w:eastAsia="zh-CN"/>
+              </w:rPr>
+              <w:t>“</w:t>
+            </w:r>
+            <w:r>
+              <w:t>拓扑图工具</w:t>
+            </w:r>
+            <w:r>
+              <w:rPr>
+                <w:rFonts w:hint="eastAsia" w:ascii="SimSun" w:hAnsi="SimSun" w:cs="SimSun"/>
+                <w:kern w:val="0"/>
+                <w:sz w:val="22"/>
+                <w:lang w:eastAsia="zh-CN"/>
+              </w:rPr>
+              <w:t>”、</w:t>
+            </w:r>
+            <w:r>
+              <w:rPr>
+                <w:rFonts w:ascii="SimSun" w:hAnsi="SimSun" w:cs="SimSun"/>
+                <w:kern w:val="0"/>
+                <w:sz w:val="22"/>
+              </w:rPr>
+              <w:t>“产云销一体化平台”、“电力配电设备监控系统”、“国新LNG平台”</w:t>
+            </w:r>
+            <w:r>
+              <w:rPr>
+                <w:rFonts w:hint="eastAsia" w:ascii="SimSun" w:hAnsi="SimSun" w:cs="SimSun"/>
+                <w:kern w:val="0"/>
+                <w:sz w:val="22"/>
+                <w:lang w:eastAsia="zh-CN"/>
+              </w:rPr>
+              <w:t>、“</w:t>
+            </w:r>
+            <w:r>
+              <w:rPr>
+                <w:rFonts w:hint="eastAsia" w:ascii="SimSun" w:hAnsi="SimSun" w:cs="SimSun"/>
+                <w:kern w:val="0"/>
+                <w:sz w:val="22"/>
+                <w:lang w:val="en-US" w:eastAsia="zh-CN"/>
+              </w:rPr>
+              <w:t>幸福林带智慧管控平台</w:t>
+            </w:r>
+            <w:r>
+              <w:rPr>
+                <w:rFonts w:hint="eastAsia" w:ascii="SimSun" w:hAnsi="SimSun" w:cs="SimSun"/>
+                <w:kern w:val="0"/>
+                <w:sz w:val="22"/>
+                <w:lang w:eastAsia="zh-CN"/>
+              </w:rPr>
+              <w:t>”</w:t>
             </w:r>
           </w:p>
         </w:tc>
@@ -9734,14 +10595,14 @@
               <w:rPr>
                 <w:kern w:val="0"/>
               </w:rPr>
-              <w:t>GIS框架: 高德地图、Cesium js</w:t>
+              <w:t>GIS框架: 高德地图、</w:t>
             </w:r>
             <w:r>
               <w:rPr>
                 <w:kern w:val="0"/>
                 <w:lang w:val="en-US"/>
               </w:rPr>
-              <w:t>, AntV L7</w:t>
+              <w:t>CesiumJS, AntV L7</w:t>
             </w:r>
           </w:p>
           <w:p>
@@ -10087,7 +10948,24 @@
                 <w:kern w:val="0"/>
                 <w:sz w:val="22"/>
               </w:rPr>
-              <w:t>3、高德 API、Cesium js  开发大屏平台。</w:t>
+              <w:t>3、高德 API、</w:t>
+            </w:r>
+            <w:r>
+              <w:rPr>
+                <w:rFonts w:ascii="SimSun" w:hAnsi="SimSun" w:cs="SimSun"/>
+                <w:kern w:val="0"/>
+                <w:sz w:val="22"/>
+                <w:lang w:val="en-US"/>
+              </w:rPr>
+              <w:t>CesiumJS</w:t>
+            </w:r>
+            <w:r>
+              <w:rPr>
+                <w:rFonts w:ascii="SimSun" w:hAnsi="SimSun" w:cs="SimSun"/>
+                <w:kern w:val="0"/>
+                <w:sz w:val="22"/>
+              </w:rPr>
+              <w:t xml:space="preserve">  开发大屏平台。</w:t>
             </w:r>
           </w:p>
         </w:tc>
@@ -10598,7 +11476,41 @@
                 <w:kern w:val="0"/>
                 <w:sz w:val="22"/>
               </w:rPr>
-              <w:t>2019/5—2020/4</w:t>
+              <w:t>2019/</w:t>
+            </w:r>
+            <w:r>
+              <w:rPr>
+                <w:rFonts w:hint="eastAsia" w:ascii="SimSun" w:hAnsi="SimSun" w:cs="SimSun"/>
+                <w:kern w:val="0"/>
+                <w:sz w:val="22"/>
+                <w:lang w:val="en-US" w:eastAsia="zh-CN"/>
+              </w:rPr>
+              <w:t>0</w:t>
+            </w:r>
+            <w:r>
+              <w:rPr>
+                <w:rFonts w:ascii="SimSun" w:hAnsi="SimSun" w:cs="SimSun"/>
+                <w:kern w:val="0"/>
+                <w:sz w:val="22"/>
+              </w:rPr>
+              <w:t>5—2020/</w:t>
+            </w:r>
+            <w:r>
+              <w:rPr>
+                <w:rFonts w:hint="eastAsia" w:ascii="SimSun" w:hAnsi="SimSun" w:cs="SimSun"/>
+                <w:kern w:val="0"/>
+                <w:sz w:val="22"/>
+                <w:lang w:val="en-US" w:eastAsia="zh-CN"/>
+              </w:rPr>
+              <w:t>0</w:t>
+            </w:r>
+            <w:r>
+              <w:rPr>
+                <w:rFonts w:ascii="SimSun" w:hAnsi="SimSun" w:cs="SimSun"/>
+                <w:kern w:val="0"/>
+                <w:sz w:val="22"/>
+              </w:rPr>
+              <w:t>4</w:t>
             </w:r>
           </w:p>
         </w:tc>
@@ -10620,18 +11532,48 @@
               <w:widowControl w:val="0"/>
               <w:jc w:val="left"/>
               <w:rPr>
-                <w:rFonts w:ascii="SimSun" w:hAnsi="SimSun" w:cs="SimSun"/>
-                <w:sz w:val="22"/>
-              </w:rPr>
-            </w:pPr>
-            <w:r>
-              <w:rPr>
-                <w:rFonts w:ascii="SimSun" w:hAnsi="SimSun" w:cs="SimSun"/>
-                <w:kern w:val="0"/>
-                <w:sz w:val="22"/>
-              </w:rPr>
-              <w:t>“瑞德宝尔”、“王家岭”、“合金可视化平台”、“西安咸阳国际机场”、“中美陕西应急指挥系统</w:t>
-            </w:r>
+                <w:rFonts w:hint="default" w:ascii="SimSun" w:hAnsi="SimSun" w:cs="SimSun"/>
+                <w:kern w:val="0"/>
+                <w:sz w:val="22"/>
+                <w:lang w:val="en-US"/>
+              </w:rPr>
+            </w:pPr>
+            <w:r>
+              <w:rPr>
+                <w:rFonts w:ascii="SimSun" w:hAnsi="SimSun" w:cs="SimSun"/>
+                <w:kern w:val="0"/>
+                <w:sz w:val="22"/>
+              </w:rPr>
+              <w:t>“瑞德宝尔”、“王家岭”、“合金可视化平台”、“西安咸阳国际机场”、“</w:t>
+            </w:r>
+            <w:r>
+              <w:rPr>
+                <w:rFonts w:ascii="SimSun" w:hAnsi="SimSun" w:cs="SimSun"/>
+                <w:kern w:val="0"/>
+                <w:sz w:val="22"/>
+                <w:lang w:val="en-US" w:eastAsia="zh-CN"/>
+              </w:rPr>
+              <w:t>中煤陕西应急指挥系统</w:t>
+            </w:r>
+            <w:r>
+              <w:rPr>
+                <w:rFonts w:hint="default" w:ascii="SimSun" w:hAnsi="SimSun" w:cs="SimSun"/>
+                <w:kern w:val="0"/>
+                <w:sz w:val="22"/>
+                <w:lang w:val="en-US" w:eastAsia="zh-CN"/>
+              </w:rPr>
+              <w:t>”</w:t>
+            </w:r>
+          </w:p>
+          <w:p>
+            <w:pPr>
+              <w:widowControl w:val="0"/>
+              <w:jc w:val="left"/>
+              <w:rPr>
+                <w:rFonts w:ascii="SimSun" w:hAnsi="SimSun" w:cs="SimSun"/>
+                <w:sz w:val="22"/>
+              </w:rPr>
+            </w:pPr>
           </w:p>
         </w:tc>
         <w:tc>
@@ -10672,7 +11614,7 @@
               <w:rPr>
                 <w:kern w:val="0"/>
               </w:rPr>
-              <w:t>（ES5/ES2015、jQuery、react)、</w:t>
+              <w:t>（ES5/ES2015、jQuery)、</w:t>
             </w:r>
             <w:r>
               <w:rPr>
@@ -11212,7 +12154,41 @@
                 <w:kern w:val="0"/>
                 <w:sz w:val="22"/>
               </w:rPr>
-              <w:t>2016/9—2019/5</w:t>
+              <w:t>2016/</w:t>
+            </w:r>
+            <w:r>
+              <w:rPr>
+                <w:rFonts w:hint="eastAsia" w:ascii="SimSun" w:hAnsi="SimSun" w:cs="SimSun"/>
+                <w:kern w:val="0"/>
+                <w:sz w:val="22"/>
+                <w:lang w:val="en-US" w:eastAsia="zh-CN"/>
+              </w:rPr>
+              <w:t>0</w:t>
+            </w:r>
+            <w:r>
+              <w:rPr>
+                <w:rFonts w:ascii="SimSun" w:hAnsi="SimSun" w:cs="SimSun"/>
+                <w:kern w:val="0"/>
+                <w:sz w:val="22"/>
+              </w:rPr>
+              <w:t>9—2019/</w:t>
+            </w:r>
+            <w:r>
+              <w:rPr>
+                <w:rFonts w:hint="eastAsia" w:ascii="SimSun" w:hAnsi="SimSun" w:cs="SimSun"/>
+                <w:kern w:val="0"/>
+                <w:sz w:val="22"/>
+                <w:lang w:val="en-US" w:eastAsia="zh-CN"/>
+              </w:rPr>
+              <w:t>0</w:t>
+            </w:r>
+            <w:r>
+              <w:rPr>
+                <w:rFonts w:ascii="SimSun" w:hAnsi="SimSun" w:cs="SimSun"/>
+                <w:kern w:val="0"/>
+                <w:sz w:val="22"/>
+              </w:rPr>
+              <w:t>5</w:t>
             </w:r>
           </w:p>
         </w:tc>
@@ -11240,27 +12216,7 @@
               <w:rPr>
                 <w:kern w:val="0"/>
               </w:rPr>
-              <w:t>“秦天下”、</w:t>
-            </w:r>
-            <w:r>
-              <w:rPr>
-                <w:kern w:val="0"/>
-                <w:lang w:val="en-US"/>
-              </w:rPr>
-              <w:t>”</w:t>
-            </w:r>
-            <w:r>
-              <w:rPr>
-                <w:kern w:val="0"/>
-              </w:rPr>
-              <w:t>东美</w:t>
-            </w:r>
-            <w:r>
-              <w:rPr>
-                <w:kern w:val="0"/>
-                <w:lang w:val="en-US"/>
-              </w:rPr>
-              <w:t>”</w:t>
+              <w:t>“秦天下”</w:t>
             </w:r>
           </w:p>
         </w:tc>
@@ -11745,8 +12701,6 @@
               </w:rPr>
               <w:t>用 JavaScript (ES5、ES2015)、HTML5、CSS 3做 web  前端的界面</w:t>
             </w:r>
-            <w:bookmarkStart w:id="1" w:name="_GoBack"/>
-            <w:bookmarkEnd w:id="1"/>
           </w:p>
         </w:tc>
       </w:tr>
@@ -12065,7 +13019,24 @@
                 <w:kern w:val="0"/>
                 <w:sz w:val="22"/>
               </w:rPr>
-              <w:t>2015/7—2016</w:t>
+              <w:t>2015/</w:t>
+            </w:r>
+            <w:r>
+              <w:rPr>
+                <w:rFonts w:hint="eastAsia" w:ascii="SimSun" w:hAnsi="SimSun" w:cs="SimSun"/>
+                <w:kern w:val="0"/>
+                <w:sz w:val="22"/>
+                <w:lang w:val="en-US" w:eastAsia="zh-CN"/>
+              </w:rPr>
+              <w:t>0</w:t>
+            </w:r>
+            <w:r>
+              <w:rPr>
+                <w:rFonts w:ascii="SimSun" w:hAnsi="SimSun" w:cs="SimSun"/>
+                <w:kern w:val="0"/>
+                <w:sz w:val="22"/>
+              </w:rPr>
+              <w:t>7—2016</w:t>
             </w:r>
             <w:r>
               <w:rPr>
@@ -12074,6 +13045,15 @@
                 <w:sz w:val="22"/>
               </w:rPr>
               <w:t>/</w:t>
+            </w:r>
+            <w:r>
+              <w:rPr>
+                <w:rFonts w:hint="eastAsia" w:cs="SimSun"/>
+                <w:kern w:val="0"/>
+                <w:sz w:val="22"/>
+                <w:lang w:val="en-US" w:eastAsia="zh-CN"/>
+              </w:rPr>
+              <w:t>0</w:t>
             </w:r>
             <w:r>
               <w:rPr>
@@ -12958,7 +13938,24 @@
                 <w:kern w:val="0"/>
                 <w:sz w:val="22"/>
               </w:rPr>
-              <w:t>2013/11—2014/5</w:t>
+              <w:t>2013/11—2014/</w:t>
+            </w:r>
+            <w:r>
+              <w:rPr>
+                <w:rFonts w:hint="eastAsia" w:ascii="SimSun" w:hAnsi="SimSun" w:cs="SimSun"/>
+                <w:kern w:val="0"/>
+                <w:sz w:val="22"/>
+                <w:lang w:val="en-US" w:eastAsia="zh-CN"/>
+              </w:rPr>
+              <w:t>0</w:t>
+            </w:r>
+            <w:r>
+              <w:rPr>
+                <w:rFonts w:ascii="SimSun" w:hAnsi="SimSun" w:cs="SimSun"/>
+                <w:kern w:val="0"/>
+                <w:sz w:val="22"/>
+              </w:rPr>
+              <w:t>5</w:t>
             </w:r>
           </w:p>
         </w:tc>
@@ -13782,7 +14779,24 @@
                 <w:kern w:val="0"/>
                 <w:sz w:val="22"/>
               </w:rPr>
-              <w:t>2012/6—2012/11</w:t>
+              <w:t>2012/</w:t>
+            </w:r>
+            <w:r>
+              <w:rPr>
+                <w:rFonts w:hint="eastAsia" w:ascii="SimSun" w:hAnsi="SimSun" w:cs="SimSun"/>
+                <w:kern w:val="0"/>
+                <w:sz w:val="22"/>
+                <w:lang w:val="en-US" w:eastAsia="zh-CN"/>
+              </w:rPr>
+              <w:t>0</w:t>
+            </w:r>
+            <w:r>
+              <w:rPr>
+                <w:rFonts w:ascii="SimSun" w:hAnsi="SimSun" w:cs="SimSun"/>
+                <w:kern w:val="0"/>
+                <w:sz w:val="22"/>
+              </w:rPr>
+              <w:t>6—2012/11</w:t>
             </w:r>
           </w:p>
         </w:tc>
@@ -14571,7 +15585,41 @@
                 <w:kern w:val="0"/>
                 <w:sz w:val="22"/>
               </w:rPr>
-              <w:t>2011/6—2012/3</w:t>
+              <w:t>2011/</w:t>
+            </w:r>
+            <w:r>
+              <w:rPr>
+                <w:rFonts w:hint="eastAsia" w:ascii="SimSun" w:hAnsi="SimSun" w:cs="SimSun"/>
+                <w:kern w:val="0"/>
+                <w:sz w:val="22"/>
+                <w:lang w:val="en-US" w:eastAsia="zh-CN"/>
+              </w:rPr>
+              <w:t>0</w:t>
+            </w:r>
+            <w:r>
+              <w:rPr>
+                <w:rFonts w:ascii="SimSun" w:hAnsi="SimSun" w:cs="SimSun"/>
+                <w:kern w:val="0"/>
+                <w:sz w:val="22"/>
+              </w:rPr>
+              <w:t>6—2012/</w:t>
+            </w:r>
+            <w:r>
+              <w:rPr>
+                <w:rFonts w:hint="eastAsia" w:ascii="SimSun" w:hAnsi="SimSun" w:cs="SimSun"/>
+                <w:kern w:val="0"/>
+                <w:sz w:val="22"/>
+                <w:lang w:val="en-US" w:eastAsia="zh-CN"/>
+              </w:rPr>
+              <w:t>0</w:t>
+            </w:r>
+            <w:r>
+              <w:rPr>
+                <w:rFonts w:ascii="SimSun" w:hAnsi="SimSun" w:cs="SimSun"/>
+                <w:kern w:val="0"/>
+                <w:sz w:val="22"/>
+              </w:rPr>
+              <w:t>3</w:t>
             </w:r>
           </w:p>
         </w:tc>
@@ -15371,7 +16419,41 @@
                 <w:kern w:val="0"/>
                 <w:sz w:val="22"/>
               </w:rPr>
-              <w:t>2010/4—2011/5</w:t>
+              <w:t>2010/</w:t>
+            </w:r>
+            <w:r>
+              <w:rPr>
+                <w:rFonts w:hint="eastAsia" w:ascii="SimSun" w:hAnsi="SimSun" w:cs="SimSun"/>
+                <w:kern w:val="0"/>
+                <w:sz w:val="22"/>
+                <w:lang w:val="en-US" w:eastAsia="zh-CN"/>
+              </w:rPr>
+              <w:t>0</w:t>
+            </w:r>
+            <w:r>
+              <w:rPr>
+                <w:rFonts w:ascii="SimSun" w:hAnsi="SimSun" w:cs="SimSun"/>
+                <w:kern w:val="0"/>
+                <w:sz w:val="22"/>
+              </w:rPr>
+              <w:t>4—2011/</w:t>
+            </w:r>
+            <w:r>
+              <w:rPr>
+                <w:rFonts w:hint="eastAsia" w:ascii="SimSun" w:hAnsi="SimSun" w:cs="SimSun"/>
+                <w:kern w:val="0"/>
+                <w:sz w:val="22"/>
+                <w:lang w:val="en-US" w:eastAsia="zh-CN"/>
+              </w:rPr>
+              <w:t>0</w:t>
+            </w:r>
+            <w:r>
+              <w:rPr>
+                <w:rFonts w:ascii="SimSun" w:hAnsi="SimSun" w:cs="SimSun"/>
+                <w:kern w:val="0"/>
+                <w:sz w:val="22"/>
+              </w:rPr>
+              <w:t>5</w:t>
             </w:r>
           </w:p>
         </w:tc>
@@ -17009,7 +18091,41 @@
                 <w:kern w:val="0"/>
                 <w:sz w:val="22"/>
               </w:rPr>
-              <w:t>2004/2—2007/5</w:t>
+              <w:t>2004/</w:t>
+            </w:r>
+            <w:r>
+              <w:rPr>
+                <w:rFonts w:hint="eastAsia" w:ascii="SimSun" w:hAnsi="SimSun" w:cs="SimSun"/>
+                <w:kern w:val="0"/>
+                <w:sz w:val="22"/>
+                <w:lang w:val="en-US" w:eastAsia="zh-CN"/>
+              </w:rPr>
+              <w:t>0</w:t>
+            </w:r>
+            <w:r>
+              <w:rPr>
+                <w:rFonts w:ascii="SimSun" w:hAnsi="SimSun" w:cs="SimSun"/>
+                <w:kern w:val="0"/>
+                <w:sz w:val="22"/>
+              </w:rPr>
+              <w:t>2—2007/</w:t>
+            </w:r>
+            <w:r>
+              <w:rPr>
+                <w:rFonts w:hint="eastAsia" w:ascii="SimSun" w:hAnsi="SimSun" w:cs="SimSun"/>
+                <w:kern w:val="0"/>
+                <w:sz w:val="22"/>
+                <w:lang w:val="en-US" w:eastAsia="zh-CN"/>
+              </w:rPr>
+              <w:t>0</w:t>
+            </w:r>
+            <w:r>
+              <w:rPr>
+                <w:rFonts w:ascii="SimSun" w:hAnsi="SimSun" w:cs="SimSun"/>
+                <w:kern w:val="0"/>
+                <w:sz w:val="22"/>
+              </w:rPr>
+              <w:t>5</w:t>
             </w:r>
           </w:p>
         </w:tc>
@@ -17834,7 +18950,24 @@
                 <w:kern w:val="0"/>
                 <w:sz w:val="22"/>
               </w:rPr>
-              <w:t>2002/12—2003/11</w:t>
+              <w:t>2002/</w:t>
+            </w:r>
+            <w:r>
+              <w:rPr>
+                <w:rFonts w:hint="default" w:ascii="SimSun" w:hAnsi="SimSun" w:cs="SimSun"/>
+                <w:kern w:val="0"/>
+                <w:sz w:val="22"/>
+                <w:lang w:val="en-US"/>
+              </w:rPr>
+              <w:t>08</w:t>
+            </w:r>
+            <w:r>
+              <w:rPr>
+                <w:rFonts w:ascii="SimSun" w:hAnsi="SimSun" w:cs="SimSun"/>
+                <w:kern w:val="0"/>
+                <w:sz w:val="22"/>
+              </w:rPr>
+              <w:t>—2003/11</w:t>
             </w:r>
           </w:p>
         </w:tc>
@@ -20322,7 +21455,7 @@
               <w:widowControl w:val="0"/>
               <w:jc w:val="center"/>
               <w:rPr>
-                <w:rFonts w:ascii="Calibri" w:hAnsi="Calibri" w:eastAsia="SimSun" w:cs="DejaVu Serif"/>
+                <w:rFonts w:hint="default" w:ascii="Calibri" w:hAnsi="Calibri" w:eastAsia="SimSun" w:cs="DejaVu Serif"/>
                 <w:color w:val="00000A"/>
                 <w:sz w:val="21"/>
                 <w:szCs w:val="22"/>
@@ -20332,8 +21465,9 @@
             <w:r>
               <w:rPr>
                 <w:kern w:val="0"/>
-              </w:rPr>
-              <w:t>Cesium js</w:t>
+                <w:lang w:val="en-US"/>
+              </w:rPr>
+              <w:t>CesiumJS</w:t>
             </w:r>
           </w:p>
         </w:tc>

</xml_diff>

<commit_message>
feat(cv): update employment dates for accuracy in personal.json
</commit_message>
<xml_diff>
--- a/public/cv/Aliaksandr Kuzmiankou - 研发负责人+ 软件工程师+web前端.docx
+++ b/public/cv/Aliaksandr Kuzmiankou - 研发负责人+ 软件工程师+web前端.docx
@@ -3979,11 +3979,20 @@
             </w:r>
             <w:r>
               <w:rPr>
+                <w:rFonts w:hint="eastAsia" w:ascii="SimSun" w:hAnsi="SimSun"/>
+                <w:kern w:val="0"/>
+                <w:sz w:val="22"/>
+                <w:lang w:val="en-US" w:eastAsia="zh-CN"/>
+              </w:rPr>
+              <w:t>1</w:t>
+            </w:r>
+            <w:r>
+              <w:rPr>
                 <w:rFonts w:ascii="SimSun" w:hAnsi="SimSun"/>
                 <w:kern w:val="0"/>
                 <w:sz w:val="22"/>
               </w:rPr>
-              <w:t>5—2020/</w:t>
+              <w:t>—2020/</w:t>
             </w:r>
             <w:r>
               <w:rPr>
@@ -4148,17 +4157,35 @@
               <w:widowControl w:val="0"/>
               <w:jc w:val="center"/>
               <w:rPr>
+                <w:rFonts w:hint="eastAsia" w:ascii="SimSun" w:hAnsi="SimSun" w:eastAsia="SimSun"/>
+                <w:sz w:val="22"/>
+                <w:lang w:val="en-US" w:eastAsia="zh-CN"/>
+              </w:rPr>
+            </w:pPr>
+            <w:r>
+              <w:rPr>
                 <w:rFonts w:ascii="SimSun" w:hAnsi="SimSun"/>
-                <w:sz w:val="22"/>
-              </w:rPr>
-            </w:pPr>
+                <w:kern w:val="0"/>
+                <w:sz w:val="22"/>
+              </w:rPr>
+              <w:t>2016/</w:t>
+            </w:r>
+            <w:r>
+              <w:rPr>
+                <w:rFonts w:hint="default" w:ascii="SimSun" w:hAnsi="SimSun"/>
+                <w:kern w:val="0"/>
+                <w:sz w:val="22"/>
+                <w:lang w:val="en-US"/>
+              </w:rPr>
+              <w:t>0</w:t>
+            </w:r>
             <w:r>
               <w:rPr>
                 <w:rFonts w:ascii="SimSun" w:hAnsi="SimSun"/>
                 <w:kern w:val="0"/>
                 <w:sz w:val="22"/>
               </w:rPr>
-              <w:t>2016/</w:t>
+              <w:t>9—2019/</w:t>
             </w:r>
             <w:r>
               <w:rPr>
@@ -4171,28 +4198,12 @@
             </w:r>
             <w:r>
               <w:rPr>
-                <w:rFonts w:ascii="SimSun" w:hAnsi="SimSun"/>
-                <w:kern w:val="0"/>
-                <w:sz w:val="22"/>
-              </w:rPr>
-              <w:t>9—2019/</w:t>
-            </w:r>
-            <w:r>
-              <w:rPr>
-                <w:rFonts w:hint="default" w:ascii="SimSun" w:hAnsi="SimSun"/>
-                <w:kern w:val="0"/>
-                <w:sz w:val="22"/>
-                <w:lang w:val="en-US"/>
-              </w:rPr>
-              <w:t>0</w:t>
-            </w:r>
-            <w:r>
-              <w:rPr>
-                <w:rFonts w:ascii="SimSun" w:hAnsi="SimSun"/>
-                <w:kern w:val="0"/>
-                <w:sz w:val="22"/>
-              </w:rPr>
-              <w:t>5</w:t>
+                <w:rFonts w:hint="eastAsia" w:ascii="SimSun" w:hAnsi="SimSun"/>
+                <w:kern w:val="0"/>
+                <w:sz w:val="22"/>
+                <w:lang w:val="en-US" w:eastAsia="zh-CN"/>
+              </w:rPr>
+              <w:t>1</w:t>
             </w:r>
           </w:p>
         </w:tc>
@@ -8035,8 +8046,6 @@
               </w:rPr>
               <w:t>独立开发者/创作者</w:t>
             </w:r>
-            <w:bookmarkStart w:id="1" w:name="_GoBack"/>
-            <w:bookmarkEnd w:id="1"/>
           </w:p>
         </w:tc>
       </w:tr>
@@ -10948,7 +10957,24 @@
                 <w:kern w:val="0"/>
                 <w:sz w:val="22"/>
               </w:rPr>
-              <w:t>3、高德 API、</w:t>
+              <w:t>3、高德</w:t>
+            </w:r>
+            <w:r>
+              <w:rPr>
+                <w:rFonts w:hint="eastAsia" w:ascii="SimSun" w:hAnsi="SimSun" w:cs="SimSun"/>
+                <w:kern w:val="0"/>
+                <w:sz w:val="22"/>
+                <w:lang w:eastAsia="zh-CN"/>
+              </w:rPr>
+              <w:t>地图</w:t>
+            </w:r>
+            <w:r>
+              <w:rPr>
+                <w:rFonts w:ascii="SimSun" w:hAnsi="SimSun" w:cs="SimSun"/>
+                <w:kern w:val="0"/>
+                <w:sz w:val="22"/>
+              </w:rPr>
+              <w:t xml:space="preserve"> API、</w:t>
             </w:r>
             <w:r>
               <w:rPr>
@@ -11485,15 +11511,15 @@
                 <w:sz w:val="22"/>
                 <w:lang w:val="en-US" w:eastAsia="zh-CN"/>
               </w:rPr>
-              <w:t>0</w:t>
-            </w:r>
-            <w:r>
-              <w:rPr>
-                <w:rFonts w:ascii="SimSun" w:hAnsi="SimSun" w:cs="SimSun"/>
-                <w:kern w:val="0"/>
-                <w:sz w:val="22"/>
-              </w:rPr>
-              <w:t>5—2020/</w:t>
+              <w:t>01</w:t>
+            </w:r>
+            <w:r>
+              <w:rPr>
+                <w:rFonts w:ascii="SimSun" w:hAnsi="SimSun" w:cs="SimSun"/>
+                <w:kern w:val="0"/>
+                <w:sz w:val="22"/>
+              </w:rPr>
+              <w:t>—2020/</w:t>
             </w:r>
             <w:r>
               <w:rPr>
@@ -12145,7 +12171,9 @@
             <w:pPr>
               <w:widowControl w:val="0"/>
               <w:rPr>
-                <w:kern w:val="0"/>
+                <w:rFonts w:hint="default"/>
+                <w:kern w:val="0"/>
+                <w:lang w:val="en-US"/>
               </w:rPr>
             </w:pPr>
             <w:r>
@@ -12180,16 +12208,10 @@
                 <w:sz w:val="22"/>
                 <w:lang w:val="en-US" w:eastAsia="zh-CN"/>
               </w:rPr>
-              <w:t>0</w:t>
-            </w:r>
-            <w:r>
-              <w:rPr>
-                <w:rFonts w:ascii="SimSun" w:hAnsi="SimSun" w:cs="SimSun"/>
-                <w:kern w:val="0"/>
-                <w:sz w:val="22"/>
-              </w:rPr>
-              <w:t>5</w:t>
-            </w:r>
+              <w:t>01</w:t>
+            </w:r>
+            <w:bookmarkStart w:id="1" w:name="_GoBack"/>
+            <w:bookmarkEnd w:id="1"/>
           </w:p>
         </w:tc>
         <w:tc>

</xml_diff>

<commit_message>
feat(cv): update CV document for improved content and formatting
</commit_message>
<xml_diff>
--- a/public/cv/Aliaksandr Kuzmiankou - 研发负责人+ 软件工程师+web前端.docx
+++ b/public/cv/Aliaksandr Kuzmiankou - 研发负责人+ 软件工程师+web前端.docx
@@ -9730,6 +9730,7 @@
                     </w:rPr>
                     <w:t xml:space="preserve"> 研发插件，负责 </w:t>
                   </w:r>
+                  <w:bookmarkStart w:id="1" w:name="_GoBack"/>
                   <w:r>
                     <w:rPr>
                       <w:rFonts w:hint="default"/>
@@ -9738,6 +9739,7 @@
                     </w:rPr>
                     <w:t>NocoBase</w:t>
                   </w:r>
+                  <w:bookmarkEnd w:id="1"/>
                   <w:r>
                     <w:rPr>
                       <w:rFonts w:hint="default"/>
@@ -12210,8 +12212,6 @@
               </w:rPr>
               <w:t>01</w:t>
             </w:r>
-            <w:bookmarkStart w:id="1" w:name="_GoBack"/>
-            <w:bookmarkEnd w:id="1"/>
           </w:p>
         </w:tc>
         <w:tc>

</xml_diff>